<commit_message>
Trim reference list to the two chosen articles and course materials
Remove supporting-literature citations, cite classic sources as secondary
citations through the main article, and add a visible heading rule.

Co-Authored-By: Claude Fable 5.1 <noreply@anthropic.com>
Claude-Session: https://claude.ai/code/session_01XaGvnsaHG3kPyCY3aGBByx
</commit_message>
<xml_diff>
--- a/career-management-final-project/ניהול קריירה - התמודדות עם חוסר ודאות תעסוקתי - עבודה מסכמת.docx
+++ b/career-management-final-project/ניהול קריירה - התמודדות עם חוסר ודאות תעסוקתי - עבודה מסכמת.docx
@@ -570,8 +570,11 @@
     <w:p>
       <w:pPr>
         <w:pStyle w:val="Heading1"/>
-        <w:bidi/>
-        <w:spacing w:after="240" w:before="240" w:line="480"/>
+        <w:pBdr>
+          <w:bottom w:val="single" w:color="0E6E73" w:sz="12" w:space="4"/>
+        </w:pBdr>
+        <w:bidi/>
+        <w:spacing w:after="280" w:before="240" w:line="480"/>
         <w:jc w:val="right"/>
       </w:pPr>
       <w:r>
@@ -580,8 +583,8 @@
           <w:b/>
           <w:bCs/>
           <w:color w:val="1F3864"/>
-          <w:sz w:val="32"/>
-          <w:szCs w:val="32"/>
+          <w:sz w:val="34"/>
+          <w:szCs w:val="34"/>
           <w:rtl/>
         </w:rPr>
         <w:t xml:space="preserve">תוכן העניינים</w:t>
@@ -715,7 +718,7 @@
           <w:szCs w:val="24"/>
           <w:rtl/>
         </w:rPr>
-        <w:t xml:space="preserve">פרק 4: המאמר המשלים וראיות תומכות</w:t>
+        <w:t xml:space="preserve">פרק 4: המאמר המשלים</w:t>
       </w:r>
       <w:r>
         <w:rPr>
@@ -752,7 +755,7 @@
           <w:szCs w:val="24"/>
           <w:rtl/>
         </w:rPr>
-        <w:t xml:space="preserve">	15</w:t>
+        <w:t xml:space="preserve">	14</w:t>
       </w:r>
     </w:p>
     <w:p>
@@ -808,7 +811,7 @@
           <w:szCs w:val="24"/>
           <w:rtl/>
         </w:rPr>
-        <w:t xml:space="preserve">	19</w:t>
+        <w:t xml:space="preserve">	18</w:t>
       </w:r>
     </w:p>
     <w:p>
@@ -836,7 +839,7 @@
           <w:szCs w:val="24"/>
           <w:rtl/>
         </w:rPr>
-        <w:t xml:space="preserve">	20</w:t>
+        <w:t xml:space="preserve">	19</w:t>
       </w:r>
     </w:p>
     <w:p>
@@ -864,7 +867,7 @@
           <w:szCs w:val="24"/>
           <w:rtl/>
         </w:rPr>
-        <w:t xml:space="preserve">	21</w:t>
+        <w:t xml:space="preserve">	20</w:t>
       </w:r>
     </w:p>
     <w:p>
@@ -892,7 +895,7 @@
           <w:szCs w:val="24"/>
           <w:rtl/>
         </w:rPr>
-        <w:t xml:space="preserve">	22</w:t>
+        <w:t xml:space="preserve">	21</w:t>
       </w:r>
     </w:p>
     <w:p>
@@ -920,8 +923,11 @@
     <w:p>
       <w:pPr>
         <w:pStyle w:val="Heading1"/>
-        <w:bidi/>
-        <w:spacing w:after="240" w:before="240" w:line="480"/>
+        <w:pBdr>
+          <w:bottom w:val="single" w:color="0E6E73" w:sz="12" w:space="4"/>
+        </w:pBdr>
+        <w:bidi/>
+        <w:spacing w:after="280" w:before="240" w:line="480"/>
         <w:jc w:val="right"/>
       </w:pPr>
       <w:r>
@@ -930,8 +936,8 @@
           <w:b/>
           <w:bCs/>
           <w:color w:val="1F3864"/>
-          <w:sz w:val="32"/>
-          <w:szCs w:val="32"/>
+          <w:sz w:val="34"/>
+          <w:szCs w:val="34"/>
           <w:rtl/>
         </w:rPr>
         <w:t xml:space="preserve">מבוא</w:t>
@@ -950,7 +956,7 @@
           <w:szCs w:val="24"/>
           <w:rtl/>
         </w:rPr>
-        <w:t xml:space="preserve">עולם העבודה של שנת 2026 מתאפיין באי-ודאות. גלי הפיטורים וההתייעלות בענף ההייטק, כניסת הבינה המלאכותית היוצרת לתפקידי צווארון לבן, המלחמה ושירות המילואים הממושך, והמעבר לצורות העסקה גמישות, יצרו מציאות שבה גם עובדים בעלי ותק ומיומנויות גבוהות אינם יודעים כיצד ייראה תפקידם בעוד שנה. תיבה בדוח בנק ישראל לשנת 2024 העריכה כי כחמישית מהמועסקים בישראל עובדים במקצועות שבהם הביקוש לעובדים צפוי לרדת באופן משמעותי עם התרחבות השימוש בבינה מלאכותית (בנק ישראל, 2025). בעיתונות הכלכלית דווח כי ההתייעלות באמצעות בינה מלאכותית עומדת בראש סדר היום של מנהלי ההייטק ("הקשיים של מנהלי הייטק", 2026). חוסר ביטחון תעסוקתי, שהוגדר כאיום נתפס על ההמשכיות ועל היציבות של התעסוקה הנוכחית, הפך מאירוע חריג לתנאי קבוע (</w:t>
+        <w:t xml:space="preserve">עולם העבודה של שנת 2026 מתאפיין באי-ודאות. גלי הפיטורים וההתייעלות בענף ההייטק, כניסת הבינה המלאכותית היוצרת לתפקידי צווארון לבן, המלחמה ושירות המילואים הממושך, והמעבר לצורות העסקה גמישות, יצרו מציאות שבה גם עובדים בעלי ותק ומיומנויות גבוהות אינם יודעים כיצד ייראה תפקידם בעוד שנה. תיבה בדוח בנק ישראל לשנת 2024 העריכה כי כחמישית מהמועסקים בישראל עובדים במקצועות שבהם הביקוש לעובדים צפוי לרדת באופן משמעותי עם התרחבות השימוש בבינה מלאכותית (בנק ישראל, 2025). בעיתונות הכלכלית דווח כי ההתייעלות באמצעות בינה מלאכותית עומדת בראש סדר היום של מנהלי ההייטק ("הקשיים של מנהלי הייטק", 2026). חוסר ביטחון תעסוקתי, כלומר החשש של העובד לאבד את משרתו או את המאפיינים החשובים לו בה, הפך מאירוע חריג לתנאי קבוע (</w:t>
       </w:r>
       <w:r>
         <w:rPr>
@@ -958,7 +964,7 @@
           <w:sz w:val="24"/>
           <w:szCs w:val="24"/>
         </w:rPr>
-        <w:t xml:space="preserve">‎Shoss, 2017‎</w:t>
+        <w:t xml:space="preserve">‎Chung et al., 2025‎</w:t>
       </w:r>
       <w:r>
         <w:rPr>
@@ -1000,7 +1006,7 @@
           <w:szCs w:val="24"/>
           <w:rtl/>
         </w:rPr>
-        <w:t xml:space="preserve">). ניהול קריירה מתואר בספרות כתהליך מתמשך שבו הפרט אוסף מידע על עצמו ועל סביבתו, מציב יעדים ומפתח אסטרטגיות להשגתם (</w:t>
+        <w:t xml:space="preserve">, כפי שמצוטט אצל </w:t>
       </w:r>
       <w:r>
         <w:rPr>
@@ -1008,16 +1014,16 @@
           <w:sz w:val="24"/>
           <w:szCs w:val="24"/>
         </w:rPr>
-        <w:t xml:space="preserve">‎Greenhaus et al., 2018‎</w:t>
-      </w:r>
-      <w:r>
-        <w:rPr>
-          <w:rFonts w:ascii="David" w:cs="David" w:eastAsia="David" w:hAnsi="David"/>
-          <w:sz w:val="24"/>
-          <w:szCs w:val="24"/>
-          <w:rtl/>
-        </w:rPr>
-        <w:t xml:space="preserve">). בעולם של אי-ודאות, השאלה היא אילו אסטרטגיות זמינות לעובד עצמו, ולא רק לארגון.</w:t>
+        <w:t xml:space="preserve">‎Cetkovská et al., 2026‎</w:t>
+      </w:r>
+      <w:r>
+        <w:rPr>
+          <w:rFonts w:ascii="David" w:cs="David" w:eastAsia="David" w:hAnsi="David"/>
+          <w:sz w:val="24"/>
+          <w:szCs w:val="24"/>
+          <w:rtl/>
+        </w:rPr>
+        <w:t xml:space="preserve">). ניהול קריירה, כפי שנלמד בקורס, הוא תהליך מתמשך של למידה, בניית זהות מקצועית וטיפוח רשת אנשים (דבדבני דקל, 2026א). תהליך כזה מניח מידה של יציבות. בעולם של אי-ודאות, השאלה היא אילו אסטרטגיות זמינות לעובד עצמו, ולא רק לארגון.</w:t>
       </w:r>
     </w:p>
     <w:p>
@@ -1100,7 +1106,7 @@
           <w:szCs w:val="24"/>
           <w:rtl/>
         </w:rPr>
-        <w:t xml:space="preserve">פרק 1 מציג את המאמר המרכזי. פרק 2 מסכם את תמציתו ואת נקודותיו המרכזיות. פרק 3 מנתח אותו לפי מבנה, שיטה וממצאים. פרק 4 מציג את המאמר המשלים ואת הראיות התומכות. פרק 5 מציג תובנות, מסקנות ודעה אישית, ופרק 6 מציע יישום מעשי לניהול הקריירה של הסטודנטים בכיתה. בנספחים מובאים תכנון המצגת והאמצעים להמחשה ושאלון קצר להערכה עצמית. העבודה מסתיימת ברשימת מקורות על פי כללי </w:t>
+        <w:t xml:space="preserve">פרק 1 מציג את המאמר המרכזי. פרק 2 מסכם את תמציתו ואת נקודותיו המרכזיות. פרק 3 מנתח אותו לפי מבנה, שיטה וממצאים. פרק 4 מציג את המאמר המשלים ואת הקשר בין שני המאמרים. פרק 5 מציג תובנות, מסקנות ודעה אישית, ופרק 6 מציע יישום מעשי לניהול הקריירה של הסטודנטים בכיתה. בנספחים מובאים תכנון המצגת והאמצעים להמחשה ושאלון קצר להערכה עצמית. העבודה מסתיימת ברשימת מקורות על פי כללי </w:t>
       </w:r>
       <w:r>
         <w:rPr>
@@ -1128,8 +1134,11 @@
     <w:p>
       <w:pPr>
         <w:pStyle w:val="Heading1"/>
-        <w:bidi/>
-        <w:spacing w:after="240" w:before="240" w:line="480"/>
+        <w:pBdr>
+          <w:bottom w:val="single" w:color="0E6E73" w:sz="12" w:space="4"/>
+        </w:pBdr>
+        <w:bidi/>
+        <w:spacing w:after="280" w:before="240" w:line="480"/>
         <w:jc w:val="right"/>
       </w:pPr>
       <w:r>
@@ -1138,8 +1147,8 @@
           <w:b/>
           <w:bCs/>
           <w:color w:val="1F3864"/>
-          <w:sz w:val="32"/>
-          <w:szCs w:val="32"/>
+          <w:sz w:val="34"/>
+          <w:szCs w:val="34"/>
           <w:rtl/>
         </w:rPr>
         <w:t xml:space="preserve">פרק 1: הצגת המאמר המרכזי</w:t>
@@ -1933,8 +1942,11 @@
     <w:p>
       <w:pPr>
         <w:pStyle w:val="Heading1"/>
-        <w:bidi/>
-        <w:spacing w:after="240" w:before="240" w:line="480"/>
+        <w:pBdr>
+          <w:bottom w:val="single" w:color="0E6E73" w:sz="12" w:space="4"/>
+        </w:pBdr>
+        <w:bidi/>
+        <w:spacing w:after="280" w:before="240" w:line="480"/>
         <w:jc w:val="right"/>
       </w:pPr>
       <w:r>
@@ -1943,8 +1955,8 @@
           <w:b/>
           <w:bCs/>
           <w:color w:val="1F3864"/>
-          <w:sz w:val="32"/>
-          <w:szCs w:val="32"/>
+          <w:sz w:val="34"/>
+          <w:szCs w:val="34"/>
           <w:rtl/>
         </w:rPr>
         <w:t xml:space="preserve">פרק 2: תמצית המאמר והנקודות המרכזיות</w:t>
@@ -2000,6 +2012,23 @@
           <w:szCs w:val="24"/>
           <w:rtl/>
         </w:rPr>
+        <w:t xml:space="preserve">, כפי שמצוטט אצל </w:t>
+      </w:r>
+      <w:r>
+        <w:rPr>
+          <w:rFonts w:ascii="Times New Roman" w:cs="Times New Roman" w:eastAsia="Times New Roman" w:hAnsi="Times New Roman"/>
+          <w:sz w:val="24"/>
+          <w:szCs w:val="24"/>
+        </w:rPr>
+        <w:t xml:space="preserve">‎Cetkovská et al., 2026‎</w:t>
+      </w:r>
+      <w:r>
+        <w:rPr>
+          <w:rFonts w:ascii="David" w:cs="David" w:eastAsia="David" w:hAnsi="David"/>
+          <w:sz w:val="24"/>
+          <w:szCs w:val="24"/>
+          <w:rtl/>
+        </w:rPr>
         <w:t xml:space="preserve">). על בסיס זה פותח המושג תחושת קוהרנטיות בעבודה, המתייחס למצב העבודה הנוכחי בלבד ומורכב משלושה רכיבים. הרכיב הקוגניטיבי, מובנות, הוא המידה שבה מצב העבודה נתפס כמובנה, עקבי וברור. הרכיב ההתנהגותי, ניהוליות, הוא המידה שבה העובד תופס שיש לו משאבים מספיקים להתמודד עם הדרישות. הרכיב המוטיבציוני, משמעותיות, הוא המידה שבה מצב העבודה נתפס כראוי למחויבות ולמעורבות. בניגוד לתחושת הקוהרנטיות הכללית, המתייצבת בבגרות הצעירה, תחושת הקוהרנטיות בעבודה דינמית ומעוצבת ללא הרף על ידי תנאי העבודה (</w:t>
       </w:r>
       <w:r>
@@ -2103,6 +2132,23 @@
           <w:szCs w:val="24"/>
           <w:rtl/>
         </w:rPr>
+        <w:t xml:space="preserve">, כפי שמצוטט אצל </w:t>
+      </w:r>
+      <w:r>
+        <w:rPr>
+          <w:rFonts w:ascii="Times New Roman" w:cs="Times New Roman" w:eastAsia="Times New Roman" w:hAnsi="Times New Roman"/>
+          <w:sz w:val="24"/>
+          <w:szCs w:val="24"/>
+        </w:rPr>
+        <w:t xml:space="preserve">‎Cetkovská et al., 2026‎</w:t>
+      </w:r>
+      <w:r>
+        <w:rPr>
+          <w:rFonts w:ascii="David" w:cs="David" w:eastAsia="David" w:hAnsi="David"/>
+          <w:sz w:val="24"/>
+          <w:szCs w:val="24"/>
+          <w:rtl/>
+        </w:rPr>
         <w:t xml:space="preserve">). המאמר משתמש בגרסה ייחודית של המושג, עיצוב תפקיד מבוסס צרכים, המתמקדת במאמצים יזומים לספק שישה צרכים פסיכולוגיים בעבודה, המכונים צרכי </w:t>
       </w:r>
       <w:r>
@@ -2283,7 +2329,24 @@
           <w:sz w:val="24"/>
           <w:szCs w:val="24"/>
         </w:rPr>
-        <w:t xml:space="preserve">‎Hobfoll, 1989‎</w:t>
+        <w:t xml:space="preserve">‎Hobfoll, 2001‎</w:t>
+      </w:r>
+      <w:r>
+        <w:rPr>
+          <w:rFonts w:ascii="David" w:cs="David" w:eastAsia="David" w:hAnsi="David"/>
+          <w:sz w:val="24"/>
+          <w:szCs w:val="24"/>
+          <w:rtl/>
+        </w:rPr>
+        <w:t xml:space="preserve">, כפי שמצוטט אצל </w:t>
+      </w:r>
+      <w:r>
+        <w:rPr>
+          <w:rFonts w:ascii="Times New Roman" w:cs="Times New Roman" w:eastAsia="Times New Roman" w:hAnsi="Times New Roman"/>
+          <w:sz w:val="24"/>
+          <w:szCs w:val="24"/>
+        </w:rPr>
+        <w:t xml:space="preserve">‎Cetkovská et al., 2026‎</w:t>
       </w:r>
       <w:r>
         <w:rPr>
@@ -3602,8 +3665,11 @@
     <w:p>
       <w:pPr>
         <w:pStyle w:val="Heading1"/>
-        <w:bidi/>
-        <w:spacing w:after="240" w:before="240" w:line="480"/>
+        <w:pBdr>
+          <w:bottom w:val="single" w:color="0E6E73" w:sz="12" w:space="4"/>
+        </w:pBdr>
+        <w:bidi/>
+        <w:spacing w:after="280" w:before="240" w:line="480"/>
         <w:jc w:val="right"/>
       </w:pPr>
       <w:r>
@@ -3612,8 +3678,8 @@
           <w:b/>
           <w:bCs/>
           <w:color w:val="1F3864"/>
-          <w:sz w:val="32"/>
-          <w:szCs w:val="32"/>
+          <w:sz w:val="34"/>
+          <w:szCs w:val="34"/>
           <w:rtl/>
         </w:rPr>
         <w:t xml:space="preserve">פרק 3: ניתוח המאמר לפי מבנה, שיטה וממצאים</w:t>
@@ -4523,8 +4589,11 @@
     <w:p>
       <w:pPr>
         <w:pStyle w:val="Heading1"/>
-        <w:bidi/>
-        <w:spacing w:after="240" w:before="240" w:line="480"/>
+        <w:pBdr>
+          <w:bottom w:val="single" w:color="0E6E73" w:sz="12" w:space="4"/>
+        </w:pBdr>
+        <w:bidi/>
+        <w:spacing w:after="280" w:before="240" w:line="480"/>
         <w:jc w:val="right"/>
       </w:pPr>
       <w:r>
@@ -4533,11 +4602,11 @@
           <w:b/>
           <w:bCs/>
           <w:color w:val="1F3864"/>
-          <w:sz w:val="32"/>
-          <w:szCs w:val="32"/>
-          <w:rtl/>
-        </w:rPr>
-        <w:t xml:space="preserve">פרק 4: המאמר המשלים וראיות תומכות</w:t>
+          <w:sz w:val="34"/>
+          <w:szCs w:val="34"/>
+          <w:rtl/>
+        </w:rPr>
+        <w:t xml:space="preserve">פרק 4: המאמר המשלים</w:t>
       </w:r>
     </w:p>
     <w:p>
@@ -4557,7 +4626,7 @@
           <w:szCs w:val="28"/>
           <w:rtl/>
         </w:rPr>
-        <w:t xml:space="preserve">4.1 המאמר המשלים</w:t>
+        <w:t xml:space="preserve">4.1 הצגת המאמר המשלים</w:t>
       </w:r>
     </w:p>
     <w:p>
@@ -4727,7 +4796,7 @@
           <w:szCs w:val="28"/>
           <w:rtl/>
         </w:rPr>
-        <w:t xml:space="preserve">4.2 ראיות תומכות מהספרות על חוסר ביטחון תעסוקתי</w:t>
+        <w:t xml:space="preserve">4.2 הקשר לנושא העבודה</w:t>
       </w:r>
     </w:p>
     <w:p>
@@ -4743,7 +4812,7 @@
           <w:szCs w:val="24"/>
           <w:rtl/>
         </w:rPr>
-        <w:t xml:space="preserve">הסקירה האינטגרטיבית של שוס (</w:t>
+        <w:t xml:space="preserve">חוסר ביטחון תעסוקתי, כפי שהוא מוגדר במאמר המשלים, הוא תחושה של איום על המשך ההעסקה או על מאפייני התפקיד, והוא מתגבר ככל שהעובד מודע לכך שטכנולוגיה עלולה לשנות את עבודתו (</w:t>
       </w:r>
       <w:r>
         <w:rPr>
@@ -4751,16 +4820,16 @@
           <w:sz w:val="24"/>
           <w:szCs w:val="24"/>
         </w:rPr>
-        <w:t xml:space="preserve">‎Shoss, 2017‎</w:t>
-      </w:r>
-      <w:r>
-        <w:rPr>
-          <w:rFonts w:ascii="David" w:cs="David" w:eastAsia="David" w:hAnsi="David"/>
-          <w:sz w:val="24"/>
-          <w:szCs w:val="24"/>
-          <w:rtl/>
-        </w:rPr>
-        <w:t xml:space="preserve">) הציעה שחוסר ביטחון תעסוקתי משפיע על העובד דרך ארבעה מנגנונים, לחץ, חליפין חברתי, מוטיבציה לשימור המשרה והתמודדות פרואקטיבית, ושעוצמת התגובה תלויה במאפייני האיום ובפגיעוּת הכלכלית והפסיכולוגית של העובד. עיצוב תפקיד מבוסס צרכים הוא דוגמה מובהקת להתמודדות פרואקטיבית, ותחושת קוהרנטיות בעבודה היא משאב שמקטין את הפגיעוּת הפסיכולוגית. ההבחנה בין חוסר ביטחון כמותי, חשש לאבד את המשרה, לבין חוסר ביטחון איכותני, חשש לאבד מאפיינים חשובים שלה (</w:t>
+        <w:t xml:space="preserve">‎Chung et al., 2025‎</w:t>
+      </w:r>
+      <w:r>
+        <w:rPr>
+          <w:rFonts w:ascii="David" w:cs="David" w:eastAsia="David" w:hAnsi="David"/>
+          <w:sz w:val="24"/>
+          <w:szCs w:val="24"/>
+          <w:rtl/>
+        </w:rPr>
+        <w:t xml:space="preserve">). במונחי המאמר המרכזי, זוהי פגיעה בשלושת רכיבי תחושת הקוהרנטיות: העתיד אינו צפוי, המשאבים נראים בלתי מספיקים, וקשה להתחייב למה שעלול להיעלם (</w:t>
       </w:r>
       <w:r>
         <w:rPr>
@@ -4768,49 +4837,16 @@
           <w:sz w:val="24"/>
           <w:szCs w:val="24"/>
         </w:rPr>
-        <w:t xml:space="preserve">‎Hellgren et al., 1999‎</w:t>
-      </w:r>
-      <w:r>
-        <w:rPr>
-          <w:rFonts w:ascii="David" w:cs="David" w:eastAsia="David" w:hAnsi="David"/>
-          <w:sz w:val="24"/>
-          <w:szCs w:val="24"/>
-          <w:rtl/>
-        </w:rPr>
-        <w:t xml:space="preserve">), מחדדת מדוע עיצוב התפקיד רלוונטי: כשהבינה המלאכותית משנה את תוכן התפקיד בלי לבטל אותו, העובד שמעצב את תפקידו סביב צרכיו הוא זה שקובע מה יישאר בו.</w:t>
-      </w:r>
-    </w:p>
-    <w:p>
-      <w:pPr>
-        <w:bidi/>
-        <w:spacing w:after="120" w:before="0" w:line="480"/>
-        <w:jc w:val="both"/>
-      </w:pPr>
-      <w:r>
-        <w:rPr>
-          <w:rFonts w:ascii="David" w:cs="David" w:eastAsia="David" w:hAnsi="David"/>
-          <w:sz w:val="24"/>
-          <w:szCs w:val="24"/>
-          <w:rtl/>
-        </w:rPr>
-        <w:t xml:space="preserve">מטא-אנליזה שפורסמה באותו כתב עת מוסיפה זווית מדאיגה: על בסיס 237 מחקרים נמצא שחוסר ביטחון תעסוקתי קשור לירידה בפיתוח מיומנויות פרואקטיבי, בשביעות הרצון מהקריירה וביכולת התעסוקה הנתפסת, ולעלייה בחיפוש עבודה ובהסתרת ידע (</w:t>
-      </w:r>
-      <w:r>
-        <w:rPr>
-          <w:rFonts w:ascii="Times New Roman" w:cs="Times New Roman" w:eastAsia="Times New Roman" w:hAnsi="Times New Roman"/>
-          <w:sz w:val="24"/>
-          <w:szCs w:val="24"/>
-        </w:rPr>
-        <w:t xml:space="preserve">‎Låstad et al., 2025‎</w:t>
-      </w:r>
-      <w:r>
-        <w:rPr>
-          <w:rFonts w:ascii="David" w:cs="David" w:eastAsia="David" w:hAnsi="David"/>
-          <w:sz w:val="24"/>
-          <w:szCs w:val="24"/>
-          <w:rtl/>
-        </w:rPr>
-        <w:t xml:space="preserve">). כלומר, חוסר הוודאות פוגע בדיוק ביוזמה שהמאמר המרכזי מזהה כמפתח. שני הממצאים יחד מדגישים את החשיבות של בניית תחושת הניהוליות מראש, משום שהיא המנוע של היוזמה, ומשום שבלעדיה האיום עלול לשתק אותה.</w:t>
+        <w:t xml:space="preserve">‎Cetkovská et al., 2026‎</w:t>
+      </w:r>
+      <w:r>
+        <w:rPr>
+          <w:rFonts w:ascii="David" w:cs="David" w:eastAsia="David" w:hAnsi="David"/>
+          <w:sz w:val="24"/>
+          <w:szCs w:val="24"/>
+          <w:rtl/>
+        </w:rPr>
+        <w:t xml:space="preserve">). עיצוב תפקיד מבוסס צרכים הוא לכן דרך להתמודד עם חוסר הוודאות מבפנים. כשהבינה המלאכותית משנה את תוכן התפקיד בלי לבטל אותו, העובד שמעצב את תפקידו סביב צרכיו הוא זה שקובע מה יישאר בו.</w:t>
       </w:r>
     </w:p>
     <w:p>
@@ -4821,8 +4857,11 @@
     <w:p>
       <w:pPr>
         <w:pStyle w:val="Heading1"/>
-        <w:bidi/>
-        <w:spacing w:after="240" w:before="240" w:line="480"/>
+        <w:pBdr>
+          <w:bottom w:val="single" w:color="0E6E73" w:sz="12" w:space="4"/>
+        </w:pBdr>
+        <w:bidi/>
+        <w:spacing w:after="280" w:before="240" w:line="480"/>
         <w:jc w:val="right"/>
       </w:pPr>
       <w:r>
@@ -4831,8 +4870,8 @@
           <w:b/>
           <w:bCs/>
           <w:color w:val="1F3864"/>
-          <w:sz w:val="32"/>
-          <w:szCs w:val="32"/>
+          <w:sz w:val="34"/>
+          <w:szCs w:val="34"/>
           <w:rtl/>
         </w:rPr>
         <w:t xml:space="preserve">פרק 5: תובנות, מסקנות ודעה אישית</w:t>
@@ -4937,7 +4976,7 @@
           <w:szCs w:val="24"/>
           <w:rtl/>
         </w:rPr>
-        <w:t xml:space="preserve">התובנה השלישית היא שהמשאבים קודמים ליוזמה. תחושת הניהוליות ניבאה עיצוב תפקיד עתידי במקדם החזק ביותר במודל (</w:t>
+        <w:t xml:space="preserve">התובנה השלישית היא שהמשאבים קודמים ליוזמה. תחושת הניהוליות ניבאה עיצוב תפקיד עתידי במקדם החזק ביותר במודל, ואילו מובנות לא תרמה ליוזמה (</w:t>
       </w:r>
       <w:r>
         <w:rPr>
@@ -4954,24 +4993,7 @@
           <w:szCs w:val="24"/>
           <w:rtl/>
         </w:rPr>
-        <w:t xml:space="preserve">). ממצא זה מתיישב עם המטא-אנליזה שהראתה שחוסר ביטחון תעסוקתי מקטין יוזמה (</w:t>
-      </w:r>
-      <w:r>
-        <w:rPr>
-          <w:rFonts w:ascii="Times New Roman" w:cs="Times New Roman" w:eastAsia="Times New Roman" w:hAnsi="Times New Roman"/>
-          <w:sz w:val="24"/>
-          <w:szCs w:val="24"/>
-        </w:rPr>
-        <w:t xml:space="preserve">‎Låstad et al., 2025‎</w:t>
-      </w:r>
-      <w:r>
-        <w:rPr>
-          <w:rFonts w:ascii="David" w:cs="David" w:eastAsia="David" w:hAnsi="David"/>
-          <w:sz w:val="24"/>
-          <w:szCs w:val="24"/>
-          <w:rtl/>
-        </w:rPr>
-        <w:t xml:space="preserve">): מי שמרגיש שאין לו משאבים אינו מעצב את תפקידו אלא מגן על מה שנותר. לכן צריך לבנות את תחושת הניהוליות בתקופות של יציבות, ולא לחכות לאיום.</w:t>
+        <w:t xml:space="preserve">). מי שמרגיש שאין לו מספיק משאבים אינו מעצב את תפקידו אלא מגן על מה שנותר. לכן צריך לבנות את תחושת הניהוליות בתקופות של יציבות, ולא לחכות לאיום.</w:t>
       </w:r>
     </w:p>
     <w:p>
@@ -5074,7 +5096,7 @@
           <w:szCs w:val="24"/>
           <w:rtl/>
         </w:rPr>
-        <w:t xml:space="preserve">). ברמה הארגונית, המסקנה היא שמנהלים שרוצים עובדים יוזמים בתקופת שינוי צריכים קודם כול לדאוג לתחושת ניהוליות: משאבים מספיקים, מידע ברור ומרחב לעיצוב התפקיד. חוסר ביטחון אינו מנוע ליוזמה אלא בולם שלה (</w:t>
+        <w:t xml:space="preserve">). ברמה הארגונית, המסקנה היא שמנהלים שרוצים עובדים יוזמים בתקופת שינוי צריכים קודם כול לדאוג לתחושת ניהוליות: משאבים מספיקים, מידע ברור ומרחב לעיצוב התפקיד. המאמר המשלים מוסיף שהאיום הטכנולוגי פוגע בביצועים דרך חוסר הביטחון, ולכן הפחתת חוסר הביטחון היא אינטרס ארגוני ולא רק טובת העובד (</w:t>
       </w:r>
       <w:r>
         <w:rPr>
@@ -5082,7 +5104,7 @@
           <w:sz w:val="24"/>
           <w:szCs w:val="24"/>
         </w:rPr>
-        <w:t xml:space="preserve">‎Låstad et al., 2025‎</w:t>
+        <w:t xml:space="preserve">‎Chung et al., 2025‎</w:t>
       </w:r>
       <w:r>
         <w:rPr>
@@ -5211,7 +5233,7 @@
           <w:szCs w:val="24"/>
           <w:rtl/>
         </w:rPr>
-        <w:t xml:space="preserve">עמדתנו היא שהמסר של המאמר משלים את "ממשבר להזדמנות" שלמדנו בקורס (דבדבני דקל, 2026ב). משבר הופך להזדמנות לא מעצמו, אלא כשמישהו מעצב אותו כך. עם זאת, המטא-אנליזה של לוסטד ואחרים (</w:t>
+        <w:t xml:space="preserve">עמדתנו היא שהמסר של המאמר משלים את "ממשבר להזדמנות" שלמדנו בקורס (דבדבני דקל, 2026ב). משבר הופך להזדמנות לא מעצמו, אלא כשמישהו מעצב אותו כך. עם זאת, המאמר עצמו מראה שהיוזמה תלויה בתחושת ניהוליות, ומי שמרגיש מאוים ובלי משאבים יתקשה להתחיל (</w:t>
       </w:r>
       <w:r>
         <w:rPr>
@@ -5219,16 +5241,16 @@
           <w:sz w:val="24"/>
           <w:szCs w:val="24"/>
         </w:rPr>
-        <w:t xml:space="preserve">‎Låstad et al., 2025‎</w:t>
-      </w:r>
-      <w:r>
-        <w:rPr>
-          <w:rFonts w:ascii="David" w:cs="David" w:eastAsia="David" w:hAnsi="David"/>
-          <w:sz w:val="24"/>
-          <w:szCs w:val="24"/>
-          <w:rtl/>
-        </w:rPr>
-        <w:t xml:space="preserve">) מזהירה שכשהאיום גדול, היוזמה יורדת. לכן אנחנו חושבים שהמסר לכיתה צריך להיות כפול: לעצב את התפקיד עכשיו, כשעוד יש משאבים, ולא לחכות; ולזכור שמי שמרגיש שאין לו משאבים צריך קודם תמיכה ולא עצות.</w:t>
+        <w:t xml:space="preserve">‎Cetkovská et al., 2026‎</w:t>
+      </w:r>
+      <w:r>
+        <w:rPr>
+          <w:rFonts w:ascii="David" w:cs="David" w:eastAsia="David" w:hAnsi="David"/>
+          <w:sz w:val="24"/>
+          <w:szCs w:val="24"/>
+          <w:rtl/>
+        </w:rPr>
+        <w:t xml:space="preserve">). לכן אנחנו חושבים שהמסר לכיתה צריך להיות כפול: לעצב את התפקיד עכשיו, כשעוד יש משאבים, ולא לחכות; ולזכור שמי שמרגיש שאין לו משאבים צריך קודם תמיכה ולא עצות.</w:t>
       </w:r>
     </w:p>
     <w:p>
@@ -5239,8 +5261,11 @@
     <w:p>
       <w:pPr>
         <w:pStyle w:val="Heading1"/>
-        <w:bidi/>
-        <w:spacing w:after="240" w:before="240" w:line="480"/>
+        <w:pBdr>
+          <w:bottom w:val="single" w:color="0E6E73" w:sz="12" w:space="4"/>
+        </w:pBdr>
+        <w:bidi/>
+        <w:spacing w:after="280" w:before="240" w:line="480"/>
         <w:jc w:val="right"/>
       </w:pPr>
       <w:r>
@@ -5249,8 +5274,8 @@
           <w:b/>
           <w:bCs/>
           <w:color w:val="1F3864"/>
-          <w:sz w:val="32"/>
-          <w:szCs w:val="32"/>
+          <w:sz w:val="34"/>
+          <w:szCs w:val="34"/>
           <w:rtl/>
         </w:rPr>
         <w:t xml:space="preserve">פרק 6: יישום מעשי בניהול קריירה</w:t>
@@ -5989,58 +6014,7 @@
           <w:szCs w:val="24"/>
           <w:rtl/>
         </w:rPr>
-        <w:t xml:space="preserve">גם תיאוריות הקריירה הקלאסיות מתחברות לממצאים. לפי מודל עוגני הקריירה, עובד שעוגן האוטונומיה או עוגן המומחיות דומיננטי אצלו ימצא בעיצוב תפקיד סביב הצרכים האלה סיפוק מיוחד, ואילו מי שעוגן הביטחון והיציבות דומיננטי אצלו יפיק תועלת בעיקר מחיזוק המובנות (</w:t>
-      </w:r>
-      <w:r>
-        <w:rPr>
-          <w:rFonts w:ascii="Times New Roman" w:cs="Times New Roman" w:eastAsia="Times New Roman" w:hAnsi="Times New Roman"/>
-          <w:sz w:val="24"/>
-          <w:szCs w:val="24"/>
-        </w:rPr>
-        <w:t xml:space="preserve">‎Schein, 1996‎</w:t>
-      </w:r>
-      <w:r>
-        <w:rPr>
-          <w:rFonts w:ascii="David" w:cs="David" w:eastAsia="David" w:hAnsi="David"/>
-          <w:sz w:val="24"/>
-          <w:szCs w:val="24"/>
-          <w:rtl/>
-        </w:rPr>
-        <w:t xml:space="preserve">). לפי גישת מרחב החיים, רוב הסטודנטים בכיתה נמצאים בשלב החקירה או הביסוס, שבו עיצוב התפקיד הוא גם דרך לברר מה מתאים להם (</w:t>
-      </w:r>
-      <w:r>
-        <w:rPr>
-          <w:rFonts w:ascii="Times New Roman" w:cs="Times New Roman" w:eastAsia="Times New Roman" w:hAnsi="Times New Roman"/>
-          <w:sz w:val="24"/>
-          <w:szCs w:val="24"/>
-        </w:rPr>
-        <w:t xml:space="preserve">‎Super, 1980‎</w:t>
-      </w:r>
-      <w:r>
-        <w:rPr>
-          <w:rFonts w:ascii="David" w:cs="David" w:eastAsia="David" w:hAnsi="David"/>
-          <w:sz w:val="24"/>
-          <w:szCs w:val="24"/>
-          <w:rtl/>
-        </w:rPr>
-        <w:t xml:space="preserve">). ממאמר החובה בקורס עולה שתמיכה במקום העבודה ובמשפחה משפרת זמינות פסיכולוגית ואנרגיה בעבודה (</w:t>
-      </w:r>
-      <w:r>
-        <w:rPr>
-          <w:rFonts w:ascii="Times New Roman" w:cs="Times New Roman" w:eastAsia="Times New Roman" w:hAnsi="Times New Roman"/>
-          <w:sz w:val="24"/>
-          <w:szCs w:val="24"/>
-        </w:rPr>
-        <w:t xml:space="preserve">‎Russo et al., 2016‎</w:t>
-      </w:r>
-      <w:r>
-        <w:rPr>
-          <w:rFonts w:ascii="David" w:cs="David" w:eastAsia="David" w:hAnsi="David"/>
-          <w:sz w:val="24"/>
-          <w:szCs w:val="24"/>
-          <w:rtl/>
-        </w:rPr>
-        <w:t xml:space="preserve">), משאבים שתומכים בתחושת הניהוליות שהמאמר מזהה כמניע ליוזמה. לבסוף, העיקרון של בניית תמונת מצב סדורה ומיקוד במה שבשליטה, שנלמד בהקשר של משבר הקורונה (דבדבני דקל, 2026ב), הוא יישום ישיר של חיזוק המובנות והניהוליות.</w:t>
+        <w:t xml:space="preserve">גם תיאוריות הקריירה שנלמדו בקורס מתחברות לממצאים. לפי מודל שלבי הקריירה של סופר, כפי שנלמד בניתוח הסרט בקורס, רוב הסטודנטים בכיתה נמצאים בשלב החקירה או הביסוס, שבו עיצוב התפקיד הוא גם דרך לברר מה מתאים להם (דבדבני דקל, 2026ג). לבסוף, העיקרון של בניית תמונת מצב סדורה ומיקוד במה שבשליטה, שנלמד בהקשר של משבר הקורונה (דבדבני דקל, 2026ב), הוא יישום ישיר של חיזוק המובנות והניהוליות.</w:t>
       </w:r>
     </w:p>
     <w:p>
@@ -6110,7 +6084,7 @@
           <w:szCs w:val="24"/>
           <w:rtl/>
         </w:rPr>
-        <w:t xml:space="preserve">). הרביעית היא לא להשתמש באיום כמנוע, משום שחוסר ביטחון מקטין יוזמה ומגביר הסתרת ידע (</w:t>
+        <w:t xml:space="preserve">). הרביעית היא לא להשתמש באיום כמנוע, משום שחוסר ביטחון פוגע בביצועים ומגביר התנהגות סוטה (</w:t>
       </w:r>
       <w:r>
         <w:rPr>
@@ -6118,7 +6092,7 @@
           <w:sz w:val="24"/>
           <w:szCs w:val="24"/>
         </w:rPr>
-        <w:t xml:space="preserve">‎Låstad et al., 2025‎</w:t>
+        <w:t xml:space="preserve">‎Chung et al., 2025‎</w:t>
       </w:r>
       <w:r>
         <w:rPr>
@@ -6225,8 +6199,11 @@
     <w:p>
       <w:pPr>
         <w:pStyle w:val="Heading1"/>
-        <w:bidi/>
-        <w:spacing w:after="240" w:before="240" w:line="480"/>
+        <w:pBdr>
+          <w:bottom w:val="single" w:color="0E6E73" w:sz="12" w:space="4"/>
+        </w:pBdr>
+        <w:bidi/>
+        <w:spacing w:after="280" w:before="240" w:line="480"/>
         <w:jc w:val="right"/>
       </w:pPr>
       <w:r>
@@ -6235,8 +6212,8 @@
           <w:b/>
           <w:bCs/>
           <w:color w:val="1F3864"/>
-          <w:sz w:val="32"/>
-          <w:szCs w:val="32"/>
+          <w:sz w:val="34"/>
+          <w:szCs w:val="34"/>
           <w:rtl/>
         </w:rPr>
         <w:t xml:space="preserve">סיכום ומסקנות</w:t>
@@ -6289,24 +6266,7 @@
           <w:szCs w:val="24"/>
           <w:rtl/>
         </w:rPr>
-        <w:t xml:space="preserve">) הראה שהמודעות לבינה מלאכותית היא מקור מרכזי לחוסר הביטחון של ימינו ושמשאב אישי ממתן אותו, והמטא-אנליזה של לוסטד ואחרים (</w:t>
-      </w:r>
-      <w:r>
-        <w:rPr>
-          <w:rFonts w:ascii="Times New Roman" w:cs="Times New Roman" w:eastAsia="Times New Roman" w:hAnsi="Times New Roman"/>
-          <w:sz w:val="24"/>
-          <w:szCs w:val="24"/>
-        </w:rPr>
-        <w:t xml:space="preserve">‎Låstad et al., 2025‎</w:t>
-      </w:r>
-      <w:r>
-        <w:rPr>
-          <w:rFonts w:ascii="David" w:cs="David" w:eastAsia="David" w:hAnsi="David"/>
-          <w:sz w:val="24"/>
-          <w:szCs w:val="24"/>
-          <w:rtl/>
-        </w:rPr>
-        <w:t xml:space="preserve">) הזהירה שחוסר הביטחון עצמו מקטין את היוזמה, ולכן יש לבנות את המשאבים מראש.</w:t>
+        <w:t xml:space="preserve">) הראה שהמודעות לבינה מלאכותית היא מקור מרכזי לחוסר הביטחון של ימינו ושמשאב אישי ממתן אותו. שני המאמרים יחד מלמדים שאת המשאבים יש לבנות מראש, לפני שהאיום מדלדל אותם.</w:t>
       </w:r>
     </w:p>
     <w:p>
@@ -6333,8 +6293,11 @@
     <w:p>
       <w:pPr>
         <w:pStyle w:val="Heading1"/>
-        <w:bidi/>
-        <w:spacing w:after="240" w:before="240" w:line="480"/>
+        <w:pBdr>
+          <w:bottom w:val="single" w:color="0E6E73" w:sz="12" w:space="4"/>
+        </w:pBdr>
+        <w:bidi/>
+        <w:spacing w:after="280" w:before="240" w:line="480"/>
         <w:jc w:val="right"/>
       </w:pPr>
       <w:r>
@@ -6343,8 +6306,8 @@
           <w:b/>
           <w:bCs/>
           <w:color w:val="1F3864"/>
-          <w:sz w:val="32"/>
-          <w:szCs w:val="32"/>
+          <w:sz w:val="34"/>
+          <w:szCs w:val="34"/>
           <w:rtl/>
         </w:rPr>
         <w:t xml:space="preserve">נספח א: תכנון המצגת והאמצעים להמחשה</w:t>
@@ -7459,8 +7422,11 @@
     <w:p>
       <w:pPr>
         <w:pStyle w:val="Heading1"/>
-        <w:bidi/>
-        <w:spacing w:after="240" w:before="240" w:line="480"/>
+        <w:pBdr>
+          <w:bottom w:val="single" w:color="0E6E73" w:sz="12" w:space="4"/>
+        </w:pBdr>
+        <w:bidi/>
+        <w:spacing w:after="280" w:before="240" w:line="480"/>
         <w:jc w:val="right"/>
       </w:pPr>
       <w:r>
@@ -7469,8 +7435,8 @@
           <w:b/>
           <w:bCs/>
           <w:color w:val="1F3864"/>
-          <w:sz w:val="32"/>
-          <w:szCs w:val="32"/>
+          <w:sz w:val="34"/>
+          <w:szCs w:val="34"/>
           <w:rtl/>
         </w:rPr>
         <w:t xml:space="preserve">נספח ב: שאלון קצר להערכה עצמית</w:t>
@@ -8537,8 +8503,11 @@
     <w:p>
       <w:pPr>
         <w:pStyle w:val="Heading1"/>
-        <w:bidi/>
-        <w:spacing w:after="240" w:before="240" w:line="480"/>
+        <w:pBdr>
+          <w:bottom w:val="single" w:color="0E6E73" w:sz="12" w:space="4"/>
+        </w:pBdr>
+        <w:bidi/>
+        <w:spacing w:after="280" w:before="240" w:line="480"/>
         <w:jc w:val="right"/>
       </w:pPr>
       <w:r>
@@ -8547,8 +8516,8 @@
           <w:b/>
           <w:bCs/>
           <w:color w:val="1F3864"/>
-          <w:sz w:val="32"/>
-          <w:szCs w:val="32"/>
+          <w:sz w:val="34"/>
+          <w:szCs w:val="34"/>
           <w:rtl/>
         </w:rPr>
         <w:t xml:space="preserve">רשימת מקורות</w:t>
@@ -8611,6 +8580,23 @@
           <w:rtl/>
         </w:rPr>
         <w:t xml:space="preserve">דבדבני דקל, מ' (2026ב). עסקים בצל הקורונה: ממשבר להזדמנות, איך עושים את זה? [מצגת הרצאה]. ניהול קריירה בארגונים, הקריה האקדמית אונו.</w:t>
+      </w:r>
+    </w:p>
+    <w:p>
+      <w:pPr>
+        <w:bidi/>
+        <w:spacing w:after="0" w:line="480"/>
+        <w:ind w:left="709" w:hanging="709"/>
+        <w:jc w:val="right"/>
+      </w:pPr>
+      <w:r>
+        <w:rPr>
+          <w:rFonts w:ascii="David" w:cs="David" w:eastAsia="David" w:hAnsi="David"/>
+          <w:sz w:val="24"/>
+          <w:szCs w:val="24"/>
+          <w:rtl/>
+        </w:rPr>
+        <w:t xml:space="preserve">דבדבני דקל, מ' (2026ג). ניתוח הסרט "השטן לובשת פראדה" לפי תיאוריות קריירה [מצגת הרצאה]. ניהול קריירה בארגונים, הקריה האקדמית אונו.</w:t>
       </w:r>
     </w:p>
     <w:p>
@@ -8687,7 +8673,7 @@
           <w:sz w:val="24"/>
           <w:szCs w:val="24"/>
         </w:rPr>
-        <w:t xml:space="preserve">Antonovsky, A. (1987). </w:t>
+        <w:t xml:space="preserve">Cetkovská, K., Bauer, G. F., &amp; Tušl, M. (2026). The role of needs-based job crafting in strengthening work-related sense of coherence: A two-wave panel study. </w:t>
       </w:r>
       <w:r>
         <w:rPr>
@@ -8697,7 +8683,7 @@
           <w:sz w:val="24"/>
           <w:szCs w:val="24"/>
         </w:rPr>
-        <w:t xml:space="preserve">Unraveling the mystery of health: How people manage stress and stay well</w:t>
+        <w:t xml:space="preserve">Scandinavian Journal of Work and Organizational Psychology, 11</w:t>
       </w:r>
       <w:r>
         <w:rPr>
@@ -8707,7 +8693,7 @@
           <w:sz w:val="24"/>
           <w:szCs w:val="24"/>
         </w:rPr>
-        <w:t xml:space="preserve">. Jossey-Bass.</w:t>
+        <w:t xml:space="preserve">(1), Article 14. https://doi.org/10.16993/sjwop.389</w:t>
       </w:r>
     </w:p>
     <w:p>
@@ -8725,7 +8711,7 @@
           <w:sz w:val="24"/>
           <w:szCs w:val="24"/>
         </w:rPr>
-        <w:t xml:space="preserve">Cetkovská, K., Bauer, G. F., &amp; Tušl, M. (2026). The role of needs-based job crafting in strengthening work-related sense of coherence: A two-wave panel study. </w:t>
+        <w:t xml:space="preserve">Chung, Y. W., Im, S., Kim, J. E., &amp; Yun, J. K. (2025). Artificial intelligence awareness, career resilience, job insecurity and behavioural outcomes. </w:t>
       </w:r>
       <w:r>
         <w:rPr>
@@ -8735,7 +8721,7 @@
           <w:sz w:val="24"/>
           <w:szCs w:val="24"/>
         </w:rPr>
-        <w:t xml:space="preserve">Scandinavian Journal of Work and Organizational Psychology, 11</w:t>
+        <w:t xml:space="preserve">Australian Journal of Psychology, 77</w:t>
       </w:r>
       <w:r>
         <w:rPr>
@@ -8745,7 +8731,7 @@
           <w:sz w:val="24"/>
           <w:szCs w:val="24"/>
         </w:rPr>
-        <w:t xml:space="preserve">(1), Article 14. https://doi.org/10.16993/sjwop.389</w:t>
+        <w:t xml:space="preserve">(1), Article 2559910. https://doi.org/10.1080/00049530.2025.2559910</w:t>
       </w:r>
     </w:p>
     <w:p>
@@ -8763,7 +8749,7 @@
           <w:sz w:val="24"/>
           <w:szCs w:val="24"/>
         </w:rPr>
-        <w:t xml:space="preserve">Chung, Y. W., Im, S., Kim, J. E., &amp; Yun, J. K. (2025). Artificial intelligence awareness, career resilience, job insecurity and behavioural outcomes. </w:t>
+        <w:t xml:space="preserve">Hone, L. (2019). </w:t>
       </w:r>
       <w:r>
         <w:rPr>
@@ -8773,7 +8759,7 @@
           <w:sz w:val="24"/>
           <w:szCs w:val="24"/>
         </w:rPr>
-        <w:t xml:space="preserve">Australian Journal of Psychology, 77</w:t>
+        <w:t xml:space="preserve">3 secrets of resilient people</w:t>
       </w:r>
       <w:r>
         <w:rPr>
@@ -8783,387 +8769,7 @@
           <w:sz w:val="24"/>
           <w:szCs w:val="24"/>
         </w:rPr>
-        <w:t xml:space="preserve">(1), Article 2559910. https://doi.org/10.1080/00049530.2025.2559910</w:t>
-      </w:r>
-    </w:p>
-    <w:p>
-      <w:pPr>
-        <w:bidi w:val="false"/>
-        <w:spacing w:after="0" w:line="480"/>
-        <w:ind w:left="709" w:hanging="709"/>
-        <w:jc w:val="left"/>
-      </w:pPr>
-      <w:r>
-        <w:rPr>
-          <w:rFonts w:ascii="Times New Roman" w:cs="Times New Roman" w:eastAsia="Times New Roman" w:hAnsi="Times New Roman"/>
-          <w:i w:val="false"/>
-          <w:iCs w:val="false"/>
-          <w:sz w:val="24"/>
-          <w:szCs w:val="24"/>
-        </w:rPr>
-        <w:t xml:space="preserve">Greenhaus, J. H., Callanan, G. A., &amp; Godshalk, V. M. (2018). </w:t>
-      </w:r>
-      <w:r>
-        <w:rPr>
-          <w:rFonts w:ascii="Times New Roman" w:cs="Times New Roman" w:eastAsia="Times New Roman" w:hAnsi="Times New Roman"/>
-          <w:i/>
-          <w:iCs/>
-          <w:sz w:val="24"/>
-          <w:szCs w:val="24"/>
-        </w:rPr>
-        <w:t xml:space="preserve">Career management for life</w:t>
-      </w:r>
-      <w:r>
-        <w:rPr>
-          <w:rFonts w:ascii="Times New Roman" w:cs="Times New Roman" w:eastAsia="Times New Roman" w:hAnsi="Times New Roman"/>
-          <w:i w:val="false"/>
-          <w:iCs w:val="false"/>
-          <w:sz w:val="24"/>
-          <w:szCs w:val="24"/>
-        </w:rPr>
-        <w:t xml:space="preserve"> (5th ed.). Routledge.</w:t>
-      </w:r>
-    </w:p>
-    <w:p>
-      <w:pPr>
-        <w:bidi w:val="false"/>
-        <w:spacing w:after="0" w:line="480"/>
-        <w:ind w:left="709" w:hanging="709"/>
-        <w:jc w:val="left"/>
-      </w:pPr>
-      <w:r>
-        <w:rPr>
-          <w:rFonts w:ascii="Times New Roman" w:cs="Times New Roman" w:eastAsia="Times New Roman" w:hAnsi="Times New Roman"/>
-          <w:i w:val="false"/>
-          <w:iCs w:val="false"/>
-          <w:sz w:val="24"/>
-          <w:szCs w:val="24"/>
-        </w:rPr>
-        <w:t xml:space="preserve">Hellgren, J., Sverke, M., &amp; Isaksson, K. (1999). A two-dimensional approach to job insecurity: Consequences for employee attitudes and well-being. </w:t>
-      </w:r>
-      <w:r>
-        <w:rPr>
-          <w:rFonts w:ascii="Times New Roman" w:cs="Times New Roman" w:eastAsia="Times New Roman" w:hAnsi="Times New Roman"/>
-          <w:i/>
-          <w:iCs/>
-          <w:sz w:val="24"/>
-          <w:szCs w:val="24"/>
-        </w:rPr>
-        <w:t xml:space="preserve">European Journal of Work and Organizational Psychology, 8</w:t>
-      </w:r>
-      <w:r>
-        <w:rPr>
-          <w:rFonts w:ascii="Times New Roman" w:cs="Times New Roman" w:eastAsia="Times New Roman" w:hAnsi="Times New Roman"/>
-          <w:i w:val="false"/>
-          <w:iCs w:val="false"/>
-          <w:sz w:val="24"/>
-          <w:szCs w:val="24"/>
-        </w:rPr>
-        <w:t xml:space="preserve">(2), 179-195. https://doi.org/10.1080/135943299398311</w:t>
-      </w:r>
-    </w:p>
-    <w:p>
-      <w:pPr>
-        <w:bidi w:val="false"/>
-        <w:spacing w:after="0" w:line="480"/>
-        <w:ind w:left="709" w:hanging="709"/>
-        <w:jc w:val="left"/>
-      </w:pPr>
-      <w:r>
-        <w:rPr>
-          <w:rFonts w:ascii="Times New Roman" w:cs="Times New Roman" w:eastAsia="Times New Roman" w:hAnsi="Times New Roman"/>
-          <w:i w:val="false"/>
-          <w:iCs w:val="false"/>
-          <w:sz w:val="24"/>
-          <w:szCs w:val="24"/>
-        </w:rPr>
-        <w:t xml:space="preserve">Hobfoll, S. E. (1989). Conservation of resources: A new attempt at conceptualizing stress. </w:t>
-      </w:r>
-      <w:r>
-        <w:rPr>
-          <w:rFonts w:ascii="Times New Roman" w:cs="Times New Roman" w:eastAsia="Times New Roman" w:hAnsi="Times New Roman"/>
-          <w:i/>
-          <w:iCs/>
-          <w:sz w:val="24"/>
-          <w:szCs w:val="24"/>
-        </w:rPr>
-        <w:t xml:space="preserve">American Psychologist, 44</w:t>
-      </w:r>
-      <w:r>
-        <w:rPr>
-          <w:rFonts w:ascii="Times New Roman" w:cs="Times New Roman" w:eastAsia="Times New Roman" w:hAnsi="Times New Roman"/>
-          <w:i w:val="false"/>
-          <w:iCs w:val="false"/>
-          <w:sz w:val="24"/>
-          <w:szCs w:val="24"/>
-        </w:rPr>
-        <w:t xml:space="preserve">(3), 513-524. https://doi.org/10.1037/0003-066X.44.3.513</w:t>
-      </w:r>
-    </w:p>
-    <w:p>
-      <w:pPr>
-        <w:bidi w:val="false"/>
-        <w:spacing w:after="0" w:line="480"/>
-        <w:ind w:left="709" w:hanging="709"/>
-        <w:jc w:val="left"/>
-      </w:pPr>
-      <w:r>
-        <w:rPr>
-          <w:rFonts w:ascii="Times New Roman" w:cs="Times New Roman" w:eastAsia="Times New Roman" w:hAnsi="Times New Roman"/>
-          <w:i w:val="false"/>
-          <w:iCs w:val="false"/>
-          <w:sz w:val="24"/>
-          <w:szCs w:val="24"/>
-        </w:rPr>
-        <w:t xml:space="preserve">Hone, L. (2019). </w:t>
-      </w:r>
-      <w:r>
-        <w:rPr>
-          <w:rFonts w:ascii="Times New Roman" w:cs="Times New Roman" w:eastAsia="Times New Roman" w:hAnsi="Times New Roman"/>
-          <w:i/>
-          <w:iCs/>
-          <w:sz w:val="24"/>
-          <w:szCs w:val="24"/>
-        </w:rPr>
-        <w:t xml:space="preserve">3 secrets of resilient people</w:t>
-      </w:r>
-      <w:r>
-        <w:rPr>
-          <w:rFonts w:ascii="Times New Roman" w:cs="Times New Roman" w:eastAsia="Times New Roman" w:hAnsi="Times New Roman"/>
-          <w:i w:val="false"/>
-          <w:iCs w:val="false"/>
-          <w:sz w:val="24"/>
-          <w:szCs w:val="24"/>
-        </w:rPr>
         <w:t xml:space="preserve"> [Video]. TED Conferences. https://www.ted.com/talks/lucy_hone_the_three_secrets_of_resilient_people</w:t>
-      </w:r>
-    </w:p>
-    <w:p>
-      <w:pPr>
-        <w:bidi w:val="false"/>
-        <w:spacing w:after="0" w:line="480"/>
-        <w:ind w:left="709" w:hanging="709"/>
-        <w:jc w:val="left"/>
-      </w:pPr>
-      <w:r>
-        <w:rPr>
-          <w:rFonts w:ascii="Times New Roman" w:cs="Times New Roman" w:eastAsia="Times New Roman" w:hAnsi="Times New Roman"/>
-          <w:i w:val="false"/>
-          <w:iCs w:val="false"/>
-          <w:sz w:val="24"/>
-          <w:szCs w:val="24"/>
-        </w:rPr>
-        <w:t xml:space="preserve">Låstad, L., Pienaar, J., Näswall, K., Richter, A., Hellgren, J., &amp; Sverke, M. (2025). Moving on up now? A meta-analysis of the associations between job insecurity and career-related outcomes. </w:t>
-      </w:r>
-      <w:r>
-        <w:rPr>
-          <w:rFonts w:ascii="Times New Roman" w:cs="Times New Roman" w:eastAsia="Times New Roman" w:hAnsi="Times New Roman"/>
-          <w:i/>
-          <w:iCs/>
-          <w:sz w:val="24"/>
-          <w:szCs w:val="24"/>
-        </w:rPr>
-        <w:t xml:space="preserve">Scandinavian Journal of Work and Organizational Psychology, 10</w:t>
-      </w:r>
-      <w:r>
-        <w:rPr>
-          <w:rFonts w:ascii="Times New Roman" w:cs="Times New Roman" w:eastAsia="Times New Roman" w:hAnsi="Times New Roman"/>
-          <w:i w:val="false"/>
-          <w:iCs w:val="false"/>
-          <w:sz w:val="24"/>
-          <w:szCs w:val="24"/>
-        </w:rPr>
-        <w:t xml:space="preserve">(1), Article 2. https://doi.org/10.16993/sjwop.275</w:t>
-      </w:r>
-    </w:p>
-    <w:p>
-      <w:pPr>
-        <w:bidi w:val="false"/>
-        <w:spacing w:after="0" w:line="480"/>
-        <w:ind w:left="709" w:hanging="709"/>
-        <w:jc w:val="left"/>
-      </w:pPr>
-      <w:r>
-        <w:rPr>
-          <w:rFonts w:ascii="Times New Roman" w:cs="Times New Roman" w:eastAsia="Times New Roman" w:hAnsi="Times New Roman"/>
-          <w:i w:val="false"/>
-          <w:iCs w:val="false"/>
-          <w:sz w:val="24"/>
-          <w:szCs w:val="24"/>
-        </w:rPr>
-        <w:t xml:space="preserve">Russo, M., Shteigman, A., &amp; Carmeli, A. (2016). Workplace and family support and work-life balance: Implications for individual psychological availability and energy at work. </w:t>
-      </w:r>
-      <w:r>
-        <w:rPr>
-          <w:rFonts w:ascii="Times New Roman" w:cs="Times New Roman" w:eastAsia="Times New Roman" w:hAnsi="Times New Roman"/>
-          <w:i/>
-          <w:iCs/>
-          <w:sz w:val="24"/>
-          <w:szCs w:val="24"/>
-        </w:rPr>
-        <w:t xml:space="preserve">The Journal of Positive Psychology, 11</w:t>
-      </w:r>
-      <w:r>
-        <w:rPr>
-          <w:rFonts w:ascii="Times New Roman" w:cs="Times New Roman" w:eastAsia="Times New Roman" w:hAnsi="Times New Roman"/>
-          <w:i w:val="false"/>
-          <w:iCs w:val="false"/>
-          <w:sz w:val="24"/>
-          <w:szCs w:val="24"/>
-        </w:rPr>
-        <w:t xml:space="preserve">(2), 173-188. https://doi.org/10.1080/17439760.2015.1025424</w:t>
-      </w:r>
-    </w:p>
-    <w:p>
-      <w:pPr>
-        <w:bidi w:val="false"/>
-        <w:spacing w:after="0" w:line="480"/>
-        <w:ind w:left="709" w:hanging="709"/>
-        <w:jc w:val="left"/>
-      </w:pPr>
-      <w:r>
-        <w:rPr>
-          <w:rFonts w:ascii="Times New Roman" w:cs="Times New Roman" w:eastAsia="Times New Roman" w:hAnsi="Times New Roman"/>
-          <w:i w:val="false"/>
-          <w:iCs w:val="false"/>
-          <w:sz w:val="24"/>
-          <w:szCs w:val="24"/>
-        </w:rPr>
-        <w:t xml:space="preserve">Schein, E. H. (1996). Career anchors revisited: Implications for career development in the 21st century. </w:t>
-      </w:r>
-      <w:r>
-        <w:rPr>
-          <w:rFonts w:ascii="Times New Roman" w:cs="Times New Roman" w:eastAsia="Times New Roman" w:hAnsi="Times New Roman"/>
-          <w:i/>
-          <w:iCs/>
-          <w:sz w:val="24"/>
-          <w:szCs w:val="24"/>
-        </w:rPr>
-        <w:t xml:space="preserve">Academy of Management Executive, 10</w:t>
-      </w:r>
-      <w:r>
-        <w:rPr>
-          <w:rFonts w:ascii="Times New Roman" w:cs="Times New Roman" w:eastAsia="Times New Roman" w:hAnsi="Times New Roman"/>
-          <w:i w:val="false"/>
-          <w:iCs w:val="false"/>
-          <w:sz w:val="24"/>
-          <w:szCs w:val="24"/>
-        </w:rPr>
-        <w:t xml:space="preserve">(4), 80-88. https://doi.org/10.5465/ame.1996.3145321</w:t>
-      </w:r>
-    </w:p>
-    <w:p>
-      <w:pPr>
-        <w:bidi w:val="false"/>
-        <w:spacing w:after="0" w:line="480"/>
-        <w:ind w:left="709" w:hanging="709"/>
-        <w:jc w:val="left"/>
-      </w:pPr>
-      <w:r>
-        <w:rPr>
-          <w:rFonts w:ascii="Times New Roman" w:cs="Times New Roman" w:eastAsia="Times New Roman" w:hAnsi="Times New Roman"/>
-          <w:i w:val="false"/>
-          <w:iCs w:val="false"/>
-          <w:sz w:val="24"/>
-          <w:szCs w:val="24"/>
-        </w:rPr>
-        <w:t xml:space="preserve">Shoss, M. K. (2017). Job insecurity: An integrative review and agenda for future research. </w:t>
-      </w:r>
-      <w:r>
-        <w:rPr>
-          <w:rFonts w:ascii="Times New Roman" w:cs="Times New Roman" w:eastAsia="Times New Roman" w:hAnsi="Times New Roman"/>
-          <w:i/>
-          <w:iCs/>
-          <w:sz w:val="24"/>
-          <w:szCs w:val="24"/>
-        </w:rPr>
-        <w:t xml:space="preserve">Journal of Management, 43</w:t>
-      </w:r>
-      <w:r>
-        <w:rPr>
-          <w:rFonts w:ascii="Times New Roman" w:cs="Times New Roman" w:eastAsia="Times New Roman" w:hAnsi="Times New Roman"/>
-          <w:i w:val="false"/>
-          <w:iCs w:val="false"/>
-          <w:sz w:val="24"/>
-          <w:szCs w:val="24"/>
-        </w:rPr>
-        <w:t xml:space="preserve">(6), 1911-1939. https://doi.org/10.1177/0149206317691574</w:t>
-      </w:r>
-    </w:p>
-    <w:p>
-      <w:pPr>
-        <w:bidi w:val="false"/>
-        <w:spacing w:after="0" w:line="480"/>
-        <w:ind w:left="709" w:hanging="709"/>
-        <w:jc w:val="left"/>
-      </w:pPr>
-      <w:r>
-        <w:rPr>
-          <w:rFonts w:ascii="Times New Roman" w:cs="Times New Roman" w:eastAsia="Times New Roman" w:hAnsi="Times New Roman"/>
-          <w:i w:val="false"/>
-          <w:iCs w:val="false"/>
-          <w:sz w:val="24"/>
-          <w:szCs w:val="24"/>
-        </w:rPr>
-        <w:t xml:space="preserve">Super, D. E. (1980). A life-span, life-space approach to career development. </w:t>
-      </w:r>
-      <w:r>
-        <w:rPr>
-          <w:rFonts w:ascii="Times New Roman" w:cs="Times New Roman" w:eastAsia="Times New Roman" w:hAnsi="Times New Roman"/>
-          <w:i/>
-          <w:iCs/>
-          <w:sz w:val="24"/>
-          <w:szCs w:val="24"/>
-        </w:rPr>
-        <w:t xml:space="preserve">Journal of Vocational Behavior, 16</w:t>
-      </w:r>
-      <w:r>
-        <w:rPr>
-          <w:rFonts w:ascii="Times New Roman" w:cs="Times New Roman" w:eastAsia="Times New Roman" w:hAnsi="Times New Roman"/>
-          <w:i w:val="false"/>
-          <w:iCs w:val="false"/>
-          <w:sz w:val="24"/>
-          <w:szCs w:val="24"/>
-        </w:rPr>
-        <w:t xml:space="preserve">(3), 282-298. https://doi.org/10.1016/0001-8791(80)90056-1</w:t>
-      </w:r>
-    </w:p>
-    <w:p>
-      <w:pPr>
-        <w:bidi w:val="false"/>
-        <w:spacing w:after="0" w:line="480"/>
-        <w:ind w:left="709" w:hanging="709"/>
-        <w:jc w:val="left"/>
-      </w:pPr>
-      <w:r>
-        <w:rPr>
-          <w:rFonts w:ascii="Times New Roman" w:cs="Times New Roman" w:eastAsia="Times New Roman" w:hAnsi="Times New Roman"/>
-          <w:i w:val="false"/>
-          <w:iCs w:val="false"/>
-          <w:sz w:val="24"/>
-          <w:szCs w:val="24"/>
-        </w:rPr>
-        <w:t xml:space="preserve">Wrzesniewski, A., &amp; Dutton, J. E. (2001). Crafting a job: Revisioning employees as active crafters of their work. </w:t>
-      </w:r>
-      <w:r>
-        <w:rPr>
-          <w:rFonts w:ascii="Times New Roman" w:cs="Times New Roman" w:eastAsia="Times New Roman" w:hAnsi="Times New Roman"/>
-          <w:i/>
-          <w:iCs/>
-          <w:sz w:val="24"/>
-          <w:szCs w:val="24"/>
-        </w:rPr>
-        <w:t xml:space="preserve">Academy of Management Review, 26</w:t>
-      </w:r>
-      <w:r>
-        <w:rPr>
-          <w:rFonts w:ascii="Times New Roman" w:cs="Times New Roman" w:eastAsia="Times New Roman" w:hAnsi="Times New Roman"/>
-          <w:i w:val="false"/>
-          <w:iCs w:val="false"/>
-          <w:sz w:val="24"/>
-          <w:szCs w:val="24"/>
-        </w:rPr>
-        <w:t xml:space="preserve">(2), 179-201. https://doi.org/10.5465/amr.2001.4378011</w:t>
       </w:r>
     </w:p>
     <w:sectPr>

</xml_diff>

<commit_message>
Use an automatic Word TOC field and black-only formatting
Replace the manual contents list with a TOC field (headings 1-2, updates on
open) pre-filled with page numbers, and remove all colours and table shading
from the paper per the academic formatting guidelines.

Co-Authored-By: Claude Fable 5.1 <noreply@anthropic.com>
Claude-Session: https://claude.ai/code/session_01XaGvnsaHG3kPyCY3aGBByx
</commit_message>
<xml_diff>
--- a/career-management-final-project/ניהול קריירה - התמודדות עם חוסר ודאות תעסוקתי - עבודה מסכמת.docx
+++ b/career-management-final-project/ניהול קריירה - התמודדות עם חוסר ודאות תעסוקתי - עבודה מסכמת.docx
@@ -18,7 +18,7 @@
           <w:rFonts w:ascii="David" w:cs="David" w:eastAsia="David" w:hAnsi="David"/>
           <w:b/>
           <w:bCs/>
-          <w:color w:val="1F3864"/>
+          <w:color w:val="000000"/>
           <w:sz w:val="36"/>
           <w:szCs w:val="36"/>
           <w:rtl/>
@@ -35,7 +35,7 @@
       <w:r>
         <w:rPr>
           <w:rFonts w:ascii="David" w:cs="David" w:eastAsia="David" w:hAnsi="David"/>
-          <w:color w:val="595959"/>
+          <w:color w:val="000000"/>
           <w:sz w:val="24"/>
           <w:szCs w:val="24"/>
           <w:rtl/>
@@ -114,7 +114,7 @@
           <w:rFonts w:ascii="David" w:cs="David" w:eastAsia="David" w:hAnsi="David"/>
           <w:b/>
           <w:bCs/>
-          <w:color w:val="0E6E73"/>
+          <w:color w:val="000000"/>
           <w:sz w:val="44"/>
           <w:szCs w:val="44"/>
           <w:rtl/>
@@ -148,7 +148,7 @@
           <w:rFonts w:ascii="Times New Roman" w:cs="Times New Roman" w:eastAsia="Times New Roman" w:hAnsi="Times New Roman"/>
           <w:i/>
           <w:iCs/>
-          <w:color w:val="404040"/>
+          <w:color w:val="000000"/>
           <w:sz w:val="22"/>
           <w:szCs w:val="22"/>
         </w:rPr>
@@ -164,7 +164,7 @@
       <w:r>
         <w:rPr>
           <w:rFonts w:ascii="David" w:cs="David" w:eastAsia="David" w:hAnsi="David"/>
-          <w:color w:val="404040"/>
+          <w:color w:val="000000"/>
           <w:sz w:val="22"/>
           <w:szCs w:val="22"/>
           <w:rtl/>
@@ -182,7 +182,7 @@
           <w:rFonts w:ascii="Times New Roman" w:cs="Times New Roman" w:eastAsia="Times New Roman" w:hAnsi="Times New Roman"/>
           <w:i/>
           <w:iCs/>
-          <w:color w:val="404040"/>
+          <w:color w:val="000000"/>
           <w:sz w:val="22"/>
           <w:szCs w:val="22"/>
         </w:rPr>
@@ -225,7 +225,6 @@
               <w:bottom w:val="single" w:color="A6A6A6" w:sz="6"/>
               <w:right w:val="single" w:color="A6A6A6" w:sz="6"/>
             </w:tcBorders>
-            <w:shd w:fill="D9E2F3" w:color="auto" w:val="clear"/>
             <w:tcMar>
               <w:top w:type="dxa" w:w="80"/>
               <w:left w:type="dxa" w:w="100"/>
@@ -245,7 +244,6 @@
                 <w:rFonts w:ascii="David" w:cs="David" w:eastAsia="David" w:hAnsi="David"/>
                 <w:b/>
                 <w:bCs/>
-                <w:color w:val="1F3864"/>
                 <w:sz w:val="22"/>
                 <w:szCs w:val="22"/>
                 <w:rtl/>
@@ -263,7 +261,6 @@
               <w:bottom w:val="single" w:color="A6A6A6" w:sz="6"/>
               <w:right w:val="single" w:color="A6A6A6" w:sz="6"/>
             </w:tcBorders>
-            <w:shd w:fill="D9E2F3" w:color="auto" w:val="clear"/>
             <w:tcMar>
               <w:top w:type="dxa" w:w="80"/>
               <w:left w:type="dxa" w:w="100"/>
@@ -283,7 +280,6 @@
                 <w:rFonts w:ascii="David" w:cs="David" w:eastAsia="David" w:hAnsi="David"/>
                 <w:b/>
                 <w:bCs/>
-                <w:color w:val="1F3864"/>
                 <w:sz w:val="22"/>
                 <w:szCs w:val="22"/>
                 <w:rtl/>
@@ -570,11 +566,8 @@
     <w:p>
       <w:pPr>
         <w:pStyle w:val="Heading1"/>
-        <w:pBdr>
-          <w:bottom w:val="single" w:color="0E6E73" w:sz="12" w:space="4"/>
-        </w:pBdr>
-        <w:bidi/>
-        <w:spacing w:after="280" w:before="240" w:line="480"/>
+        <w:bidi/>
+        <w:spacing w:after="240" w:before="240" w:line="480"/>
         <w:jc w:val="right"/>
       </w:pPr>
       <w:r>
@@ -582,339 +575,993 @@
           <w:rFonts w:ascii="David" w:cs="David" w:eastAsia="David" w:hAnsi="David"/>
           <w:b/>
           <w:bCs/>
-          <w:color w:val="1F3864"/>
-          <w:sz w:val="34"/>
-          <w:szCs w:val="34"/>
+          <w:color w:val="000000"/>
+          <w:sz w:val="32"/>
+          <w:szCs w:val="32"/>
           <w:rtl/>
         </w:rPr>
         <w:t xml:space="preserve">תוכן העניינים</w:t>
       </w:r>
     </w:p>
-    <w:p>
-      <w:pPr>
-        <w:tabs>
-          <w:tab w:val="left" w:pos="8800" w:leader="dot"/>
-        </w:tabs>
-        <w:bidi/>
-        <w:spacing w:after="0" w:line="480"/>
-        <w:jc w:val="right"/>
-      </w:pPr>
-      <w:r>
-        <w:rPr>
-          <w:rFonts w:ascii="David" w:cs="David" w:eastAsia="David" w:hAnsi="David"/>
-          <w:sz w:val="24"/>
-          <w:szCs w:val="24"/>
-          <w:rtl/>
-        </w:rPr>
-        <w:t xml:space="preserve">מבוא</w:t>
-      </w:r>
-      <w:r>
-        <w:rPr>
-          <w:rFonts w:ascii="David" w:cs="David" w:eastAsia="David" w:hAnsi="David"/>
-          <w:sz w:val="24"/>
-          <w:szCs w:val="24"/>
-          <w:rtl/>
-        </w:rPr>
-        <w:t xml:space="preserve">	3</w:t>
-      </w:r>
-    </w:p>
-    <w:p>
-      <w:pPr>
-        <w:tabs>
-          <w:tab w:val="left" w:pos="8800" w:leader="dot"/>
-        </w:tabs>
-        <w:bidi/>
-        <w:spacing w:after="0" w:line="480"/>
-        <w:jc w:val="right"/>
-      </w:pPr>
-      <w:r>
-        <w:rPr>
-          <w:rFonts w:ascii="David" w:cs="David" w:eastAsia="David" w:hAnsi="David"/>
-          <w:sz w:val="24"/>
-          <w:szCs w:val="24"/>
-          <w:rtl/>
-        </w:rPr>
-        <w:t xml:space="preserve">פרק 1: הצגת המאמר המרכזי</w:t>
-      </w:r>
-      <w:r>
-        <w:rPr>
-          <w:rFonts w:ascii="David" w:cs="David" w:eastAsia="David" w:hAnsi="David"/>
-          <w:sz w:val="24"/>
-          <w:szCs w:val="24"/>
-          <w:rtl/>
-        </w:rPr>
-        <w:t xml:space="preserve">	5</w:t>
-      </w:r>
-    </w:p>
-    <w:p>
-      <w:pPr>
-        <w:tabs>
-          <w:tab w:val="left" w:pos="8800" w:leader="dot"/>
-        </w:tabs>
-        <w:bidi/>
-        <w:spacing w:after="0" w:line="480"/>
-        <w:jc w:val="right"/>
-      </w:pPr>
-      <w:r>
-        <w:rPr>
-          <w:rFonts w:ascii="David" w:cs="David" w:eastAsia="David" w:hAnsi="David"/>
-          <w:sz w:val="24"/>
-          <w:szCs w:val="24"/>
-          <w:rtl/>
-        </w:rPr>
-        <w:t xml:space="preserve">פרק 2: תמצית המאמר והנקודות המרכזיות</w:t>
-      </w:r>
-      <w:r>
-        <w:rPr>
-          <w:rFonts w:ascii="David" w:cs="David" w:eastAsia="David" w:hAnsi="David"/>
-          <w:sz w:val="24"/>
-          <w:szCs w:val="24"/>
-          <w:rtl/>
-        </w:rPr>
-        <w:t xml:space="preserve">	6</w:t>
-      </w:r>
-    </w:p>
-    <w:p>
-      <w:pPr>
-        <w:tabs>
-          <w:tab w:val="left" w:pos="8800" w:leader="dot"/>
-        </w:tabs>
-        <w:bidi/>
-        <w:spacing w:after="0" w:line="480"/>
-        <w:jc w:val="right"/>
-      </w:pPr>
-      <w:r>
-        <w:rPr>
-          <w:rFonts w:ascii="David" w:cs="David" w:eastAsia="David" w:hAnsi="David"/>
-          <w:sz w:val="24"/>
-          <w:szCs w:val="24"/>
-          <w:rtl/>
-        </w:rPr>
-        <w:t xml:space="preserve">פרק 3: ניתוח המאמר לפי מבנה, שיטה וממצאים</w:t>
-      </w:r>
-      <w:r>
-        <w:rPr>
-          <w:rFonts w:ascii="David" w:cs="David" w:eastAsia="David" w:hAnsi="David"/>
-          <w:sz w:val="24"/>
-          <w:szCs w:val="24"/>
-          <w:rtl/>
-        </w:rPr>
-        <w:t xml:space="preserve">	11</w:t>
-      </w:r>
-    </w:p>
-    <w:p>
-      <w:pPr>
-        <w:tabs>
-          <w:tab w:val="left" w:pos="8800" w:leader="dot"/>
-        </w:tabs>
-        <w:bidi/>
-        <w:spacing w:after="0" w:line="480"/>
-        <w:jc w:val="right"/>
-      </w:pPr>
-      <w:r>
-        <w:rPr>
-          <w:rFonts w:ascii="David" w:cs="David" w:eastAsia="David" w:hAnsi="David"/>
-          <w:sz w:val="24"/>
-          <w:szCs w:val="24"/>
-          <w:rtl/>
-        </w:rPr>
-        <w:t xml:space="preserve">פרק 4: המאמר המשלים</w:t>
-      </w:r>
-      <w:r>
-        <w:rPr>
-          <w:rFonts w:ascii="David" w:cs="David" w:eastAsia="David" w:hAnsi="David"/>
-          <w:sz w:val="24"/>
-          <w:szCs w:val="24"/>
-          <w:rtl/>
-        </w:rPr>
-        <w:t xml:space="preserve">	13</w:t>
-      </w:r>
-    </w:p>
-    <w:p>
-      <w:pPr>
-        <w:tabs>
-          <w:tab w:val="left" w:pos="8800" w:leader="dot"/>
-        </w:tabs>
-        <w:bidi/>
-        <w:spacing w:after="0" w:line="480"/>
-        <w:jc w:val="right"/>
-      </w:pPr>
-      <w:r>
-        <w:rPr>
-          <w:rFonts w:ascii="David" w:cs="David" w:eastAsia="David" w:hAnsi="David"/>
-          <w:sz w:val="24"/>
-          <w:szCs w:val="24"/>
-          <w:rtl/>
-        </w:rPr>
-        <w:t xml:space="preserve">פרק 5: תובנות, מסקנות ודעה אישית</w:t>
-      </w:r>
-      <w:r>
-        <w:rPr>
-          <w:rFonts w:ascii="David" w:cs="David" w:eastAsia="David" w:hAnsi="David"/>
-          <w:sz w:val="24"/>
-          <w:szCs w:val="24"/>
-          <w:rtl/>
-        </w:rPr>
-        <w:t xml:space="preserve">	14</w:t>
-      </w:r>
-    </w:p>
-    <w:p>
-      <w:pPr>
-        <w:tabs>
-          <w:tab w:val="left" w:pos="8800" w:leader="dot"/>
-        </w:tabs>
-        <w:bidi/>
-        <w:spacing w:after="0" w:line="480"/>
-        <w:jc w:val="right"/>
-      </w:pPr>
-      <w:r>
-        <w:rPr>
-          <w:rFonts w:ascii="David" w:cs="David" w:eastAsia="David" w:hAnsi="David"/>
-          <w:sz w:val="24"/>
-          <w:szCs w:val="24"/>
-          <w:rtl/>
-        </w:rPr>
-        <w:t xml:space="preserve">פרק 6: יישום מעשי בניהול קריירה</w:t>
-      </w:r>
-      <w:r>
-        <w:rPr>
-          <w:rFonts w:ascii="David" w:cs="David" w:eastAsia="David" w:hAnsi="David"/>
-          <w:sz w:val="24"/>
-          <w:szCs w:val="24"/>
-          <w:rtl/>
-        </w:rPr>
-        <w:t xml:space="preserve">	16</w:t>
-      </w:r>
-    </w:p>
-    <w:p>
-      <w:pPr>
-        <w:tabs>
-          <w:tab w:val="left" w:pos="8800" w:leader="dot"/>
-        </w:tabs>
-        <w:bidi/>
-        <w:spacing w:after="0" w:line="480"/>
-        <w:jc w:val="right"/>
-      </w:pPr>
-      <w:r>
-        <w:rPr>
-          <w:rFonts w:ascii="David" w:cs="David" w:eastAsia="David" w:hAnsi="David"/>
-          <w:sz w:val="24"/>
-          <w:szCs w:val="24"/>
-          <w:rtl/>
-        </w:rPr>
-        <w:t xml:space="preserve">סיכום ומסקנות</w:t>
-      </w:r>
-      <w:r>
-        <w:rPr>
-          <w:rFonts w:ascii="David" w:cs="David" w:eastAsia="David" w:hAnsi="David"/>
-          <w:sz w:val="24"/>
-          <w:szCs w:val="24"/>
-          <w:rtl/>
-        </w:rPr>
-        <w:t xml:space="preserve">	18</w:t>
-      </w:r>
-    </w:p>
-    <w:p>
-      <w:pPr>
-        <w:tabs>
-          <w:tab w:val="left" w:pos="8800" w:leader="dot"/>
-        </w:tabs>
-        <w:bidi/>
-        <w:spacing w:after="0" w:line="480"/>
-        <w:jc w:val="right"/>
-      </w:pPr>
-      <w:r>
-        <w:rPr>
-          <w:rFonts w:ascii="David" w:cs="David" w:eastAsia="David" w:hAnsi="David"/>
-          <w:sz w:val="24"/>
-          <w:szCs w:val="24"/>
-          <w:rtl/>
-        </w:rPr>
-        <w:t xml:space="preserve">נספח א: תכנון המצגת והאמצעים להמחשה</w:t>
-      </w:r>
-      <w:r>
-        <w:rPr>
-          <w:rFonts w:ascii="David" w:cs="David" w:eastAsia="David" w:hAnsi="David"/>
-          <w:sz w:val="24"/>
-          <w:szCs w:val="24"/>
-          <w:rtl/>
-        </w:rPr>
-        <w:t xml:space="preserve">	19</w:t>
-      </w:r>
-    </w:p>
-    <w:p>
-      <w:pPr>
-        <w:tabs>
-          <w:tab w:val="left" w:pos="8800" w:leader="dot"/>
-        </w:tabs>
-        <w:bidi/>
-        <w:spacing w:after="0" w:line="480"/>
-        <w:jc w:val="right"/>
-      </w:pPr>
-      <w:r>
-        <w:rPr>
-          <w:rFonts w:ascii="David" w:cs="David" w:eastAsia="David" w:hAnsi="David"/>
-          <w:sz w:val="24"/>
-          <w:szCs w:val="24"/>
-          <w:rtl/>
-        </w:rPr>
-        <w:t xml:space="preserve">נספח ב: שאלון קצר להערכה עצמית</w:t>
-      </w:r>
-      <w:r>
-        <w:rPr>
-          <w:rFonts w:ascii="David" w:cs="David" w:eastAsia="David" w:hAnsi="David"/>
-          <w:sz w:val="24"/>
-          <w:szCs w:val="24"/>
-          <w:rtl/>
-        </w:rPr>
-        <w:t xml:space="preserve">	20</w:t>
-      </w:r>
-    </w:p>
-    <w:p>
-      <w:pPr>
-        <w:tabs>
-          <w:tab w:val="left" w:pos="8800" w:leader="dot"/>
-        </w:tabs>
-        <w:bidi/>
-        <w:spacing w:after="0" w:line="480"/>
-        <w:jc w:val="right"/>
-      </w:pPr>
-      <w:r>
-        <w:rPr>
-          <w:rFonts w:ascii="David" w:cs="David" w:eastAsia="David" w:hAnsi="David"/>
-          <w:sz w:val="24"/>
-          <w:szCs w:val="24"/>
-          <w:rtl/>
-        </w:rPr>
-        <w:t xml:space="preserve">רשימת מקורות</w:t>
-      </w:r>
-      <w:r>
-        <w:rPr>
-          <w:rFonts w:ascii="David" w:cs="David" w:eastAsia="David" w:hAnsi="David"/>
-          <w:sz w:val="24"/>
-          <w:szCs w:val="24"/>
-          <w:rtl/>
-        </w:rPr>
-        <w:t xml:space="preserve">	21</w:t>
-      </w:r>
-    </w:p>
-    <w:p>
-      <w:pPr>
-        <w:bidi/>
-        <w:spacing w:after="120" w:before="240" w:line="276"/>
-        <w:jc w:val="right"/>
-      </w:pPr>
-      <w:r>
-        <w:rPr>
-          <w:rFonts w:ascii="David" w:cs="David" w:eastAsia="David" w:hAnsi="David"/>
-          <w:color w:val="595959"/>
-          <w:sz w:val="20"/>
-          <w:szCs w:val="20"/>
-          <w:rtl/>
-        </w:rPr>
-        <w:t xml:space="preserve">מספרי העמודים משוערים ויש לעדכנם לאחר מילוי פרטי המגישים.</w:t>
-      </w:r>
-    </w:p>
+    <w:sdt>
+      <w:sdtPr>
+        <w:alias w:val="תוכן העניינים"/>
+      </w:sdtPr>
+      <w:sdtContent>
+        <w:p>
+          <w:r>
+            <w:fldChar w:fldCharType="begin" w:dirty="true"/>
+            <w:instrText xml:space="preserve">TOC \h \o "1-2"</w:instrText>
+            <w:fldChar w:fldCharType="separate"/>
+          </w:r>
+        </w:p>
+        <w:p>
+          <w:pPr>
+            <w:pStyle w:val="TOC1"/>
+            <w:tabs>
+              <w:tab w:val="left" w:leader="dot" w:pos="8800"/>
+            </w:tabs>
+            <w:bidi/>
+            <w:spacing w:line="300" w:lineRule="auto" w:after="40"/>
+            <w:ind w:left="0" w:right="0"/>
+          </w:pPr>
+          <w:r>
+            <w:rPr>
+              <w:rFonts w:ascii="David" w:hAnsi="David" w:cs="David"/>
+              <w:sz w:val="24"/>
+              <w:szCs w:val="24"/>
+              <w:rtl/>
+            </w:rPr>
+            <w:t xml:space="preserve">מבוא</w:t>
+          </w:r>
+          <w:r>
+            <w:rPr>
+              <w:rFonts w:ascii="David" w:hAnsi="David" w:cs="David"/>
+              <w:sz w:val="24"/>
+              <w:szCs w:val="24"/>
+              <w:rtl/>
+            </w:rPr>
+            <w:tab/>
+            <w:t>3</w:t>
+          </w:r>
+        </w:p>
+        <w:p>
+          <w:pPr>
+            <w:pStyle w:val="TOC1"/>
+            <w:tabs>
+              <w:tab w:val="left" w:leader="dot" w:pos="8800"/>
+            </w:tabs>
+            <w:bidi/>
+            <w:spacing w:line="300" w:lineRule="auto" w:after="40"/>
+            <w:ind w:left="0" w:right="0"/>
+          </w:pPr>
+          <w:r>
+            <w:rPr>
+              <w:rFonts w:ascii="David" w:hAnsi="David" w:cs="David"/>
+              <w:sz w:val="24"/>
+              <w:szCs w:val="24"/>
+              <w:rtl/>
+            </w:rPr>
+            <w:t xml:space="preserve">פרק 1: הצגת המאמר המרכזי</w:t>
+          </w:r>
+          <w:r>
+            <w:rPr>
+              <w:rFonts w:ascii="David" w:hAnsi="David" w:cs="David"/>
+              <w:sz w:val="24"/>
+              <w:szCs w:val="24"/>
+              <w:rtl/>
+            </w:rPr>
+            <w:tab/>
+            <w:t>5</w:t>
+          </w:r>
+        </w:p>
+        <w:p>
+          <w:pPr>
+            <w:pStyle w:val="TOC2"/>
+            <w:tabs>
+              <w:tab w:val="left" w:leader="dot" w:pos="8800"/>
+            </w:tabs>
+            <w:bidi/>
+            <w:spacing w:line="300" w:lineRule="auto" w:after="40"/>
+            <w:ind w:left="0" w:right="400"/>
+          </w:pPr>
+          <w:r>
+            <w:rPr>
+              <w:rFonts w:ascii="David" w:hAnsi="David" w:cs="David"/>
+              <w:sz w:val="24"/>
+              <w:szCs w:val="24"/>
+              <w:rtl/>
+            </w:rPr>
+            <w:t xml:space="preserve">1.1 פרטי המאמר</w:t>
+          </w:r>
+          <w:r>
+            <w:rPr>
+              <w:rFonts w:ascii="David" w:hAnsi="David" w:cs="David"/>
+              <w:sz w:val="24"/>
+              <w:szCs w:val="24"/>
+              <w:rtl/>
+            </w:rPr>
+            <w:tab/>
+            <w:t>5</w:t>
+          </w:r>
+        </w:p>
+        <w:p>
+          <w:pPr>
+            <w:pStyle w:val="TOC2"/>
+            <w:tabs>
+              <w:tab w:val="left" w:leader="dot" w:pos="8800"/>
+            </w:tabs>
+            <w:bidi/>
+            <w:spacing w:line="300" w:lineRule="auto" w:after="40"/>
+            <w:ind w:left="0" w:right="400"/>
+          </w:pPr>
+          <w:r>
+            <w:rPr>
+              <w:rFonts w:ascii="David" w:hAnsi="David" w:cs="David"/>
+              <w:sz w:val="24"/>
+              <w:szCs w:val="24"/>
+              <w:rtl/>
+            </w:rPr>
+            <w:t xml:space="preserve">1.2 רקע ומטרות המאמר</w:t>
+          </w:r>
+          <w:r>
+            <w:rPr>
+              <w:rFonts w:ascii="David" w:hAnsi="David" w:cs="David"/>
+              <w:sz w:val="24"/>
+              <w:szCs w:val="24"/>
+              <w:rtl/>
+            </w:rPr>
+            <w:tab/>
+            <w:t>5</w:t>
+          </w:r>
+        </w:p>
+        <w:p>
+          <w:pPr>
+            <w:pStyle w:val="TOC1"/>
+            <w:tabs>
+              <w:tab w:val="left" w:leader="dot" w:pos="8800"/>
+            </w:tabs>
+            <w:bidi/>
+            <w:spacing w:line="300" w:lineRule="auto" w:after="40"/>
+            <w:ind w:left="0" w:right="0"/>
+          </w:pPr>
+          <w:r>
+            <w:rPr>
+              <w:rFonts w:ascii="David" w:hAnsi="David" w:cs="David"/>
+              <w:sz w:val="24"/>
+              <w:szCs w:val="24"/>
+              <w:rtl/>
+            </w:rPr>
+            <w:t xml:space="preserve">פרק 2: תמצית המאמר והנקודות המרכזיות</w:t>
+          </w:r>
+          <w:r>
+            <w:rPr>
+              <w:rFonts w:ascii="David" w:hAnsi="David" w:cs="David"/>
+              <w:sz w:val="24"/>
+              <w:szCs w:val="24"/>
+              <w:rtl/>
+            </w:rPr>
+            <w:tab/>
+            <w:t>7</w:t>
+          </w:r>
+        </w:p>
+        <w:p>
+          <w:pPr>
+            <w:pStyle w:val="TOC2"/>
+            <w:tabs>
+              <w:tab w:val="left" w:leader="dot" w:pos="8800"/>
+            </w:tabs>
+            <w:bidi/>
+            <w:spacing w:line="300" w:lineRule="auto" w:after="40"/>
+            <w:ind w:left="0" w:right="400"/>
+          </w:pPr>
+          <w:r>
+            <w:rPr>
+              <w:rFonts w:ascii="David" w:hAnsi="David" w:cs="David"/>
+              <w:sz w:val="24"/>
+              <w:szCs w:val="24"/>
+              <w:rtl/>
+            </w:rPr>
+            <w:t xml:space="preserve">2.1 הרקע התיאורטי: סלוטוגנזה ותחושת קוהרנטיות בעבודה</w:t>
+          </w:r>
+          <w:r>
+            <w:rPr>
+              <w:rFonts w:ascii="David" w:hAnsi="David" w:cs="David"/>
+              <w:sz w:val="24"/>
+              <w:szCs w:val="24"/>
+              <w:rtl/>
+            </w:rPr>
+            <w:tab/>
+            <w:t>7</w:t>
+          </w:r>
+        </w:p>
+        <w:p>
+          <w:pPr>
+            <w:pStyle w:val="TOC2"/>
+            <w:tabs>
+              <w:tab w:val="left" w:leader="dot" w:pos="8800"/>
+            </w:tabs>
+            <w:bidi/>
+            <w:spacing w:line="300" w:lineRule="auto" w:after="40"/>
+            <w:ind w:left="0" w:right="400"/>
+          </w:pPr>
+          <w:r>
+            <w:rPr>
+              <w:rFonts w:ascii="David" w:hAnsi="David" w:cs="David"/>
+              <w:sz w:val="24"/>
+              <w:szCs w:val="24"/>
+              <w:rtl/>
+            </w:rPr>
+            <w:t xml:space="preserve">2.2 עיצוב תפקיד מבוסס צרכים</w:t>
+          </w:r>
+          <w:r>
+            <w:rPr>
+              <w:rFonts w:ascii="David" w:hAnsi="David" w:cs="David"/>
+              <w:sz w:val="24"/>
+              <w:szCs w:val="24"/>
+              <w:rtl/>
+            </w:rPr>
+            <w:tab/>
+            <w:t>7</w:t>
+          </w:r>
+        </w:p>
+        <w:p>
+          <w:pPr>
+            <w:pStyle w:val="TOC2"/>
+            <w:tabs>
+              <w:tab w:val="left" w:leader="dot" w:pos="8800"/>
+            </w:tabs>
+            <w:bidi/>
+            <w:spacing w:line="300" w:lineRule="auto" w:after="40"/>
+            <w:ind w:left="0" w:right="400"/>
+          </w:pPr>
+          <w:r>
+            <w:rPr>
+              <w:rFonts w:ascii="David" w:hAnsi="David" w:cs="David"/>
+              <w:sz w:val="24"/>
+              <w:szCs w:val="24"/>
+              <w:rtl/>
+            </w:rPr>
+            <w:t xml:space="preserve">2.3 ההשערות: ספירלת רווח</w:t>
+          </w:r>
+          <w:r>
+            <w:rPr>
+              <w:rFonts w:ascii="David" w:hAnsi="David" w:cs="David"/>
+              <w:sz w:val="24"/>
+              <w:szCs w:val="24"/>
+              <w:rtl/>
+            </w:rPr>
+            <w:tab/>
+            <w:t>8</w:t>
+          </w:r>
+        </w:p>
+        <w:p>
+          <w:pPr>
+            <w:pStyle w:val="TOC2"/>
+            <w:tabs>
+              <w:tab w:val="left" w:leader="dot" w:pos="8800"/>
+            </w:tabs>
+            <w:bidi/>
+            <w:spacing w:line="300" w:lineRule="auto" w:after="40"/>
+            <w:ind w:left="0" w:right="400"/>
+          </w:pPr>
+          <w:r>
+            <w:rPr>
+              <w:rFonts w:ascii="David" w:hAnsi="David" w:cs="David"/>
+              <w:sz w:val="24"/>
+              <w:szCs w:val="24"/>
+              <w:rtl/>
+            </w:rPr>
+            <w:t xml:space="preserve">2.4 השיטה בקצרה</w:t>
+          </w:r>
+          <w:r>
+            <w:rPr>
+              <w:rFonts w:ascii="David" w:hAnsi="David" w:cs="David"/>
+              <w:sz w:val="24"/>
+              <w:szCs w:val="24"/>
+              <w:rtl/>
+            </w:rPr>
+            <w:tab/>
+            <w:t>8</w:t>
+          </w:r>
+        </w:p>
+        <w:p>
+          <w:pPr>
+            <w:pStyle w:val="TOC2"/>
+            <w:tabs>
+              <w:tab w:val="left" w:leader="dot" w:pos="8800"/>
+            </w:tabs>
+            <w:bidi/>
+            <w:spacing w:line="300" w:lineRule="auto" w:after="40"/>
+            <w:ind w:left="0" w:right="400"/>
+          </w:pPr>
+          <w:r>
+            <w:rPr>
+              <w:rFonts w:ascii="David" w:hAnsi="David" w:cs="David"/>
+              <w:sz w:val="24"/>
+              <w:szCs w:val="24"/>
+              <w:rtl/>
+            </w:rPr>
+            <w:t xml:space="preserve">2.5 הממצאים המרכזיים</w:t>
+          </w:r>
+          <w:r>
+            <w:rPr>
+              <w:rFonts w:ascii="David" w:hAnsi="David" w:cs="David"/>
+              <w:sz w:val="24"/>
+              <w:szCs w:val="24"/>
+              <w:rtl/>
+            </w:rPr>
+            <w:tab/>
+            <w:t>9</w:t>
+          </w:r>
+        </w:p>
+        <w:p>
+          <w:pPr>
+            <w:pStyle w:val="TOC2"/>
+            <w:tabs>
+              <w:tab w:val="left" w:leader="dot" w:pos="8800"/>
+            </w:tabs>
+            <w:bidi/>
+            <w:spacing w:line="300" w:lineRule="auto" w:after="40"/>
+            <w:ind w:left="0" w:right="400"/>
+          </w:pPr>
+          <w:r>
+            <w:rPr>
+              <w:rFonts w:ascii="David" w:hAnsi="David" w:cs="David"/>
+              <w:sz w:val="24"/>
+              <w:szCs w:val="24"/>
+              <w:rtl/>
+            </w:rPr>
+            <w:t xml:space="preserve">2.6 המסקנות</w:t>
+          </w:r>
+          <w:r>
+            <w:rPr>
+              <w:rFonts w:ascii="David" w:hAnsi="David" w:cs="David"/>
+              <w:sz w:val="24"/>
+              <w:szCs w:val="24"/>
+              <w:rtl/>
+            </w:rPr>
+            <w:tab/>
+            <w:t>9</w:t>
+          </w:r>
+        </w:p>
+        <w:p>
+          <w:pPr>
+            <w:pStyle w:val="TOC1"/>
+            <w:tabs>
+              <w:tab w:val="left" w:leader="dot" w:pos="8800"/>
+            </w:tabs>
+            <w:bidi/>
+            <w:spacing w:line="300" w:lineRule="auto" w:after="40"/>
+            <w:ind w:left="0" w:right="0"/>
+          </w:pPr>
+          <w:r>
+            <w:rPr>
+              <w:rFonts w:ascii="David" w:hAnsi="David" w:cs="David"/>
+              <w:sz w:val="24"/>
+              <w:szCs w:val="24"/>
+              <w:rtl/>
+            </w:rPr>
+            <w:t xml:space="preserve">פרק 3: ניתוח המאמר לפי מבנה, שיטה וממצאים</w:t>
+          </w:r>
+          <w:r>
+            <w:rPr>
+              <w:rFonts w:ascii="David" w:hAnsi="David" w:cs="David"/>
+              <w:sz w:val="24"/>
+              <w:szCs w:val="24"/>
+              <w:rtl/>
+            </w:rPr>
+            <w:tab/>
+            <w:t>11</w:t>
+          </w:r>
+        </w:p>
+        <w:p>
+          <w:pPr>
+            <w:pStyle w:val="TOC2"/>
+            <w:tabs>
+              <w:tab w:val="left" w:leader="dot" w:pos="8800"/>
+            </w:tabs>
+            <w:bidi/>
+            <w:spacing w:line="300" w:lineRule="auto" w:after="40"/>
+            <w:ind w:left="0" w:right="400"/>
+          </w:pPr>
+          <w:r>
+            <w:rPr>
+              <w:rFonts w:ascii="David" w:hAnsi="David" w:cs="David"/>
+              <w:sz w:val="24"/>
+              <w:szCs w:val="24"/>
+              <w:rtl/>
+            </w:rPr>
+            <w:t xml:space="preserve">3.1 מבנה המאמר</w:t>
+          </w:r>
+          <w:r>
+            <w:rPr>
+              <w:rFonts w:ascii="David" w:hAnsi="David" w:cs="David"/>
+              <w:sz w:val="24"/>
+              <w:szCs w:val="24"/>
+              <w:rtl/>
+            </w:rPr>
+            <w:tab/>
+            <w:t>11</w:t>
+          </w:r>
+        </w:p>
+        <w:p>
+          <w:pPr>
+            <w:pStyle w:val="TOC2"/>
+            <w:tabs>
+              <w:tab w:val="left" w:leader="dot" w:pos="8800"/>
+            </w:tabs>
+            <w:bidi/>
+            <w:spacing w:line="300" w:lineRule="auto" w:after="40"/>
+            <w:ind w:left="0" w:right="400"/>
+          </w:pPr>
+          <w:r>
+            <w:rPr>
+              <w:rFonts w:ascii="David" w:hAnsi="David" w:cs="David"/>
+              <w:sz w:val="24"/>
+              <w:szCs w:val="24"/>
+              <w:rtl/>
+            </w:rPr>
+            <w:t xml:space="preserve">3.2 השיטה</w:t>
+          </w:r>
+          <w:r>
+            <w:rPr>
+              <w:rFonts w:ascii="David" w:hAnsi="David" w:cs="David"/>
+              <w:sz w:val="24"/>
+              <w:szCs w:val="24"/>
+              <w:rtl/>
+            </w:rPr>
+            <w:tab/>
+            <w:t>11</w:t>
+          </w:r>
+        </w:p>
+        <w:p>
+          <w:pPr>
+            <w:pStyle w:val="TOC2"/>
+            <w:tabs>
+              <w:tab w:val="left" w:leader="dot" w:pos="8800"/>
+            </w:tabs>
+            <w:bidi/>
+            <w:spacing w:line="300" w:lineRule="auto" w:after="40"/>
+            <w:ind w:left="0" w:right="400"/>
+          </w:pPr>
+          <w:r>
+            <w:rPr>
+              <w:rFonts w:ascii="David" w:hAnsi="David" w:cs="David"/>
+              <w:sz w:val="24"/>
+              <w:szCs w:val="24"/>
+              <w:rtl/>
+            </w:rPr>
+            <w:t xml:space="preserve">3.3 הממצאים והמסקנות</w:t>
+          </w:r>
+          <w:r>
+            <w:rPr>
+              <w:rFonts w:ascii="David" w:hAnsi="David" w:cs="David"/>
+              <w:sz w:val="24"/>
+              <w:szCs w:val="24"/>
+              <w:rtl/>
+            </w:rPr>
+            <w:tab/>
+            <w:t>12</w:t>
+          </w:r>
+        </w:p>
+        <w:p>
+          <w:pPr>
+            <w:pStyle w:val="TOC1"/>
+            <w:tabs>
+              <w:tab w:val="left" w:leader="dot" w:pos="8800"/>
+            </w:tabs>
+            <w:bidi/>
+            <w:spacing w:line="300" w:lineRule="auto" w:after="40"/>
+            <w:ind w:left="0" w:right="0"/>
+          </w:pPr>
+          <w:r>
+            <w:rPr>
+              <w:rFonts w:ascii="David" w:hAnsi="David" w:cs="David"/>
+              <w:sz w:val="24"/>
+              <w:szCs w:val="24"/>
+              <w:rtl/>
+            </w:rPr>
+            <w:t xml:space="preserve">פרק 4: המאמר המשלים</w:t>
+          </w:r>
+          <w:r>
+            <w:rPr>
+              <w:rFonts w:ascii="David" w:hAnsi="David" w:cs="David"/>
+              <w:sz w:val="24"/>
+              <w:szCs w:val="24"/>
+              <w:rtl/>
+            </w:rPr>
+            <w:tab/>
+            <w:t>13</w:t>
+          </w:r>
+        </w:p>
+        <w:p>
+          <w:pPr>
+            <w:pStyle w:val="TOC2"/>
+            <w:tabs>
+              <w:tab w:val="left" w:leader="dot" w:pos="8800"/>
+            </w:tabs>
+            <w:bidi/>
+            <w:spacing w:line="300" w:lineRule="auto" w:after="40"/>
+            <w:ind w:left="0" w:right="400"/>
+          </w:pPr>
+          <w:r>
+            <w:rPr>
+              <w:rFonts w:ascii="David" w:hAnsi="David" w:cs="David"/>
+              <w:sz w:val="24"/>
+              <w:szCs w:val="24"/>
+              <w:rtl/>
+            </w:rPr>
+            <w:t xml:space="preserve">4.1 הצגת המאמר המשלים</w:t>
+          </w:r>
+          <w:r>
+            <w:rPr>
+              <w:rFonts w:ascii="David" w:hAnsi="David" w:cs="David"/>
+              <w:sz w:val="24"/>
+              <w:szCs w:val="24"/>
+              <w:rtl/>
+            </w:rPr>
+            <w:tab/>
+            <w:t>13</w:t>
+          </w:r>
+        </w:p>
+        <w:p>
+          <w:pPr>
+            <w:pStyle w:val="TOC2"/>
+            <w:tabs>
+              <w:tab w:val="left" w:leader="dot" w:pos="8800"/>
+            </w:tabs>
+            <w:bidi/>
+            <w:spacing w:line="300" w:lineRule="auto" w:after="40"/>
+            <w:ind w:left="0" w:right="400"/>
+          </w:pPr>
+          <w:r>
+            <w:rPr>
+              <w:rFonts w:ascii="David" w:hAnsi="David" w:cs="David"/>
+              <w:sz w:val="24"/>
+              <w:szCs w:val="24"/>
+              <w:rtl/>
+            </w:rPr>
+            <w:t xml:space="preserve">4.2 הקשר לנושא העבודה</w:t>
+          </w:r>
+          <w:r>
+            <w:rPr>
+              <w:rFonts w:ascii="David" w:hAnsi="David" w:cs="David"/>
+              <w:sz w:val="24"/>
+              <w:szCs w:val="24"/>
+              <w:rtl/>
+            </w:rPr>
+            <w:tab/>
+            <w:t>13</w:t>
+          </w:r>
+        </w:p>
+        <w:p>
+          <w:pPr>
+            <w:pStyle w:val="TOC1"/>
+            <w:tabs>
+              <w:tab w:val="left" w:leader="dot" w:pos="8800"/>
+            </w:tabs>
+            <w:bidi/>
+            <w:spacing w:line="300" w:lineRule="auto" w:after="40"/>
+            <w:ind w:left="0" w:right="0"/>
+          </w:pPr>
+          <w:r>
+            <w:rPr>
+              <w:rFonts w:ascii="David" w:hAnsi="David" w:cs="David"/>
+              <w:sz w:val="24"/>
+              <w:szCs w:val="24"/>
+              <w:rtl/>
+            </w:rPr>
+            <w:t xml:space="preserve">פרק 5: תובנות, מסקנות ודעה אישית</w:t>
+          </w:r>
+          <w:r>
+            <w:rPr>
+              <w:rFonts w:ascii="David" w:hAnsi="David" w:cs="David"/>
+              <w:sz w:val="24"/>
+              <w:szCs w:val="24"/>
+              <w:rtl/>
+            </w:rPr>
+            <w:tab/>
+            <w:t>14</w:t>
+          </w:r>
+        </w:p>
+        <w:p>
+          <w:pPr>
+            <w:pStyle w:val="TOC2"/>
+            <w:tabs>
+              <w:tab w:val="left" w:leader="dot" w:pos="8800"/>
+            </w:tabs>
+            <w:bidi/>
+            <w:spacing w:line="300" w:lineRule="auto" w:after="40"/>
+            <w:ind w:left="0" w:right="400"/>
+          </w:pPr>
+          <w:r>
+            <w:rPr>
+              <w:rFonts w:ascii="David" w:hAnsi="David" w:cs="David"/>
+              <w:sz w:val="24"/>
+              <w:szCs w:val="24"/>
+              <w:rtl/>
+            </w:rPr>
+            <w:t xml:space="preserve">5.1 תובנות מרכזיות</w:t>
+          </w:r>
+          <w:r>
+            <w:rPr>
+              <w:rFonts w:ascii="David" w:hAnsi="David" w:cs="David"/>
+              <w:sz w:val="24"/>
+              <w:szCs w:val="24"/>
+              <w:rtl/>
+            </w:rPr>
+            <w:tab/>
+            <w:t>14</w:t>
+          </w:r>
+        </w:p>
+        <w:p>
+          <w:pPr>
+            <w:pStyle w:val="TOC2"/>
+            <w:tabs>
+              <w:tab w:val="left" w:leader="dot" w:pos="8800"/>
+            </w:tabs>
+            <w:bidi/>
+            <w:spacing w:line="300" w:lineRule="auto" w:after="40"/>
+            <w:ind w:left="0" w:right="400"/>
+          </w:pPr>
+          <w:r>
+            <w:rPr>
+              <w:rFonts w:ascii="David" w:hAnsi="David" w:cs="David"/>
+              <w:sz w:val="24"/>
+              <w:szCs w:val="24"/>
+              <w:rtl/>
+            </w:rPr>
+            <w:t xml:space="preserve">5.2 מסקנות</w:t>
+          </w:r>
+          <w:r>
+            <w:rPr>
+              <w:rFonts w:ascii="David" w:hAnsi="David" w:cs="David"/>
+              <w:sz w:val="24"/>
+              <w:szCs w:val="24"/>
+              <w:rtl/>
+            </w:rPr>
+            <w:tab/>
+            <w:t>14</w:t>
+          </w:r>
+        </w:p>
+        <w:p>
+          <w:pPr>
+            <w:pStyle w:val="TOC2"/>
+            <w:tabs>
+              <w:tab w:val="left" w:leader="dot" w:pos="8800"/>
+            </w:tabs>
+            <w:bidi/>
+            <w:spacing w:line="300" w:lineRule="auto" w:after="40"/>
+            <w:ind w:left="0" w:right="400"/>
+          </w:pPr>
+          <w:r>
+            <w:rPr>
+              <w:rFonts w:ascii="David" w:hAnsi="David" w:cs="David"/>
+              <w:sz w:val="24"/>
+              <w:szCs w:val="24"/>
+              <w:rtl/>
+            </w:rPr>
+            <w:t xml:space="preserve">5.3 דעה אישית וביקורת</w:t>
+          </w:r>
+          <w:r>
+            <w:rPr>
+              <w:rFonts w:ascii="David" w:hAnsi="David" w:cs="David"/>
+              <w:sz w:val="24"/>
+              <w:szCs w:val="24"/>
+              <w:rtl/>
+            </w:rPr>
+            <w:tab/>
+            <w:t>15</w:t>
+          </w:r>
+        </w:p>
+        <w:p>
+          <w:pPr>
+            <w:pStyle w:val="TOC1"/>
+            <w:tabs>
+              <w:tab w:val="left" w:leader="dot" w:pos="8800"/>
+            </w:tabs>
+            <w:bidi/>
+            <w:spacing w:line="300" w:lineRule="auto" w:after="40"/>
+            <w:ind w:left="0" w:right="0"/>
+          </w:pPr>
+          <w:r>
+            <w:rPr>
+              <w:rFonts w:ascii="David" w:hAnsi="David" w:cs="David"/>
+              <w:sz w:val="24"/>
+              <w:szCs w:val="24"/>
+              <w:rtl/>
+            </w:rPr>
+            <w:t xml:space="preserve">פרק 6: יישום מעשי בניהול קריירה</w:t>
+          </w:r>
+          <w:r>
+            <w:rPr>
+              <w:rFonts w:ascii="David" w:hAnsi="David" w:cs="David"/>
+              <w:sz w:val="24"/>
+              <w:szCs w:val="24"/>
+              <w:rtl/>
+            </w:rPr>
+            <w:tab/>
+            <w:t>16</w:t>
+          </w:r>
+        </w:p>
+        <w:p>
+          <w:pPr>
+            <w:pStyle w:val="TOC2"/>
+            <w:tabs>
+              <w:tab w:val="left" w:leader="dot" w:pos="8800"/>
+            </w:tabs>
+            <w:bidi/>
+            <w:spacing w:line="300" w:lineRule="auto" w:after="40"/>
+            <w:ind w:left="0" w:right="400"/>
+          </w:pPr>
+          <w:r>
+            <w:rPr>
+              <w:rFonts w:ascii="David" w:hAnsi="David" w:cs="David"/>
+              <w:sz w:val="24"/>
+              <w:szCs w:val="24"/>
+              <w:rtl/>
+            </w:rPr>
+            <w:t xml:space="preserve">6.1 תוכנית עיצוב תפקיד אישית: כלי הנגזר מהמאמר</w:t>
+          </w:r>
+          <w:r>
+            <w:rPr>
+              <w:rFonts w:ascii="David" w:hAnsi="David" w:cs="David"/>
+              <w:sz w:val="24"/>
+              <w:szCs w:val="24"/>
+              <w:rtl/>
+            </w:rPr>
+            <w:tab/>
+            <w:t>16</w:t>
+          </w:r>
+        </w:p>
+        <w:p>
+          <w:pPr>
+            <w:pStyle w:val="TOC2"/>
+            <w:tabs>
+              <w:tab w:val="left" w:leader="dot" w:pos="8800"/>
+            </w:tabs>
+            <w:bidi/>
+            <w:spacing w:line="300" w:lineRule="auto" w:after="40"/>
+            <w:ind w:left="0" w:right="400"/>
+          </w:pPr>
+          <w:r>
+            <w:rPr>
+              <w:rFonts w:ascii="David" w:hAnsi="David" w:cs="David"/>
+              <w:sz w:val="24"/>
+              <w:szCs w:val="24"/>
+              <w:rtl/>
+            </w:rPr>
+            <w:t xml:space="preserve">6.2 קישור לכלים שנלמדו בקורס</w:t>
+          </w:r>
+          <w:r>
+            <w:rPr>
+              <w:rFonts w:ascii="David" w:hAnsi="David" w:cs="David"/>
+              <w:sz w:val="24"/>
+              <w:szCs w:val="24"/>
+              <w:rtl/>
+            </w:rPr>
+            <w:tab/>
+            <w:t>16</w:t>
+          </w:r>
+        </w:p>
+        <w:p>
+          <w:pPr>
+            <w:pStyle w:val="TOC2"/>
+            <w:tabs>
+              <w:tab w:val="left" w:leader="dot" w:pos="8800"/>
+            </w:tabs>
+            <w:bidi/>
+            <w:spacing w:line="300" w:lineRule="auto" w:after="40"/>
+            <w:ind w:left="0" w:right="400"/>
+          </w:pPr>
+          <w:r>
+            <w:rPr>
+              <w:rFonts w:ascii="David" w:hAnsi="David" w:cs="David"/>
+              <w:sz w:val="24"/>
+              <w:szCs w:val="24"/>
+              <w:rtl/>
+            </w:rPr>
+            <w:t xml:space="preserve">6.3 השלכות למנהלים בכיתה</w:t>
+          </w:r>
+          <w:r>
+            <w:rPr>
+              <w:rFonts w:ascii="David" w:hAnsi="David" w:cs="David"/>
+              <w:sz w:val="24"/>
+              <w:szCs w:val="24"/>
+              <w:rtl/>
+            </w:rPr>
+            <w:tab/>
+            <w:t>17</w:t>
+          </w:r>
+        </w:p>
+        <w:p>
+          <w:pPr>
+            <w:pStyle w:val="TOC2"/>
+            <w:tabs>
+              <w:tab w:val="left" w:leader="dot" w:pos="8800"/>
+            </w:tabs>
+            <w:bidi/>
+            <w:spacing w:line="300" w:lineRule="auto" w:after="40"/>
+            <w:ind w:left="0" w:right="400"/>
+          </w:pPr>
+          <w:r>
+            <w:rPr>
+              <w:rFonts w:ascii="David" w:hAnsi="David" w:cs="David"/>
+              <w:sz w:val="24"/>
+              <w:szCs w:val="24"/>
+              <w:rtl/>
+            </w:rPr>
+            <w:t xml:space="preserve">6.4 האמצעים להמחשה ולהפעלה במצגת</w:t>
+          </w:r>
+          <w:r>
+            <w:rPr>
+              <w:rFonts w:ascii="David" w:hAnsi="David" w:cs="David"/>
+              <w:sz w:val="24"/>
+              <w:szCs w:val="24"/>
+              <w:rtl/>
+            </w:rPr>
+            <w:tab/>
+            <w:t>17</w:t>
+          </w:r>
+        </w:p>
+        <w:p>
+          <w:pPr>
+            <w:pStyle w:val="TOC1"/>
+            <w:tabs>
+              <w:tab w:val="left" w:leader="dot" w:pos="8800"/>
+            </w:tabs>
+            <w:bidi/>
+            <w:spacing w:line="300" w:lineRule="auto" w:after="40"/>
+            <w:ind w:left="0" w:right="0"/>
+          </w:pPr>
+          <w:r>
+            <w:rPr>
+              <w:rFonts w:ascii="David" w:hAnsi="David" w:cs="David"/>
+              <w:sz w:val="24"/>
+              <w:szCs w:val="24"/>
+              <w:rtl/>
+            </w:rPr>
+            <w:t xml:space="preserve">סיכום ומסקנות</w:t>
+          </w:r>
+          <w:r>
+            <w:rPr>
+              <w:rFonts w:ascii="David" w:hAnsi="David" w:cs="David"/>
+              <w:sz w:val="24"/>
+              <w:szCs w:val="24"/>
+              <w:rtl/>
+            </w:rPr>
+            <w:tab/>
+            <w:t>18</w:t>
+          </w:r>
+        </w:p>
+        <w:p>
+          <w:pPr>
+            <w:pStyle w:val="TOC1"/>
+            <w:tabs>
+              <w:tab w:val="left" w:leader="dot" w:pos="8800"/>
+            </w:tabs>
+            <w:bidi/>
+            <w:spacing w:line="300" w:lineRule="auto" w:after="40"/>
+            <w:ind w:left="0" w:right="0"/>
+          </w:pPr>
+          <w:r>
+            <w:rPr>
+              <w:rFonts w:ascii="David" w:hAnsi="David" w:cs="David"/>
+              <w:sz w:val="24"/>
+              <w:szCs w:val="24"/>
+              <w:rtl/>
+            </w:rPr>
+            <w:t xml:space="preserve">נספח א: תכנון המצגת והאמצעים להמחשה</w:t>
+          </w:r>
+          <w:r>
+            <w:rPr>
+              <w:rFonts w:ascii="David" w:hAnsi="David" w:cs="David"/>
+              <w:sz w:val="24"/>
+              <w:szCs w:val="24"/>
+              <w:rtl/>
+            </w:rPr>
+            <w:tab/>
+            <w:t>19</w:t>
+          </w:r>
+        </w:p>
+        <w:p>
+          <w:pPr>
+            <w:pStyle w:val="TOC2"/>
+            <w:tabs>
+              <w:tab w:val="left" w:leader="dot" w:pos="8800"/>
+            </w:tabs>
+            <w:bidi/>
+            <w:spacing w:line="300" w:lineRule="auto" w:after="40"/>
+            <w:ind w:left="0" w:right="400"/>
+          </w:pPr>
+          <w:r>
+            <w:rPr>
+              <w:rFonts w:ascii="David" w:hAnsi="David" w:cs="David"/>
+              <w:sz w:val="24"/>
+              <w:szCs w:val="24"/>
+              <w:rtl/>
+            </w:rPr>
+            <w:t xml:space="preserve">כרטיסיות ההפעלה</w:t>
+          </w:r>
+          <w:r>
+            <w:rPr>
+              <w:rFonts w:ascii="David" w:hAnsi="David" w:cs="David"/>
+              <w:sz w:val="24"/>
+              <w:szCs w:val="24"/>
+              <w:rtl/>
+            </w:rPr>
+            <w:tab/>
+            <w:t>19</w:t>
+          </w:r>
+        </w:p>
+        <w:p>
+          <w:pPr>
+            <w:pStyle w:val="TOC1"/>
+            <w:tabs>
+              <w:tab w:val="left" w:leader="dot" w:pos="8800"/>
+            </w:tabs>
+            <w:bidi/>
+            <w:spacing w:line="300" w:lineRule="auto" w:after="40"/>
+            <w:ind w:left="0" w:right="0"/>
+          </w:pPr>
+          <w:r>
+            <w:rPr>
+              <w:rFonts w:ascii="David" w:hAnsi="David" w:cs="David"/>
+              <w:sz w:val="24"/>
+              <w:szCs w:val="24"/>
+              <w:rtl/>
+            </w:rPr>
+            <w:t xml:space="preserve">נספח ב: שאלון קצר להערכה עצמית</w:t>
+          </w:r>
+          <w:r>
+            <w:rPr>
+              <w:rFonts w:ascii="David" w:hAnsi="David" w:cs="David"/>
+              <w:sz w:val="24"/>
+              <w:szCs w:val="24"/>
+              <w:rtl/>
+            </w:rPr>
+            <w:tab/>
+            <w:t>20</w:t>
+          </w:r>
+        </w:p>
+        <w:p>
+          <w:pPr>
+            <w:pStyle w:val="TOC1"/>
+            <w:tabs>
+              <w:tab w:val="left" w:leader="dot" w:pos="8800"/>
+            </w:tabs>
+            <w:bidi/>
+            <w:spacing w:line="300" w:lineRule="auto" w:after="40"/>
+            <w:ind w:left="0" w:right="0"/>
+          </w:pPr>
+          <w:r>
+            <w:rPr>
+              <w:rFonts w:ascii="David" w:hAnsi="David" w:cs="David"/>
+              <w:sz w:val="24"/>
+              <w:szCs w:val="24"/>
+              <w:rtl/>
+            </w:rPr>
+            <w:t xml:space="preserve">רשימת מקורות</w:t>
+          </w:r>
+          <w:r>
+            <w:rPr>
+              <w:rFonts w:ascii="David" w:hAnsi="David" w:cs="David"/>
+              <w:sz w:val="24"/>
+              <w:szCs w:val="24"/>
+              <w:rtl/>
+            </w:rPr>
+            <w:tab/>
+            <w:t>21</w:t>
+          </w:r>
+        </w:p>
+        <w:p>
+          <w:r>
+            <w:fldChar w:fldCharType="end"/>
+          </w:r>
+        </w:p>
+      </w:sdtContent>
+    </w:sdt>
     <w:p>
       <w:r>
         <w:br w:type="page"/>
@@ -923,11 +1570,8 @@
     <w:p>
       <w:pPr>
         <w:pStyle w:val="Heading1"/>
-        <w:pBdr>
-          <w:bottom w:val="single" w:color="0E6E73" w:sz="12" w:space="4"/>
-        </w:pBdr>
-        <w:bidi/>
-        <w:spacing w:after="280" w:before="240" w:line="480"/>
+        <w:bidi/>
+        <w:spacing w:after="240" w:before="240" w:line="480"/>
         <w:jc w:val="right"/>
       </w:pPr>
       <w:r>
@@ -935,9 +1579,9 @@
           <w:rFonts w:ascii="David" w:cs="David" w:eastAsia="David" w:hAnsi="David"/>
           <w:b/>
           <w:bCs/>
-          <w:color w:val="1F3864"/>
-          <w:sz w:val="34"/>
-          <w:szCs w:val="34"/>
+          <w:color w:val="000000"/>
+          <w:sz w:val="32"/>
+          <w:szCs w:val="32"/>
           <w:rtl/>
         </w:rPr>
         <w:t xml:space="preserve">מבוא</w:t>
@@ -1134,11 +1778,8 @@
     <w:p>
       <w:pPr>
         <w:pStyle w:val="Heading1"/>
-        <w:pBdr>
-          <w:bottom w:val="single" w:color="0E6E73" w:sz="12" w:space="4"/>
-        </w:pBdr>
-        <w:bidi/>
-        <w:spacing w:after="280" w:before="240" w:line="480"/>
+        <w:bidi/>
+        <w:spacing w:after="240" w:before="240" w:line="480"/>
         <w:jc w:val="right"/>
       </w:pPr>
       <w:r>
@@ -1146,9 +1787,9 @@
           <w:rFonts w:ascii="David" w:cs="David" w:eastAsia="David" w:hAnsi="David"/>
           <w:b/>
           <w:bCs/>
-          <w:color w:val="1F3864"/>
-          <w:sz w:val="34"/>
-          <w:szCs w:val="34"/>
+          <w:color w:val="000000"/>
+          <w:sz w:val="32"/>
+          <w:szCs w:val="32"/>
           <w:rtl/>
         </w:rPr>
         <w:t xml:space="preserve">פרק 1: הצגת המאמר המרכזי</w:t>
@@ -1166,7 +1807,7 @@
           <w:rFonts w:ascii="David" w:cs="David" w:eastAsia="David" w:hAnsi="David"/>
           <w:b/>
           <w:bCs/>
-          <w:color w:val="0E6E73"/>
+          <w:color w:val="000000"/>
           <w:sz w:val="28"/>
           <w:szCs w:val="28"/>
           <w:rtl/>
@@ -1204,7 +1845,6 @@
               <w:bottom w:val="single" w:color="A6A6A6" w:sz="6"/>
               <w:right w:val="single" w:color="A6A6A6" w:sz="6"/>
             </w:tcBorders>
-            <w:shd w:fill="D9E2F3" w:color="auto" w:val="clear"/>
             <w:tcMar>
               <w:top w:type="dxa" w:w="80"/>
               <w:left w:type="dxa" w:w="100"/>
@@ -1224,7 +1864,6 @@
                 <w:rFonts w:ascii="David" w:cs="David" w:eastAsia="David" w:hAnsi="David"/>
                 <w:b/>
                 <w:bCs/>
-                <w:color w:val="1F3864"/>
                 <w:sz w:val="22"/>
                 <w:szCs w:val="22"/>
                 <w:rtl/>
@@ -1242,7 +1881,6 @@
               <w:bottom w:val="single" w:color="A6A6A6" w:sz="6"/>
               <w:right w:val="single" w:color="A6A6A6" w:sz="6"/>
             </w:tcBorders>
-            <w:shd w:fill="D9E2F3" w:color="auto" w:val="clear"/>
             <w:tcMar>
               <w:top w:type="dxa" w:w="80"/>
               <w:left w:type="dxa" w:w="100"/>
@@ -1262,7 +1900,6 @@
                 <w:rFonts w:ascii="David" w:cs="David" w:eastAsia="David" w:hAnsi="David"/>
                 <w:b/>
                 <w:bCs/>
-                <w:color w:val="1F3864"/>
                 <w:sz w:val="22"/>
                 <w:szCs w:val="22"/>
                 <w:rtl/>
@@ -1351,7 +1988,6 @@
               <w:bottom w:val="single" w:color="A6A6A6" w:sz="6"/>
               <w:right w:val="single" w:color="A6A6A6" w:sz="6"/>
             </w:tcBorders>
-            <w:shd w:fill="F5F7FA" w:color="auto" w:val="clear"/>
             <w:tcMar>
               <w:top w:type="dxa" w:w="80"/>
               <w:left w:type="dxa" w:w="100"/>
@@ -1386,7 +2022,6 @@
               <w:bottom w:val="single" w:color="A6A6A6" w:sz="6"/>
               <w:right w:val="single" w:color="A6A6A6" w:sz="6"/>
             </w:tcBorders>
-            <w:shd w:fill="F5F7FA" w:color="auto" w:val="clear"/>
             <w:tcMar>
               <w:top w:type="dxa" w:w="80"/>
               <w:left w:type="dxa" w:w="100"/>
@@ -1509,7 +2144,6 @@
               <w:bottom w:val="single" w:color="A6A6A6" w:sz="6"/>
               <w:right w:val="single" w:color="A6A6A6" w:sz="6"/>
             </w:tcBorders>
-            <w:shd w:fill="F5F7FA" w:color="auto" w:val="clear"/>
             <w:tcMar>
               <w:top w:type="dxa" w:w="80"/>
               <w:left w:type="dxa" w:w="100"/>
@@ -1544,7 +2178,6 @@
               <w:bottom w:val="single" w:color="A6A6A6" w:sz="6"/>
               <w:right w:val="single" w:color="A6A6A6" w:sz="6"/>
             </w:tcBorders>
-            <w:shd w:fill="F5F7FA" w:color="auto" w:val="clear"/>
             <w:tcMar>
               <w:top w:type="dxa" w:w="80"/>
               <w:left w:type="dxa" w:w="100"/>
@@ -1668,7 +2301,6 @@
               <w:bottom w:val="single" w:color="A6A6A6" w:sz="6"/>
               <w:right w:val="single" w:color="A6A6A6" w:sz="6"/>
             </w:tcBorders>
-            <w:shd w:fill="F5F7FA" w:color="auto" w:val="clear"/>
             <w:tcMar>
               <w:top w:type="dxa" w:w="80"/>
               <w:left w:type="dxa" w:w="100"/>
@@ -1703,7 +2335,6 @@
               <w:bottom w:val="single" w:color="A6A6A6" w:sz="6"/>
               <w:right w:val="single" w:color="A6A6A6" w:sz="6"/>
             </w:tcBorders>
-            <w:shd w:fill="F5F7FA" w:color="auto" w:val="clear"/>
             <w:tcMar>
               <w:top w:type="dxa" w:w="80"/>
               <w:left w:type="dxa" w:w="100"/>
@@ -1843,7 +2474,7 @@
           <w:rFonts w:ascii="David" w:cs="David" w:eastAsia="David" w:hAnsi="David"/>
           <w:b/>
           <w:bCs/>
-          <w:color w:val="0E6E73"/>
+          <w:color w:val="000000"/>
           <w:sz w:val="28"/>
           <w:szCs w:val="28"/>
           <w:rtl/>
@@ -1942,11 +2573,8 @@
     <w:p>
       <w:pPr>
         <w:pStyle w:val="Heading1"/>
-        <w:pBdr>
-          <w:bottom w:val="single" w:color="0E6E73" w:sz="12" w:space="4"/>
-        </w:pBdr>
-        <w:bidi/>
-        <w:spacing w:after="280" w:before="240" w:line="480"/>
+        <w:bidi/>
+        <w:spacing w:after="240" w:before="240" w:line="480"/>
         <w:jc w:val="right"/>
       </w:pPr>
       <w:r>
@@ -1954,9 +2582,9 @@
           <w:rFonts w:ascii="David" w:cs="David" w:eastAsia="David" w:hAnsi="David"/>
           <w:b/>
           <w:bCs/>
-          <w:color w:val="1F3864"/>
-          <w:sz w:val="34"/>
-          <w:szCs w:val="34"/>
+          <w:color w:val="000000"/>
+          <w:sz w:val="32"/>
+          <w:szCs w:val="32"/>
           <w:rtl/>
         </w:rPr>
         <w:t xml:space="preserve">פרק 2: תמצית המאמר והנקודות המרכזיות</w:t>
@@ -1974,7 +2602,7 @@
           <w:rFonts w:ascii="David" w:cs="David" w:eastAsia="David" w:hAnsi="David"/>
           <w:b/>
           <w:bCs/>
-          <w:color w:val="0E6E73"/>
+          <w:color w:val="000000"/>
           <w:sz w:val="28"/>
           <w:szCs w:val="28"/>
           <w:rtl/>
@@ -2077,7 +2705,7 @@
           <w:rFonts w:ascii="David" w:cs="David" w:eastAsia="David" w:hAnsi="David"/>
           <w:b/>
           <w:bCs/>
-          <w:color w:val="0E6E73"/>
+          <w:color w:val="000000"/>
           <w:sz w:val="28"/>
           <w:szCs w:val="28"/>
           <w:rtl/>
@@ -2300,7 +2928,7 @@
           <w:rFonts w:ascii="David" w:cs="David" w:eastAsia="David" w:hAnsi="David"/>
           <w:b/>
           <w:bCs/>
-          <w:color w:val="0E6E73"/>
+          <w:color w:val="000000"/>
           <w:sz w:val="28"/>
           <w:szCs w:val="28"/>
           <w:rtl/>
@@ -2387,7 +3015,7 @@
           <w:rFonts w:ascii="David" w:cs="David" w:eastAsia="David" w:hAnsi="David"/>
           <w:b/>
           <w:bCs/>
-          <w:color w:val="0E6E73"/>
+          <w:color w:val="000000"/>
           <w:sz w:val="28"/>
           <w:szCs w:val="28"/>
           <w:rtl/>
@@ -2524,7 +3152,7 @@
           <w:rFonts w:ascii="David" w:cs="David" w:eastAsia="David" w:hAnsi="David"/>
           <w:b/>
           <w:bCs/>
-          <w:color w:val="0E6E73"/>
+          <w:color w:val="000000"/>
           <w:sz w:val="28"/>
           <w:szCs w:val="28"/>
           <w:rtl/>
@@ -2614,7 +3242,6 @@
               <w:bottom w:val="single" w:color="A6A6A6" w:sz="6"/>
               <w:right w:val="single" w:color="A6A6A6" w:sz="6"/>
             </w:tcBorders>
-            <w:shd w:fill="D9E2F3" w:color="auto" w:val="clear"/>
             <w:tcMar>
               <w:top w:type="dxa" w:w="80"/>
               <w:left w:type="dxa" w:w="100"/>
@@ -2634,7 +3261,6 @@
                 <w:rFonts w:ascii="David" w:cs="David" w:eastAsia="David" w:hAnsi="David"/>
                 <w:b/>
                 <w:bCs/>
-                <w:color w:val="1F3864"/>
                 <w:sz w:val="22"/>
                 <w:szCs w:val="22"/>
                 <w:rtl/>
@@ -2652,7 +3278,6 @@
               <w:bottom w:val="single" w:color="A6A6A6" w:sz="6"/>
               <w:right w:val="single" w:color="A6A6A6" w:sz="6"/>
             </w:tcBorders>
-            <w:shd w:fill="D9E2F3" w:color="auto" w:val="clear"/>
             <w:tcMar>
               <w:top w:type="dxa" w:w="80"/>
               <w:left w:type="dxa" w:w="100"/>
@@ -2672,7 +3297,6 @@
                 <w:rFonts w:ascii="David" w:cs="David" w:eastAsia="David" w:hAnsi="David"/>
                 <w:b/>
                 <w:bCs/>
-                <w:color w:val="1F3864"/>
                 <w:sz w:val="22"/>
                 <w:szCs w:val="22"/>
                 <w:rtl/>
@@ -2690,7 +3314,6 @@
               <w:bottom w:val="single" w:color="A6A6A6" w:sz="6"/>
               <w:right w:val="single" w:color="A6A6A6" w:sz="6"/>
             </w:tcBorders>
-            <w:shd w:fill="D9E2F3" w:color="auto" w:val="clear"/>
             <w:tcMar>
               <w:top w:type="dxa" w:w="80"/>
               <w:left w:type="dxa" w:w="100"/>
@@ -2710,7 +3333,6 @@
                 <w:rFonts w:ascii="David" w:cs="David" w:eastAsia="David" w:hAnsi="David"/>
                 <w:b/>
                 <w:bCs/>
-                <w:color w:val="1F3864"/>
                 <w:sz w:val="22"/>
                 <w:szCs w:val="22"/>
                 <w:rtl/>
@@ -2833,7 +3455,6 @@
               <w:bottom w:val="single" w:color="A6A6A6" w:sz="6"/>
               <w:right w:val="single" w:color="A6A6A6" w:sz="6"/>
             </w:tcBorders>
-            <w:shd w:fill="F5F7FA" w:color="auto" w:val="clear"/>
             <w:tcMar>
               <w:top w:type="dxa" w:w="80"/>
               <w:left w:type="dxa" w:w="100"/>
@@ -2868,7 +3489,6 @@
               <w:bottom w:val="single" w:color="A6A6A6" w:sz="6"/>
               <w:right w:val="single" w:color="A6A6A6" w:sz="6"/>
             </w:tcBorders>
-            <w:shd w:fill="F5F7FA" w:color="auto" w:val="clear"/>
             <w:tcMar>
               <w:top w:type="dxa" w:w="80"/>
               <w:left w:type="dxa" w:w="100"/>
@@ -2903,7 +3523,6 @@
               <w:bottom w:val="single" w:color="A6A6A6" w:sz="6"/>
               <w:right w:val="single" w:color="A6A6A6" w:sz="6"/>
             </w:tcBorders>
-            <w:shd w:fill="F5F7FA" w:color="auto" w:val="clear"/>
             <w:tcMar>
               <w:top w:type="dxa" w:w="80"/>
               <w:left w:type="dxa" w:w="100"/>
@@ -3042,7 +3661,6 @@
               <w:bottom w:val="single" w:color="A6A6A6" w:sz="6"/>
               <w:right w:val="single" w:color="A6A6A6" w:sz="6"/>
             </w:tcBorders>
-            <w:shd w:fill="F5F7FA" w:color="auto" w:val="clear"/>
             <w:tcMar>
               <w:top w:type="dxa" w:w="80"/>
               <w:left w:type="dxa" w:w="100"/>
@@ -3077,7 +3695,6 @@
               <w:bottom w:val="single" w:color="A6A6A6" w:sz="6"/>
               <w:right w:val="single" w:color="A6A6A6" w:sz="6"/>
             </w:tcBorders>
-            <w:shd w:fill="F5F7FA" w:color="auto" w:val="clear"/>
             <w:tcMar>
               <w:top w:type="dxa" w:w="80"/>
               <w:left w:type="dxa" w:w="100"/>
@@ -3112,7 +3729,6 @@
               <w:bottom w:val="single" w:color="A6A6A6" w:sz="6"/>
               <w:right w:val="single" w:color="A6A6A6" w:sz="6"/>
             </w:tcBorders>
-            <w:shd w:fill="F5F7FA" w:color="auto" w:val="clear"/>
             <w:tcMar>
               <w:top w:type="dxa" w:w="80"/>
               <w:left w:type="dxa" w:w="100"/>
@@ -3252,7 +3868,6 @@
               <w:bottom w:val="single" w:color="A6A6A6" w:sz="6"/>
               <w:right w:val="single" w:color="A6A6A6" w:sz="6"/>
             </w:tcBorders>
-            <w:shd w:fill="F5F7FA" w:color="auto" w:val="clear"/>
             <w:tcMar>
               <w:top w:type="dxa" w:w="80"/>
               <w:left w:type="dxa" w:w="100"/>
@@ -3287,7 +3902,6 @@
               <w:bottom w:val="single" w:color="A6A6A6" w:sz="6"/>
               <w:right w:val="single" w:color="A6A6A6" w:sz="6"/>
             </w:tcBorders>
-            <w:shd w:fill="F5F7FA" w:color="auto" w:val="clear"/>
             <w:tcMar>
               <w:top w:type="dxa" w:w="80"/>
               <w:left w:type="dxa" w:w="100"/>
@@ -3322,7 +3936,6 @@
               <w:bottom w:val="single" w:color="A6A6A6" w:sz="6"/>
               <w:right w:val="single" w:color="A6A6A6" w:sz="6"/>
             </w:tcBorders>
-            <w:shd w:fill="F5F7FA" w:color="auto" w:val="clear"/>
             <w:tcMar>
               <w:top w:type="dxa" w:w="80"/>
               <w:left w:type="dxa" w:w="100"/>
@@ -3470,7 +4083,6 @@
               <w:bottom w:val="single" w:color="A6A6A6" w:sz="6"/>
               <w:right w:val="single" w:color="A6A6A6" w:sz="6"/>
             </w:tcBorders>
-            <w:shd w:fill="F5F7FA" w:color="auto" w:val="clear"/>
             <w:tcMar>
               <w:top w:type="dxa" w:w="80"/>
               <w:left w:type="dxa" w:w="100"/>
@@ -3505,7 +4117,6 @@
               <w:bottom w:val="single" w:color="A6A6A6" w:sz="6"/>
               <w:right w:val="single" w:color="A6A6A6" w:sz="6"/>
             </w:tcBorders>
-            <w:shd w:fill="F5F7FA" w:color="auto" w:val="clear"/>
             <w:tcMar>
               <w:top w:type="dxa" w:w="80"/>
               <w:left w:type="dxa" w:w="100"/>
@@ -3540,7 +4151,6 @@
               <w:bottom w:val="single" w:color="A6A6A6" w:sz="6"/>
               <w:right w:val="single" w:color="A6A6A6" w:sz="6"/>
             </w:tcBorders>
-            <w:shd w:fill="F5F7FA" w:color="auto" w:val="clear"/>
             <w:tcMar>
               <w:top w:type="dxa" w:w="80"/>
               <w:left w:type="dxa" w:w="100"/>
@@ -3577,7 +4187,7 @@
       <w:r>
         <w:rPr>
           <w:rFonts w:ascii="David" w:cs="David" w:eastAsia="David" w:hAnsi="David"/>
-          <w:color w:val="595959"/>
+          <w:color w:val="000000"/>
           <w:sz w:val="20"/>
           <w:szCs w:val="20"/>
           <w:rtl/>
@@ -3587,7 +4197,7 @@
       <w:r>
         <w:rPr>
           <w:rFonts w:ascii="Times New Roman" w:cs="Times New Roman" w:eastAsia="Times New Roman" w:hAnsi="Times New Roman"/>
-          <w:color w:val="595959"/>
+          <w:color w:val="000000"/>
           <w:sz w:val="20"/>
           <w:szCs w:val="20"/>
         </w:rPr>
@@ -3596,7 +4206,7 @@
       <w:r>
         <w:rPr>
           <w:rFonts w:ascii="David" w:cs="David" w:eastAsia="David" w:hAnsi="David"/>
-          <w:color w:val="595959"/>
+          <w:color w:val="000000"/>
           <w:sz w:val="20"/>
           <w:szCs w:val="20"/>
           <w:rtl/>
@@ -3616,7 +4226,7 @@
           <w:rFonts w:ascii="David" w:cs="David" w:eastAsia="David" w:hAnsi="David"/>
           <w:b/>
           <w:bCs/>
-          <w:color w:val="0E6E73"/>
+          <w:color w:val="000000"/>
           <w:sz w:val="28"/>
           <w:szCs w:val="28"/>
           <w:rtl/>
@@ -3665,11 +4275,8 @@
     <w:p>
       <w:pPr>
         <w:pStyle w:val="Heading1"/>
-        <w:pBdr>
-          <w:bottom w:val="single" w:color="0E6E73" w:sz="12" w:space="4"/>
-        </w:pBdr>
-        <w:bidi/>
-        <w:spacing w:after="280" w:before="240" w:line="480"/>
+        <w:bidi/>
+        <w:spacing w:after="240" w:before="240" w:line="480"/>
         <w:jc w:val="right"/>
       </w:pPr>
       <w:r>
@@ -3677,9 +4284,9 @@
           <w:rFonts w:ascii="David" w:cs="David" w:eastAsia="David" w:hAnsi="David"/>
           <w:b/>
           <w:bCs/>
-          <w:color w:val="1F3864"/>
-          <w:sz w:val="34"/>
-          <w:szCs w:val="34"/>
+          <w:color w:val="000000"/>
+          <w:sz w:val="32"/>
+          <w:szCs w:val="32"/>
           <w:rtl/>
         </w:rPr>
         <w:t xml:space="preserve">פרק 3: ניתוח המאמר לפי מבנה, שיטה וממצאים</w:t>
@@ -3697,7 +4304,7 @@
           <w:rFonts w:ascii="David" w:cs="David" w:eastAsia="David" w:hAnsi="David"/>
           <w:b/>
           <w:bCs/>
-          <w:color w:val="0E6E73"/>
+          <w:color w:val="000000"/>
           <w:sz w:val="28"/>
           <w:szCs w:val="28"/>
           <w:rtl/>
@@ -3787,7 +4394,6 @@
               <w:bottom w:val="single" w:color="A6A6A6" w:sz="6"/>
               <w:right w:val="single" w:color="A6A6A6" w:sz="6"/>
             </w:tcBorders>
-            <w:shd w:fill="D9E2F3" w:color="auto" w:val="clear"/>
             <w:tcMar>
               <w:top w:type="dxa" w:w="80"/>
               <w:left w:type="dxa" w:w="100"/>
@@ -3807,7 +4413,6 @@
                 <w:rFonts w:ascii="David" w:cs="David" w:eastAsia="David" w:hAnsi="David"/>
                 <w:b/>
                 <w:bCs/>
-                <w:color w:val="1F3864"/>
                 <w:sz w:val="22"/>
                 <w:szCs w:val="22"/>
                 <w:rtl/>
@@ -3825,7 +4430,6 @@
               <w:bottom w:val="single" w:color="A6A6A6" w:sz="6"/>
               <w:right w:val="single" w:color="A6A6A6" w:sz="6"/>
             </w:tcBorders>
-            <w:shd w:fill="D9E2F3" w:color="auto" w:val="clear"/>
             <w:tcMar>
               <w:top w:type="dxa" w:w="80"/>
               <w:left w:type="dxa" w:w="100"/>
@@ -3845,7 +4449,6 @@
                 <w:rFonts w:ascii="David" w:cs="David" w:eastAsia="David" w:hAnsi="David"/>
                 <w:b/>
                 <w:bCs/>
-                <w:color w:val="1F3864"/>
                 <w:sz w:val="22"/>
                 <w:szCs w:val="22"/>
                 <w:rtl/>
@@ -3863,7 +4466,6 @@
               <w:bottom w:val="single" w:color="A6A6A6" w:sz="6"/>
               <w:right w:val="single" w:color="A6A6A6" w:sz="6"/>
             </w:tcBorders>
-            <w:shd w:fill="D9E2F3" w:color="auto" w:val="clear"/>
             <w:tcMar>
               <w:top w:type="dxa" w:w="80"/>
               <w:left w:type="dxa" w:w="100"/>
@@ -3883,7 +4485,6 @@
                 <w:rFonts w:ascii="David" w:cs="David" w:eastAsia="David" w:hAnsi="David"/>
                 <w:b/>
                 <w:bCs/>
-                <w:color w:val="1F3864"/>
                 <w:sz w:val="22"/>
                 <w:szCs w:val="22"/>
                 <w:rtl/>
@@ -4007,7 +4608,6 @@
               <w:bottom w:val="single" w:color="A6A6A6" w:sz="6"/>
               <w:right w:val="single" w:color="A6A6A6" w:sz="6"/>
             </w:tcBorders>
-            <w:shd w:fill="F5F7FA" w:color="auto" w:val="clear"/>
             <w:tcMar>
               <w:top w:type="dxa" w:w="80"/>
               <w:left w:type="dxa" w:w="100"/>
@@ -4042,7 +4642,6 @@
               <w:bottom w:val="single" w:color="A6A6A6" w:sz="6"/>
               <w:right w:val="single" w:color="A6A6A6" w:sz="6"/>
             </w:tcBorders>
-            <w:shd w:fill="F5F7FA" w:color="auto" w:val="clear"/>
             <w:tcMar>
               <w:top w:type="dxa" w:w="80"/>
               <w:left w:type="dxa" w:w="100"/>
@@ -4094,7 +4693,6 @@
               <w:bottom w:val="single" w:color="A6A6A6" w:sz="6"/>
               <w:right w:val="single" w:color="A6A6A6" w:sz="6"/>
             </w:tcBorders>
-            <w:shd w:fill="F5F7FA" w:color="auto" w:val="clear"/>
             <w:tcMar>
               <w:top w:type="dxa" w:w="80"/>
               <w:left w:type="dxa" w:w="100"/>
@@ -4235,7 +4833,6 @@
               <w:bottom w:val="single" w:color="A6A6A6" w:sz="6"/>
               <w:right w:val="single" w:color="A6A6A6" w:sz="6"/>
             </w:tcBorders>
-            <w:shd w:fill="F5F7FA" w:color="auto" w:val="clear"/>
             <w:tcMar>
               <w:top w:type="dxa" w:w="80"/>
               <w:left w:type="dxa" w:w="100"/>
@@ -4270,7 +4867,6 @@
               <w:bottom w:val="single" w:color="A6A6A6" w:sz="6"/>
               <w:right w:val="single" w:color="A6A6A6" w:sz="6"/>
             </w:tcBorders>
-            <w:shd w:fill="F5F7FA" w:color="auto" w:val="clear"/>
             <w:tcMar>
               <w:top w:type="dxa" w:w="80"/>
               <w:left w:type="dxa" w:w="100"/>
@@ -4305,7 +4901,6 @@
               <w:bottom w:val="single" w:color="A6A6A6" w:sz="6"/>
               <w:right w:val="single" w:color="A6A6A6" w:sz="6"/>
             </w:tcBorders>
-            <w:shd w:fill="F5F7FA" w:color="auto" w:val="clear"/>
             <w:tcMar>
               <w:top w:type="dxa" w:w="80"/>
               <w:left w:type="dxa" w:w="100"/>
@@ -4454,7 +5049,7 @@
           <w:rFonts w:ascii="David" w:cs="David" w:eastAsia="David" w:hAnsi="David"/>
           <w:b/>
           <w:bCs/>
-          <w:color w:val="0E6E73"/>
+          <w:color w:val="000000"/>
           <w:sz w:val="28"/>
           <w:szCs w:val="28"/>
           <w:rtl/>
@@ -4540,7 +5135,7 @@
           <w:rFonts w:ascii="David" w:cs="David" w:eastAsia="David" w:hAnsi="David"/>
           <w:b/>
           <w:bCs/>
-          <w:color w:val="0E6E73"/>
+          <w:color w:val="000000"/>
           <w:sz w:val="28"/>
           <w:szCs w:val="28"/>
           <w:rtl/>
@@ -4589,11 +5184,8 @@
     <w:p>
       <w:pPr>
         <w:pStyle w:val="Heading1"/>
-        <w:pBdr>
-          <w:bottom w:val="single" w:color="0E6E73" w:sz="12" w:space="4"/>
-        </w:pBdr>
-        <w:bidi/>
-        <w:spacing w:after="280" w:before="240" w:line="480"/>
+        <w:bidi/>
+        <w:spacing w:after="240" w:before="240" w:line="480"/>
         <w:jc w:val="right"/>
       </w:pPr>
       <w:r>
@@ -4601,9 +5193,9 @@
           <w:rFonts w:ascii="David" w:cs="David" w:eastAsia="David" w:hAnsi="David"/>
           <w:b/>
           <w:bCs/>
-          <w:color w:val="1F3864"/>
-          <w:sz w:val="34"/>
-          <w:szCs w:val="34"/>
+          <w:color w:val="000000"/>
+          <w:sz w:val="32"/>
+          <w:szCs w:val="32"/>
           <w:rtl/>
         </w:rPr>
         <w:t xml:space="preserve">פרק 4: המאמר המשלים</w:t>
@@ -4621,7 +5213,7 @@
           <w:rFonts w:ascii="David" w:cs="David" w:eastAsia="David" w:hAnsi="David"/>
           <w:b/>
           <w:bCs/>
-          <w:color w:val="0E6E73"/>
+          <w:color w:val="000000"/>
           <w:sz w:val="28"/>
           <w:szCs w:val="28"/>
           <w:rtl/>
@@ -4791,7 +5383,7 @@
           <w:rFonts w:ascii="David" w:cs="David" w:eastAsia="David" w:hAnsi="David"/>
           <w:b/>
           <w:bCs/>
-          <w:color w:val="0E6E73"/>
+          <w:color w:val="000000"/>
           <w:sz w:val="28"/>
           <w:szCs w:val="28"/>
           <w:rtl/>
@@ -4857,11 +5449,8 @@
     <w:p>
       <w:pPr>
         <w:pStyle w:val="Heading1"/>
-        <w:pBdr>
-          <w:bottom w:val="single" w:color="0E6E73" w:sz="12" w:space="4"/>
-        </w:pBdr>
-        <w:bidi/>
-        <w:spacing w:after="280" w:before="240" w:line="480"/>
+        <w:bidi/>
+        <w:spacing w:after="240" w:before="240" w:line="480"/>
         <w:jc w:val="right"/>
       </w:pPr>
       <w:r>
@@ -4869,9 +5458,9 @@
           <w:rFonts w:ascii="David" w:cs="David" w:eastAsia="David" w:hAnsi="David"/>
           <w:b/>
           <w:bCs/>
-          <w:color w:val="1F3864"/>
-          <w:sz w:val="34"/>
-          <w:szCs w:val="34"/>
+          <w:color w:val="000000"/>
+          <w:sz w:val="32"/>
+          <w:szCs w:val="32"/>
           <w:rtl/>
         </w:rPr>
         <w:t xml:space="preserve">פרק 5: תובנות, מסקנות ודעה אישית</w:t>
@@ -4889,7 +5478,7 @@
           <w:rFonts w:ascii="David" w:cs="David" w:eastAsia="David" w:hAnsi="David"/>
           <w:b/>
           <w:bCs/>
-          <w:color w:val="0E6E73"/>
+          <w:color w:val="000000"/>
           <w:sz w:val="28"/>
           <w:szCs w:val="28"/>
           <w:rtl/>
@@ -5058,7 +5647,7 @@
           <w:rFonts w:ascii="David" w:cs="David" w:eastAsia="David" w:hAnsi="David"/>
           <w:b/>
           <w:bCs/>
-          <w:color w:val="0E6E73"/>
+          <w:color w:val="000000"/>
           <w:sz w:val="28"/>
           <w:szCs w:val="28"/>
           <w:rtl/>
@@ -5128,7 +5717,7 @@
           <w:rFonts w:ascii="David" w:cs="David" w:eastAsia="David" w:hAnsi="David"/>
           <w:b/>
           <w:bCs/>
-          <w:color w:val="0E6E73"/>
+          <w:color w:val="000000"/>
           <w:sz w:val="28"/>
           <w:szCs w:val="28"/>
           <w:rtl/>
@@ -5261,11 +5850,8 @@
     <w:p>
       <w:pPr>
         <w:pStyle w:val="Heading1"/>
-        <w:pBdr>
-          <w:bottom w:val="single" w:color="0E6E73" w:sz="12" w:space="4"/>
-        </w:pBdr>
-        <w:bidi/>
-        <w:spacing w:after="280" w:before="240" w:line="480"/>
+        <w:bidi/>
+        <w:spacing w:after="240" w:before="240" w:line="480"/>
         <w:jc w:val="right"/>
       </w:pPr>
       <w:r>
@@ -5273,9 +5859,9 @@
           <w:rFonts w:ascii="David" w:cs="David" w:eastAsia="David" w:hAnsi="David"/>
           <w:b/>
           <w:bCs/>
-          <w:color w:val="1F3864"/>
-          <w:sz w:val="34"/>
-          <w:szCs w:val="34"/>
+          <w:color w:val="000000"/>
+          <w:sz w:val="32"/>
+          <w:szCs w:val="32"/>
           <w:rtl/>
         </w:rPr>
         <w:t xml:space="preserve">פרק 6: יישום מעשי בניהול קריירה</w:t>
@@ -5293,7 +5879,7 @@
           <w:rFonts w:ascii="David" w:cs="David" w:eastAsia="David" w:hAnsi="David"/>
           <w:b/>
           <w:bCs/>
-          <w:color w:val="0E6E73"/>
+          <w:color w:val="000000"/>
           <w:sz w:val="28"/>
           <w:szCs w:val="28"/>
           <w:rtl/>
@@ -5383,7 +5969,6 @@
               <w:bottom w:val="single" w:color="A6A6A6" w:sz="6"/>
               <w:right w:val="single" w:color="A6A6A6" w:sz="6"/>
             </w:tcBorders>
-            <w:shd w:fill="D9E2F3" w:color="auto" w:val="clear"/>
             <w:tcMar>
               <w:top w:type="dxa" w:w="80"/>
               <w:left w:type="dxa" w:w="100"/>
@@ -5403,7 +5988,6 @@
                 <w:rFonts w:ascii="David" w:cs="David" w:eastAsia="David" w:hAnsi="David"/>
                 <w:b/>
                 <w:bCs/>
-                <w:color w:val="1F3864"/>
                 <w:sz w:val="22"/>
                 <w:szCs w:val="22"/>
                 <w:rtl/>
@@ -5421,7 +6005,6 @@
               <w:bottom w:val="single" w:color="A6A6A6" w:sz="6"/>
               <w:right w:val="single" w:color="A6A6A6" w:sz="6"/>
             </w:tcBorders>
-            <w:shd w:fill="D9E2F3" w:color="auto" w:val="clear"/>
             <w:tcMar>
               <w:top w:type="dxa" w:w="80"/>
               <w:left w:type="dxa" w:w="100"/>
@@ -5441,7 +6024,6 @@
                 <w:rFonts w:ascii="David" w:cs="David" w:eastAsia="David" w:hAnsi="David"/>
                 <w:b/>
                 <w:bCs/>
-                <w:color w:val="1F3864"/>
                 <w:sz w:val="22"/>
                 <w:szCs w:val="22"/>
                 <w:rtl/>
@@ -5459,7 +6041,6 @@
               <w:bottom w:val="single" w:color="A6A6A6" w:sz="6"/>
               <w:right w:val="single" w:color="A6A6A6" w:sz="6"/>
             </w:tcBorders>
-            <w:shd w:fill="D9E2F3" w:color="auto" w:val="clear"/>
             <w:tcMar>
               <w:top w:type="dxa" w:w="80"/>
               <w:left w:type="dxa" w:w="100"/>
@@ -5479,7 +6060,6 @@
                 <w:rFonts w:ascii="David" w:cs="David" w:eastAsia="David" w:hAnsi="David"/>
                 <w:b/>
                 <w:bCs/>
-                <w:color w:val="1F3864"/>
                 <w:sz w:val="22"/>
                 <w:szCs w:val="22"/>
                 <w:rtl/>
@@ -5603,7 +6183,6 @@
               <w:bottom w:val="single" w:color="A6A6A6" w:sz="6"/>
               <w:right w:val="single" w:color="A6A6A6" w:sz="6"/>
             </w:tcBorders>
-            <w:shd w:fill="F5F7FA" w:color="auto" w:val="clear"/>
             <w:tcMar>
               <w:top w:type="dxa" w:w="80"/>
               <w:left w:type="dxa" w:w="100"/>
@@ -5638,7 +6217,6 @@
               <w:bottom w:val="single" w:color="A6A6A6" w:sz="6"/>
               <w:right w:val="single" w:color="A6A6A6" w:sz="6"/>
             </w:tcBorders>
-            <w:shd w:fill="F5F7FA" w:color="auto" w:val="clear"/>
             <w:tcMar>
               <w:top w:type="dxa" w:w="80"/>
               <w:left w:type="dxa" w:w="100"/>
@@ -5673,7 +6251,6 @@
               <w:bottom w:val="single" w:color="A6A6A6" w:sz="6"/>
               <w:right w:val="single" w:color="A6A6A6" w:sz="6"/>
             </w:tcBorders>
-            <w:shd w:fill="F5F7FA" w:color="auto" w:val="clear"/>
             <w:tcMar>
               <w:top w:type="dxa" w:w="80"/>
               <w:left w:type="dxa" w:w="100"/>
@@ -5814,7 +6391,6 @@
               <w:bottom w:val="single" w:color="A6A6A6" w:sz="6"/>
               <w:right w:val="single" w:color="A6A6A6" w:sz="6"/>
             </w:tcBorders>
-            <w:shd w:fill="F5F7FA" w:color="auto" w:val="clear"/>
             <w:tcMar>
               <w:top w:type="dxa" w:w="80"/>
               <w:left w:type="dxa" w:w="100"/>
@@ -5849,7 +6425,6 @@
               <w:bottom w:val="single" w:color="A6A6A6" w:sz="6"/>
               <w:right w:val="single" w:color="A6A6A6" w:sz="6"/>
             </w:tcBorders>
-            <w:shd w:fill="F5F7FA" w:color="auto" w:val="clear"/>
             <w:tcMar>
               <w:top w:type="dxa" w:w="80"/>
               <w:left w:type="dxa" w:w="100"/>
@@ -5884,7 +6459,6 @@
               <w:bottom w:val="single" w:color="A6A6A6" w:sz="6"/>
               <w:right w:val="single" w:color="A6A6A6" w:sz="6"/>
             </w:tcBorders>
-            <w:shd w:fill="F5F7FA" w:color="auto" w:val="clear"/>
             <w:tcMar>
               <w:top w:type="dxa" w:w="80"/>
               <w:left w:type="dxa" w:w="100"/>
@@ -5921,7 +6495,7 @@
       <w:r>
         <w:rPr>
           <w:rFonts w:ascii="David" w:cs="David" w:eastAsia="David" w:hAnsi="David"/>
-          <w:color w:val="595959"/>
+          <w:color w:val="000000"/>
           <w:sz w:val="20"/>
           <w:szCs w:val="20"/>
           <w:rtl/>
@@ -5931,7 +6505,7 @@
       <w:r>
         <w:rPr>
           <w:rFonts w:ascii="Times New Roman" w:cs="Times New Roman" w:eastAsia="Times New Roman" w:hAnsi="Times New Roman"/>
-          <w:color w:val="595959"/>
+          <w:color w:val="000000"/>
           <w:sz w:val="20"/>
           <w:szCs w:val="20"/>
         </w:rPr>
@@ -5940,7 +6514,7 @@
       <w:r>
         <w:rPr>
           <w:rFonts w:ascii="David" w:cs="David" w:eastAsia="David" w:hAnsi="David"/>
-          <w:color w:val="595959"/>
+          <w:color w:val="000000"/>
           <w:sz w:val="20"/>
           <w:szCs w:val="20"/>
           <w:rtl/>
@@ -5960,7 +6534,7 @@
           <w:rFonts w:ascii="David" w:cs="David" w:eastAsia="David" w:hAnsi="David"/>
           <w:b/>
           <w:bCs/>
-          <w:color w:val="0E6E73"/>
+          <w:color w:val="000000"/>
           <w:sz w:val="28"/>
           <w:szCs w:val="28"/>
           <w:rtl/>
@@ -6029,7 +6603,7 @@
           <w:rFonts w:ascii="David" w:cs="David" w:eastAsia="David" w:hAnsi="David"/>
           <w:b/>
           <w:bCs/>
-          <w:color w:val="0E6E73"/>
+          <w:color w:val="000000"/>
           <w:sz w:val="28"/>
           <w:szCs w:val="28"/>
           <w:rtl/>
@@ -6116,7 +6690,7 @@
           <w:rFonts w:ascii="David" w:cs="David" w:eastAsia="David" w:hAnsi="David"/>
           <w:b/>
           <w:bCs/>
-          <w:color w:val="0E6E73"/>
+          <w:color w:val="000000"/>
           <w:sz w:val="28"/>
           <w:szCs w:val="28"/>
           <w:rtl/>
@@ -6199,11 +6773,8 @@
     <w:p>
       <w:pPr>
         <w:pStyle w:val="Heading1"/>
-        <w:pBdr>
-          <w:bottom w:val="single" w:color="0E6E73" w:sz="12" w:space="4"/>
-        </w:pBdr>
-        <w:bidi/>
-        <w:spacing w:after="280" w:before="240" w:line="480"/>
+        <w:bidi/>
+        <w:spacing w:after="240" w:before="240" w:line="480"/>
         <w:jc w:val="right"/>
       </w:pPr>
       <w:r>
@@ -6211,9 +6782,9 @@
           <w:rFonts w:ascii="David" w:cs="David" w:eastAsia="David" w:hAnsi="David"/>
           <w:b/>
           <w:bCs/>
-          <w:color w:val="1F3864"/>
-          <w:sz w:val="34"/>
-          <w:szCs w:val="34"/>
+          <w:color w:val="000000"/>
+          <w:sz w:val="32"/>
+          <w:szCs w:val="32"/>
           <w:rtl/>
         </w:rPr>
         <w:t xml:space="preserve">סיכום ומסקנות</w:t>
@@ -6293,11 +6864,8 @@
     <w:p>
       <w:pPr>
         <w:pStyle w:val="Heading1"/>
-        <w:pBdr>
-          <w:bottom w:val="single" w:color="0E6E73" w:sz="12" w:space="4"/>
-        </w:pBdr>
-        <w:bidi/>
-        <w:spacing w:after="280" w:before="240" w:line="480"/>
+        <w:bidi/>
+        <w:spacing w:after="240" w:before="240" w:line="480"/>
         <w:jc w:val="right"/>
       </w:pPr>
       <w:r>
@@ -6305,9 +6873,9 @@
           <w:rFonts w:ascii="David" w:cs="David" w:eastAsia="David" w:hAnsi="David"/>
           <w:b/>
           <w:bCs/>
-          <w:color w:val="1F3864"/>
-          <w:sz w:val="34"/>
-          <w:szCs w:val="34"/>
+          <w:color w:val="000000"/>
+          <w:sz w:val="32"/>
+          <w:szCs w:val="32"/>
           <w:rtl/>
         </w:rPr>
         <w:t xml:space="preserve">נספח א: תכנון המצגת והאמצעים להמחשה</w:t>
@@ -6360,7 +6928,6 @@
               <w:bottom w:val="single" w:color="A6A6A6" w:sz="6"/>
               <w:right w:val="single" w:color="A6A6A6" w:sz="6"/>
             </w:tcBorders>
-            <w:shd w:fill="D9E2F3" w:color="auto" w:val="clear"/>
             <w:tcMar>
               <w:top w:type="dxa" w:w="80"/>
               <w:left w:type="dxa" w:w="100"/>
@@ -6380,7 +6947,6 @@
                 <w:rFonts w:ascii="David" w:cs="David" w:eastAsia="David" w:hAnsi="David"/>
                 <w:b/>
                 <w:bCs/>
-                <w:color w:val="1F3864"/>
                 <w:sz w:val="22"/>
                 <w:szCs w:val="22"/>
                 <w:rtl/>
@@ -6398,7 +6964,6 @@
               <w:bottom w:val="single" w:color="A6A6A6" w:sz="6"/>
               <w:right w:val="single" w:color="A6A6A6" w:sz="6"/>
             </w:tcBorders>
-            <w:shd w:fill="D9E2F3" w:color="auto" w:val="clear"/>
             <w:tcMar>
               <w:top w:type="dxa" w:w="80"/>
               <w:left w:type="dxa" w:w="100"/>
@@ -6418,7 +6983,6 @@
                 <w:rFonts w:ascii="David" w:cs="David" w:eastAsia="David" w:hAnsi="David"/>
                 <w:b/>
                 <w:bCs/>
-                <w:color w:val="1F3864"/>
                 <w:sz w:val="22"/>
                 <w:szCs w:val="22"/>
                 <w:rtl/>
@@ -6436,7 +7000,6 @@
               <w:bottom w:val="single" w:color="A6A6A6" w:sz="6"/>
               <w:right w:val="single" w:color="A6A6A6" w:sz="6"/>
             </w:tcBorders>
-            <w:shd w:fill="D9E2F3" w:color="auto" w:val="clear"/>
             <w:tcMar>
               <w:top w:type="dxa" w:w="80"/>
               <w:left w:type="dxa" w:w="100"/>
@@ -6456,7 +7019,6 @@
                 <w:rFonts w:ascii="David" w:cs="David" w:eastAsia="David" w:hAnsi="David"/>
                 <w:b/>
                 <w:bCs/>
-                <w:color w:val="1F3864"/>
                 <w:sz w:val="22"/>
                 <w:szCs w:val="22"/>
                 <w:rtl/>
@@ -6597,7 +7159,6 @@
               <w:bottom w:val="single" w:color="A6A6A6" w:sz="6"/>
               <w:right w:val="single" w:color="A6A6A6" w:sz="6"/>
             </w:tcBorders>
-            <w:shd w:fill="F5F7FA" w:color="auto" w:val="clear"/>
             <w:tcMar>
               <w:top w:type="dxa" w:w="80"/>
               <w:left w:type="dxa" w:w="100"/>
@@ -6632,7 +7193,6 @@
               <w:bottom w:val="single" w:color="A6A6A6" w:sz="6"/>
               <w:right w:val="single" w:color="A6A6A6" w:sz="6"/>
             </w:tcBorders>
-            <w:shd w:fill="F5F7FA" w:color="auto" w:val="clear"/>
             <w:tcMar>
               <w:top w:type="dxa" w:w="80"/>
               <w:left w:type="dxa" w:w="100"/>
@@ -6667,7 +7227,6 @@
               <w:bottom w:val="single" w:color="A6A6A6" w:sz="6"/>
               <w:right w:val="single" w:color="A6A6A6" w:sz="6"/>
             </w:tcBorders>
-            <w:shd w:fill="F5F7FA" w:color="auto" w:val="clear"/>
             <w:tcMar>
               <w:top w:type="dxa" w:w="80"/>
               <w:left w:type="dxa" w:w="100"/>
@@ -6842,7 +7401,6 @@
               <w:bottom w:val="single" w:color="A6A6A6" w:sz="6"/>
               <w:right w:val="single" w:color="A6A6A6" w:sz="6"/>
             </w:tcBorders>
-            <w:shd w:fill="F5F7FA" w:color="auto" w:val="clear"/>
             <w:tcMar>
               <w:top w:type="dxa" w:w="80"/>
               <w:left w:type="dxa" w:w="100"/>
@@ -6877,7 +7435,6 @@
               <w:bottom w:val="single" w:color="A6A6A6" w:sz="6"/>
               <w:right w:val="single" w:color="A6A6A6" w:sz="6"/>
             </w:tcBorders>
-            <w:shd w:fill="F5F7FA" w:color="auto" w:val="clear"/>
             <w:tcMar>
               <w:top w:type="dxa" w:w="80"/>
               <w:left w:type="dxa" w:w="100"/>
@@ -6912,7 +7469,6 @@
               <w:bottom w:val="single" w:color="A6A6A6" w:sz="6"/>
               <w:right w:val="single" w:color="A6A6A6" w:sz="6"/>
             </w:tcBorders>
-            <w:shd w:fill="F5F7FA" w:color="auto" w:val="clear"/>
             <w:tcMar>
               <w:top w:type="dxa" w:w="80"/>
               <w:left w:type="dxa" w:w="100"/>
@@ -7087,7 +7643,6 @@
               <w:bottom w:val="single" w:color="A6A6A6" w:sz="6"/>
               <w:right w:val="single" w:color="A6A6A6" w:sz="6"/>
             </w:tcBorders>
-            <w:shd w:fill="F5F7FA" w:color="auto" w:val="clear"/>
             <w:tcMar>
               <w:top w:type="dxa" w:w="80"/>
               <w:left w:type="dxa" w:w="100"/>
@@ -7122,7 +7677,6 @@
               <w:bottom w:val="single" w:color="A6A6A6" w:sz="6"/>
               <w:right w:val="single" w:color="A6A6A6" w:sz="6"/>
             </w:tcBorders>
-            <w:shd w:fill="F5F7FA" w:color="auto" w:val="clear"/>
             <w:tcMar>
               <w:top w:type="dxa" w:w="80"/>
               <w:left w:type="dxa" w:w="100"/>
@@ -7157,7 +7711,6 @@
               <w:bottom w:val="single" w:color="A6A6A6" w:sz="6"/>
               <w:right w:val="single" w:color="A6A6A6" w:sz="6"/>
             </w:tcBorders>
-            <w:shd w:fill="F5F7FA" w:color="auto" w:val="clear"/>
             <w:tcMar>
               <w:top w:type="dxa" w:w="80"/>
               <w:left w:type="dxa" w:w="100"/>
@@ -7306,7 +7859,7 @@
           <w:rFonts w:ascii="David" w:cs="David" w:eastAsia="David" w:hAnsi="David"/>
           <w:b/>
           <w:bCs/>
-          <w:color w:val="0E6E73"/>
+          <w:color w:val="000000"/>
           <w:sz w:val="28"/>
           <w:szCs w:val="28"/>
           <w:rtl/>
@@ -7422,11 +7975,8 @@
     <w:p>
       <w:pPr>
         <w:pStyle w:val="Heading1"/>
-        <w:pBdr>
-          <w:bottom w:val="single" w:color="0E6E73" w:sz="12" w:space="4"/>
-        </w:pBdr>
-        <w:bidi/>
-        <w:spacing w:after="280" w:before="240" w:line="480"/>
+        <w:bidi/>
+        <w:spacing w:after="240" w:before="240" w:line="480"/>
         <w:jc w:val="right"/>
       </w:pPr>
       <w:r>
@@ -7434,9 +7984,9 @@
           <w:rFonts w:ascii="David" w:cs="David" w:eastAsia="David" w:hAnsi="David"/>
           <w:b/>
           <w:bCs/>
-          <w:color w:val="1F3864"/>
-          <w:sz w:val="34"/>
-          <w:szCs w:val="34"/>
+          <w:color w:val="000000"/>
+          <w:sz w:val="32"/>
+          <w:szCs w:val="32"/>
           <w:rtl/>
         </w:rPr>
         <w:t xml:space="preserve">נספח ב: שאלון קצר להערכה עצמית</w:t>
@@ -7506,7 +8056,6 @@
               <w:bottom w:val="single" w:color="A6A6A6" w:sz="6"/>
               <w:right w:val="single" w:color="A6A6A6" w:sz="6"/>
             </w:tcBorders>
-            <w:shd w:fill="D9E2F3" w:color="auto" w:val="clear"/>
             <w:tcMar>
               <w:top w:type="dxa" w:w="80"/>
               <w:left w:type="dxa" w:w="100"/>
@@ -7526,7 +8075,6 @@
                 <w:rFonts w:ascii="David" w:cs="David" w:eastAsia="David" w:hAnsi="David"/>
                 <w:b/>
                 <w:bCs/>
-                <w:color w:val="1F3864"/>
                 <w:sz w:val="22"/>
                 <w:szCs w:val="22"/>
                 <w:rtl/>
@@ -7544,7 +8092,6 @@
               <w:bottom w:val="single" w:color="A6A6A6" w:sz="6"/>
               <w:right w:val="single" w:color="A6A6A6" w:sz="6"/>
             </w:tcBorders>
-            <w:shd w:fill="D9E2F3" w:color="auto" w:val="clear"/>
             <w:tcMar>
               <w:top w:type="dxa" w:w="80"/>
               <w:left w:type="dxa" w:w="100"/>
@@ -7564,7 +8111,6 @@
                 <w:rFonts w:ascii="David" w:cs="David" w:eastAsia="David" w:hAnsi="David"/>
                 <w:b/>
                 <w:bCs/>
-                <w:color w:val="1F3864"/>
                 <w:sz w:val="22"/>
                 <w:szCs w:val="22"/>
                 <w:rtl/>
@@ -7582,7 +8128,6 @@
               <w:bottom w:val="single" w:color="A6A6A6" w:sz="6"/>
               <w:right w:val="single" w:color="A6A6A6" w:sz="6"/>
             </w:tcBorders>
-            <w:shd w:fill="D9E2F3" w:color="auto" w:val="clear"/>
             <w:tcMar>
               <w:top w:type="dxa" w:w="80"/>
               <w:left w:type="dxa" w:w="100"/>
@@ -7602,7 +8147,6 @@
                 <w:rFonts w:ascii="David" w:cs="David" w:eastAsia="David" w:hAnsi="David"/>
                 <w:b/>
                 <w:bCs/>
-                <w:color w:val="1F3864"/>
                 <w:sz w:val="22"/>
                 <w:szCs w:val="22"/>
                 <w:rtl/>
@@ -7726,7 +8270,6 @@
               <w:bottom w:val="single" w:color="A6A6A6" w:sz="6"/>
               <w:right w:val="single" w:color="A6A6A6" w:sz="6"/>
             </w:tcBorders>
-            <w:shd w:fill="F5F7FA" w:color="auto" w:val="clear"/>
             <w:tcMar>
               <w:top w:type="dxa" w:w="80"/>
               <w:left w:type="dxa" w:w="100"/>
@@ -7761,7 +8304,6 @@
               <w:bottom w:val="single" w:color="A6A6A6" w:sz="6"/>
               <w:right w:val="single" w:color="A6A6A6" w:sz="6"/>
             </w:tcBorders>
-            <w:shd w:fill="F5F7FA" w:color="auto" w:val="clear"/>
             <w:tcMar>
               <w:top w:type="dxa" w:w="80"/>
               <w:left w:type="dxa" w:w="100"/>
@@ -7796,7 +8338,6 @@
               <w:bottom w:val="single" w:color="A6A6A6" w:sz="6"/>
               <w:right w:val="single" w:color="A6A6A6" w:sz="6"/>
             </w:tcBorders>
-            <w:shd w:fill="F5F7FA" w:color="auto" w:val="clear"/>
             <w:tcMar>
               <w:top w:type="dxa" w:w="80"/>
               <w:left w:type="dxa" w:w="100"/>
@@ -7937,7 +8478,6 @@
               <w:bottom w:val="single" w:color="A6A6A6" w:sz="6"/>
               <w:right w:val="single" w:color="A6A6A6" w:sz="6"/>
             </w:tcBorders>
-            <w:shd w:fill="F5F7FA" w:color="auto" w:val="clear"/>
             <w:tcMar>
               <w:top w:type="dxa" w:w="80"/>
               <w:left w:type="dxa" w:w="100"/>
@@ -7972,7 +8512,6 @@
               <w:bottom w:val="single" w:color="A6A6A6" w:sz="6"/>
               <w:right w:val="single" w:color="A6A6A6" w:sz="6"/>
             </w:tcBorders>
-            <w:shd w:fill="F5F7FA" w:color="auto" w:val="clear"/>
             <w:tcMar>
               <w:top w:type="dxa" w:w="80"/>
               <w:left w:type="dxa" w:w="100"/>
@@ -8007,7 +8546,6 @@
               <w:bottom w:val="single" w:color="A6A6A6" w:sz="6"/>
               <w:right w:val="single" w:color="A6A6A6" w:sz="6"/>
             </w:tcBorders>
-            <w:shd w:fill="F5F7FA" w:color="auto" w:val="clear"/>
             <w:tcMar>
               <w:top w:type="dxa" w:w="80"/>
               <w:left w:type="dxa" w:w="100"/>
@@ -8148,7 +8686,6 @@
               <w:bottom w:val="single" w:color="A6A6A6" w:sz="6"/>
               <w:right w:val="single" w:color="A6A6A6" w:sz="6"/>
             </w:tcBorders>
-            <w:shd w:fill="F5F7FA" w:color="auto" w:val="clear"/>
             <w:tcMar>
               <w:top w:type="dxa" w:w="80"/>
               <w:left w:type="dxa" w:w="100"/>
@@ -8183,7 +8720,6 @@
               <w:bottom w:val="single" w:color="A6A6A6" w:sz="6"/>
               <w:right w:val="single" w:color="A6A6A6" w:sz="6"/>
             </w:tcBorders>
-            <w:shd w:fill="F5F7FA" w:color="auto" w:val="clear"/>
             <w:tcMar>
               <w:top w:type="dxa" w:w="80"/>
               <w:left w:type="dxa" w:w="100"/>
@@ -8218,7 +8754,6 @@
               <w:bottom w:val="single" w:color="A6A6A6" w:sz="6"/>
               <w:right w:val="single" w:color="A6A6A6" w:sz="6"/>
             </w:tcBorders>
-            <w:shd w:fill="F5F7FA" w:color="auto" w:val="clear"/>
             <w:tcMar>
               <w:top w:type="dxa" w:w="80"/>
               <w:left w:type="dxa" w:w="100"/>
@@ -8359,7 +8894,6 @@
               <w:bottom w:val="single" w:color="A6A6A6" w:sz="6"/>
               <w:right w:val="single" w:color="A6A6A6" w:sz="6"/>
             </w:tcBorders>
-            <w:shd w:fill="F5F7FA" w:color="auto" w:val="clear"/>
             <w:tcMar>
               <w:top w:type="dxa" w:w="80"/>
               <w:left w:type="dxa" w:w="100"/>
@@ -8394,7 +8928,6 @@
               <w:bottom w:val="single" w:color="A6A6A6" w:sz="6"/>
               <w:right w:val="single" w:color="A6A6A6" w:sz="6"/>
             </w:tcBorders>
-            <w:shd w:fill="F5F7FA" w:color="auto" w:val="clear"/>
             <w:tcMar>
               <w:top w:type="dxa" w:w="80"/>
               <w:left w:type="dxa" w:w="100"/>
@@ -8429,7 +8962,6 @@
               <w:bottom w:val="single" w:color="A6A6A6" w:sz="6"/>
               <w:right w:val="single" w:color="A6A6A6" w:sz="6"/>
             </w:tcBorders>
-            <w:shd w:fill="F5F7FA" w:color="auto" w:val="clear"/>
             <w:tcMar>
               <w:top w:type="dxa" w:w="80"/>
               <w:left w:type="dxa" w:w="100"/>
@@ -8503,11 +9035,8 @@
     <w:p>
       <w:pPr>
         <w:pStyle w:val="Heading1"/>
-        <w:pBdr>
-          <w:bottom w:val="single" w:color="0E6E73" w:sz="12" w:space="4"/>
-        </w:pBdr>
-        <w:bidi/>
-        <w:spacing w:after="280" w:before="240" w:line="480"/>
+        <w:bidi/>
+        <w:spacing w:after="240" w:before="240" w:line="480"/>
         <w:jc w:val="right"/>
       </w:pPr>
       <w:r>
@@ -8515,9 +9044,9 @@
           <w:rFonts w:ascii="David" w:cs="David" w:eastAsia="David" w:hAnsi="David"/>
           <w:b/>
           <w:bCs/>
-          <w:color w:val="1F3864"/>
-          <w:sz w:val="34"/>
-          <w:szCs w:val="34"/>
+          <w:color w:val="000000"/>
+          <w:sz w:val="32"/>
+          <w:szCs w:val="32"/>
           <w:rtl/>
         </w:rPr>
         <w:t xml:space="preserve">רשימת מקורות</w:t>
@@ -9199,7 +9728,7 @@
       <w:rFonts w:ascii="David" w:cs="David" w:eastAsia="David" w:hAnsi="David"/>
       <w:b/>
       <w:bCs/>
-      <w:color w:val="1F3864"/>
+      <w:color w:val="000000"/>
       <w:sz w:val="32"/>
       <w:szCs w:val="32"/>
     </w:rPr>
@@ -9217,10 +9746,48 @@
       <w:rFonts w:ascii="David" w:cs="David" w:eastAsia="David" w:hAnsi="David"/>
       <w:b/>
       <w:bCs/>
-      <w:color w:val="0E6E73"/>
+      <w:color w:val="000000"/>
       <w:sz w:val="28"/>
       <w:szCs w:val="28"/>
     </w:rPr>
   </w:style>
+  <w:style w:type="paragraph" w:styleId="TOC1">
+    <w:name w:val="toc 1"/>
+    <w:basedOn w:val="Normal"/>
+    <w:next w:val="Normal"/>
+    <w:uiPriority w:val="39"/>
+    <w:pPr>
+      <w:tabs>
+        <w:tab w:val="left" w:leader="dot" w:pos="8800"/>
+      </w:tabs>
+      <w:bidi/>
+      <w:spacing w:line="300" w:lineRule="auto" w:after="40"/>
+      <w:ind w:right="0"/>
+    </w:pPr>
+    <w:rPr>
+      <w:rFonts w:ascii="David" w:hAnsi="David" w:cs="David"/>
+      <w:sz w:val="24"/>
+      <w:szCs w:val="24"/>
+    </w:rPr>
+  </w:style>
+  <w:style w:type="paragraph" w:styleId="TOC2">
+    <w:name w:val="toc 2"/>
+    <w:basedOn w:val="Normal"/>
+    <w:next w:val="Normal"/>
+    <w:uiPriority w:val="39"/>
+    <w:pPr>
+      <w:tabs>
+        <w:tab w:val="left" w:leader="dot" w:pos="8800"/>
+      </w:tabs>
+      <w:bidi/>
+      <w:spacing w:line="300" w:lineRule="auto" w:after="40"/>
+      <w:ind w:right="400"/>
+    </w:pPr>
+    <w:rPr>
+      <w:rFonts w:ascii="David" w:hAnsi="David" w:cs="David"/>
+      <w:sz w:val="24"/>
+      <w:szCs w:val="24"/>
+    </w:rPr>
+  </w:style>
 </w:styles>
 </file>
</xml_diff>

<commit_message>
Drop lecture presentations from the reference list
Course concepts are now described as learned in the course without a
parenthetical citation, and the three lecture-presentation entries are
removed from the paper and the deck.

Co-Authored-By: Claude Fable 5.1 <noreply@anthropic.com>
Claude-Session: https://claude.ai/code/session_01XaGvnsaHG3kPyCY3aGBByx
</commit_message>
<xml_diff>
--- a/career-management-final-project/ניהול קריירה - התמודדות עם חוסר ודאות תעסוקתי - עבודה מסכמת.docx
+++ b/career-management-final-project/ניהול קריירה - התמודדות עם חוסר ודאות תעסוקתי - עבודה מסכמת.docx
@@ -1667,7 +1667,7 @@
           <w:szCs w:val="24"/>
           <w:rtl/>
         </w:rPr>
-        <w:t xml:space="preserve">). ניהול קריירה, כפי שנלמד בקורס, הוא תהליך מתמשך של למידה, בניית זהות מקצועית וטיפוח רשת אנשים (דבדבני דקל, 2026א). תהליך כזה מניח מידה של יציבות. בעולם של אי-ודאות, השאלה היא אילו אסטרטגיות זמינות לעובד עצמו, ולא רק לארגון.</w:t>
+        <w:t xml:space="preserve">). ניהול קריירה, כפי שנלמד בקורס, הוא תהליך מתמשך של למידה, בניית זהות מקצועית וטיפוח רשת אנשים. תהליך כזה מניח מידה של יציבות. בעולם של אי-ודאות, השאלה היא אילו אסטרטגיות זמינות לעובד עצמו, ולא רק לארגון.</w:t>
       </w:r>
     </w:p>
     <w:p>
@@ -1717,7 +1717,7 @@
           <w:szCs w:val="24"/>
           <w:rtl/>
         </w:rPr>
-        <w:t xml:space="preserve"> בגישה פתוחה מלאה. המחקר עקב אחר 924 עובדים בגרמניה ובשווייץ במשך חצי שנה ובחן האם עיצוב תפקיד מבוסס צרכים, כלומר מאמצים יזומים של העובד לספק את צרכיו הפסיכולוגיים בעבודה, מחזק את תחושת הקוהרנטיות בעבודה: התפיסה שמצב העבודה מובן, ניתן לניהול ומשמעותי. הנושא נבחר משום שהוא מציע לסטודנטים הנמצאים בתחילת דרכם המקצועית כלי שבשליטתם, ומשום שהוא מתחבר לנושאים שנלמדו בקורס: מסע הקריירה במאה ה-21, שלושת "סלי הכלים" לניהול קריירה, רשת אנשים, זהות מקצועית והתפתחות (דבדבני דקל, 2026א), וההסתכלות על משבר כעל הזדמנות (דבדבני דקל, 2026ב). כמאמר משלים, לצורך הגשה בשלשה, נבחר מחקר האורך של צ'ונג ואחרים (</w:t>
+        <w:t xml:space="preserve"> בגישה פתוחה מלאה. המחקר עקב אחר 924 עובדים בגרמניה ובשווייץ במשך חצי שנה ובחן האם עיצוב תפקיד מבוסס צרכים, כלומר מאמצים יזומים של העובד לספק את צרכיו הפסיכולוגיים בעבודה, מחזק את תחושת הקוהרנטיות בעבודה: התפיסה שמצב העבודה מובן, ניתן לניהול ומשמעותי. הנושא נבחר משום שהוא מציע לסטודנטים הנמצאים בתחילת דרכם המקצועית כלי שבשליטתם, ומשום שהוא מתחבר לנושאים שנלמדו בקורס: מסע הקריירה במאה ה-21, שלושת "סלי הכלים" לניהול קריירה, רשת אנשים, זהות מקצועית והתפתחות, וההסתכלות על משבר כעל הזדמנות. כמאמר משלים, לצורך הגשה בשלשה, נבחר מחקר האורך של צ'ונג ואחרים (</w:t>
       </w:r>
       <w:r>
         <w:rPr>
@@ -5822,7 +5822,7 @@
           <w:szCs w:val="24"/>
           <w:rtl/>
         </w:rPr>
-        <w:t xml:space="preserve">עמדתנו היא שהמסר של המאמר משלים את "ממשבר להזדמנות" שלמדנו בקורס (דבדבני דקל, 2026ב). משבר הופך להזדמנות לא מעצמו, אלא כשמישהו מעצב אותו כך. עם זאת, המאמר עצמו מראה שהיוזמה תלויה בתחושת ניהוליות, ומי שמרגיש מאוים ובלי משאבים יתקשה להתחיל (</w:t>
+        <w:t xml:space="preserve">עמדתנו היא שהמסר של המאמר משלים את "ממשבר להזדמנות" שלמדנו בקורס. משבר הופך להזדמנות לא מעצמו, אלא כשמישהו מעצב אותו כך. עם זאת, המאמר עצמו מראה שהיוזמה תלויה בתחושת ניהוליות, ומי שמרגיש מאוים ובלי משאבים יתקשה להתחיל (</w:t>
       </w:r>
       <w:r>
         <w:rPr>
@@ -6555,7 +6555,7 @@
           <w:szCs w:val="24"/>
           <w:rtl/>
         </w:rPr>
-        <w:t xml:space="preserve">שלושת "סלי הכלים" שנלמדו בקורס, רשת אנשים, זהות מקצועית והתפתחות (דבדבני דקל, 2026א), מקבילים כמעט אחד לאחד לצרכי ההתקרבות. סל רשת האנשים הוא צורך השייכות. סל ההתפתחות, ובמרכזו תוכנית למידה שנתית, הוא צורך המיומנות. סל הזהות המקצועית, שמגדיר את הערך שהעובד מביא ללא תלות בארגון, הוא צורך המשמעות. המאמר מוסיף לשלושה את האוטונומיה, ובעיקר מוסיף ראיה אמפירית: פעולה על הצרכים האלה משנה, בתוך חצי שנה, את האופן שבו העבודה נתפסת (</w:t>
+        <w:t xml:space="preserve">שלושת "סלי הכלים" שנלמדו בקורס, רשת אנשים, זהות מקצועית והתפתחות, מקבילים כמעט אחד לאחד לצרכי ההתקרבות. סל רשת האנשים הוא צורך השייכות. סל ההתפתחות, ובמרכזו תוכנית למידה שנתית, הוא צורך המיומנות. סל הזהות המקצועית, שמגדיר את הערך שהעובד מביא ללא תלות בארגון, הוא צורך המשמעות. המאמר מוסיף לשלושה את האוטונומיה, ובעיקר מוסיף ראיה אמפירית: פעולה על הצרכים האלה משנה, בתוך חצי שנה, את האופן שבו העבודה נתפסת (</w:t>
       </w:r>
       <w:r>
         <w:rPr>
@@ -6588,7 +6588,7 @@
           <w:szCs w:val="24"/>
           <w:rtl/>
         </w:rPr>
-        <w:t xml:space="preserve">גם תיאוריות הקריירה שנלמדו בקורס מתחברות לממצאים. לפי מודל שלבי הקריירה של סופר, כפי שנלמד בניתוח הסרט בקורס, רוב הסטודנטים בכיתה נמצאים בשלב החקירה או הביסוס, שבו עיצוב התפקיד הוא גם דרך לברר מה מתאים להם (דבדבני דקל, 2026ג). לבסוף, העיקרון של בניית תמונת מצב סדורה ומיקוד במה שבשליטה, שנלמד בהקשר של משבר הקורונה (דבדבני דקל, 2026ב), הוא יישום ישיר של חיזוק המובנות והניהוליות.</w:t>
+        <w:t xml:space="preserve">גם תיאוריות הקריירה שנלמדו בקורס מתחברות לממצאים. לפי מודל שלבי הקריירה של סופר, כפי שנלמד בניתוח הסרט בקורס, רוב הסטודנטים בכיתה נמצאים בשלב החקירה או הביסוס, שבו עיצוב התפקיד הוא גם דרך לברר מה מתאים להם. לבסוף, העיקרון של בניית תמונת מצב סדורה ומיקוד במה שבשליטה, שנלמד בהקשר של משבר הקורונה, הוא יישום ישיר של חיזוק המובנות והניהוליות.</w:t>
       </w:r>
     </w:p>
     <w:p>
@@ -9075,57 +9075,6 @@
           <w:szCs w:val="24"/>
         </w:rPr>
         <w:t xml:space="preserve">‎https://www.boi.org.il/publications/pressreleases/11-3-25/‎</w:t>
-      </w:r>
-    </w:p>
-    <w:p>
-      <w:pPr>
-        <w:bidi/>
-        <w:spacing w:after="0" w:line="480"/>
-        <w:ind w:left="709" w:hanging="709"/>
-        <w:jc w:val="right"/>
-      </w:pPr>
-      <w:r>
-        <w:rPr>
-          <w:rFonts w:ascii="David" w:cs="David" w:eastAsia="David" w:hAnsi="David"/>
-          <w:sz w:val="24"/>
-          <w:szCs w:val="24"/>
-          <w:rtl/>
-        </w:rPr>
-        <w:t xml:space="preserve">דבדבני דקל, מ' (2026א). מחזון ורעיון למציאות ממשית [מצגת הרצאה]. ניהול קריירה בארגונים, הקריה האקדמית אונו.</w:t>
-      </w:r>
-    </w:p>
-    <w:p>
-      <w:pPr>
-        <w:bidi/>
-        <w:spacing w:after="0" w:line="480"/>
-        <w:ind w:left="709" w:hanging="709"/>
-        <w:jc w:val="right"/>
-      </w:pPr>
-      <w:r>
-        <w:rPr>
-          <w:rFonts w:ascii="David" w:cs="David" w:eastAsia="David" w:hAnsi="David"/>
-          <w:sz w:val="24"/>
-          <w:szCs w:val="24"/>
-          <w:rtl/>
-        </w:rPr>
-        <w:t xml:space="preserve">דבדבני דקל, מ' (2026ב). עסקים בצל הקורונה: ממשבר להזדמנות, איך עושים את זה? [מצגת הרצאה]. ניהול קריירה בארגונים, הקריה האקדמית אונו.</w:t>
-      </w:r>
-    </w:p>
-    <w:p>
-      <w:pPr>
-        <w:bidi/>
-        <w:spacing w:after="0" w:line="480"/>
-        <w:ind w:left="709" w:hanging="709"/>
-        <w:jc w:val="right"/>
-      </w:pPr>
-      <w:r>
-        <w:rPr>
-          <w:rFonts w:ascii="David" w:cs="David" w:eastAsia="David" w:hAnsi="David"/>
-          <w:sz w:val="24"/>
-          <w:szCs w:val="24"/>
-          <w:rtl/>
-        </w:rPr>
-        <w:t xml:space="preserve">דבדבני דקל, מ' (2026ג). ניתוח הסרט "השטן לובשת פראדה" לפי תיאוריות קריירה [מצגת הרצאה]. ניהול קריירה בארגונים, הקריה האקדמית אונו.</w:t>
       </w:r>
     </w:p>
     <w:p>

</xml_diff>

<commit_message>
Integrate course material, continuous prose in the deck, and the college logo
Add an integrative section linking the article to the course concepts (three
toolkits, professional identity questions, augmented career, Herzberg, career
anchors, Super, Russo et al. 2016), rewrite bullet slides as short cited
paragraphs, add a course-material slide, and place the Ono logo on the paper
cover and the deck.

Co-Authored-By: Claude Fable 5.1 <noreply@anthropic.com>
Claude-Session: https://claude.ai/code/session_01XaGvnsaHG3kPyCY3aGBByx
</commit_message>
<xml_diff>
--- a/career-management-final-project/ניהול קריירה - התמודדות עם חוסר ודאות תעסוקתי - עבודה מסכמת.docx
+++ b/career-management-final-project/ניהול קריירה - התמודדות עם חוסר ודאות תעסוקתי - עבודה מסכמת.docx
@@ -4,8 +4,54 @@
   <w:body>
     <w:p>
       <w:pPr>
-        <w:spacing w:after="500"/>
-      </w:pPr>
+        <w:spacing w:after="200"/>
+      </w:pPr>
+    </w:p>
+    <w:p>
+      <w:pPr>
+        <w:spacing w:after="120"/>
+        <w:jc w:val="center"/>
+      </w:pPr>
+      <w:r>
+        <w:drawing>
+          <wp:inline distT="0" distB="0" distL="0" distR="0">
+            <wp:extent cx="1238250" cy="1238250"/>
+            <wp:effectExtent t="0" r="0" b="0" l="0"/>
+            <wp:docPr id="1" name="" descr="" title=""/>
+            <wp:cNvGraphicFramePr>
+              <a:graphicFrameLocks xmlns:a="http://schemas.openxmlformats.org/drawingml/2006/main" noChangeAspect="1"/>
+            </wp:cNvGraphicFramePr>
+            <a:graphic xmlns:a="http://schemas.openxmlformats.org/drawingml/2006/main">
+              <a:graphicData uri="http://schemas.openxmlformats.org/drawingml/2006/picture">
+                <pic:pic xmlns:pic="http://schemas.openxmlformats.org/drawingml/2006/picture">
+                  <pic:nvPicPr>
+                    <pic:cNvPr id="0" name="" descr=""/>
+                    <pic:cNvPicPr>
+                      <a:picLocks noChangeAspect="1" noChangeArrowheads="1"/>
+                    </pic:cNvPicPr>
+                  </pic:nvPicPr>
+                  <pic:blipFill>
+                    <a:blip r:embed="rId9" cstate="none"/>
+                    <a:srcRect/>
+                    <a:stretch>
+                      <a:fillRect/>
+                    </a:stretch>
+                  </pic:blipFill>
+                  <pic:spPr bwMode="auto">
+                    <a:xfrm>
+                      <a:off x="0" y="0"/>
+                      <a:ext cx="1238250" cy="1238250"/>
+                    </a:xfrm>
+                    <a:prstGeom prst="rect">
+                      <a:avLst/>
+                    </a:prstGeom>
+                  </pic:spPr>
+                </pic:pic>
+              </a:graphicData>
+            </a:graphic>
+          </wp:inline>
+        </w:drawing>
+      </w:r>
     </w:p>
     <w:p>
       <w:pPr>
@@ -100,7 +146,7 @@
     </w:p>
     <w:p>
       <w:pPr>
-        <w:spacing w:after="600"/>
+        <w:spacing w:after="400"/>
       </w:pPr>
     </w:p>
     <w:p>
@@ -622,7 +668,7 @@
               <w:rtl/>
             </w:rPr>
             <w:tab/>
-            <w:t>3</w:t>
+            <w:t>4</w:t>
           </w:r>
         </w:p>
         <w:p>
@@ -652,7 +698,7 @@
               <w:rtl/>
             </w:rPr>
             <w:tab/>
-            <w:t>5</w:t>
+            <w:t>6</w:t>
           </w:r>
         </w:p>
         <w:p>
@@ -682,7 +728,7 @@
               <w:rtl/>
             </w:rPr>
             <w:tab/>
-            <w:t>5</w:t>
+            <w:t>6</w:t>
           </w:r>
         </w:p>
         <w:p>
@@ -712,7 +758,7 @@
               <w:rtl/>
             </w:rPr>
             <w:tab/>
-            <w:t>5</w:t>
+            <w:t>6</w:t>
           </w:r>
         </w:p>
         <w:p>
@@ -742,7 +788,7 @@
               <w:rtl/>
             </w:rPr>
             <w:tab/>
-            <w:t>7</w:t>
+            <w:t>8</w:t>
           </w:r>
         </w:p>
         <w:p>
@@ -772,7 +818,7 @@
               <w:rtl/>
             </w:rPr>
             <w:tab/>
-            <w:t>7</w:t>
+            <w:t>8</w:t>
           </w:r>
         </w:p>
         <w:p>
@@ -802,7 +848,7 @@
               <w:rtl/>
             </w:rPr>
             <w:tab/>
-            <w:t>7</w:t>
+            <w:t>8</w:t>
           </w:r>
         </w:p>
         <w:p>
@@ -832,7 +878,7 @@
               <w:rtl/>
             </w:rPr>
             <w:tab/>
-            <w:t>8</w:t>
+            <w:t>9</w:t>
           </w:r>
         </w:p>
         <w:p>
@@ -862,7 +908,7 @@
               <w:rtl/>
             </w:rPr>
             <w:tab/>
-            <w:t>8</w:t>
+            <w:t>9</w:t>
           </w:r>
         </w:p>
         <w:p>
@@ -892,7 +938,7 @@
               <w:rtl/>
             </w:rPr>
             <w:tab/>
-            <w:t>9</w:t>
+            <w:t>10</w:t>
           </w:r>
         </w:p>
         <w:p>
@@ -922,7 +968,7 @@
               <w:rtl/>
             </w:rPr>
             <w:tab/>
-            <w:t>9</w:t>
+            <w:t>10</w:t>
           </w:r>
         </w:p>
         <w:p>
@@ -952,7 +998,7 @@
               <w:rtl/>
             </w:rPr>
             <w:tab/>
-            <w:t>11</w:t>
+            <w:t>12</w:t>
           </w:r>
         </w:p>
         <w:p>
@@ -982,7 +1028,7 @@
               <w:rtl/>
             </w:rPr>
             <w:tab/>
-            <w:t>11</w:t>
+            <w:t>12</w:t>
           </w:r>
         </w:p>
         <w:p>
@@ -1012,7 +1058,7 @@
               <w:rtl/>
             </w:rPr>
             <w:tab/>
-            <w:t>11</w:t>
+            <w:t>12</w:t>
           </w:r>
         </w:p>
         <w:p>
@@ -1042,7 +1088,7 @@
               <w:rtl/>
             </w:rPr>
             <w:tab/>
-            <w:t>12</w:t>
+            <w:t>13</w:t>
           </w:r>
         </w:p>
         <w:p>
@@ -1072,7 +1118,7 @@
               <w:rtl/>
             </w:rPr>
             <w:tab/>
-            <w:t>13</w:t>
+            <w:t>14</w:t>
           </w:r>
         </w:p>
         <w:p>
@@ -1102,7 +1148,7 @@
               <w:rtl/>
             </w:rPr>
             <w:tab/>
-            <w:t>13</w:t>
+            <w:t>14</w:t>
           </w:r>
         </w:p>
         <w:p>
@@ -1132,7 +1178,7 @@
               <w:rtl/>
             </w:rPr>
             <w:tab/>
-            <w:t>13</w:t>
+            <w:t>14</w:t>
           </w:r>
         </w:p>
         <w:p>
@@ -1162,7 +1208,7 @@
               <w:rtl/>
             </w:rPr>
             <w:tab/>
-            <w:t>14</w:t>
+            <w:t>15</w:t>
           </w:r>
         </w:p>
         <w:p>
@@ -1192,7 +1238,7 @@
               <w:rtl/>
             </w:rPr>
             <w:tab/>
-            <w:t>14</w:t>
+            <w:t>15</w:t>
           </w:r>
         </w:p>
         <w:p>
@@ -1222,7 +1268,7 @@
               <w:rtl/>
             </w:rPr>
             <w:tab/>
-            <w:t>14</w:t>
+            <w:t>15</w:t>
           </w:r>
         </w:p>
         <w:p>
@@ -1252,7 +1298,7 @@
               <w:rtl/>
             </w:rPr>
             <w:tab/>
-            <w:t>15</w:t>
+            <w:t>16</w:t>
           </w:r>
         </w:p>
         <w:p>
@@ -1282,7 +1328,7 @@
               <w:rtl/>
             </w:rPr>
             <w:tab/>
-            <w:t>16</w:t>
+            <w:t>17</w:t>
           </w:r>
         </w:p>
         <w:p>
@@ -1312,7 +1358,7 @@
               <w:rtl/>
             </w:rPr>
             <w:tab/>
-            <w:t>16</w:t>
+            <w:t>17</w:t>
           </w:r>
         </w:p>
         <w:p>
@@ -1332,7 +1378,7 @@
               <w:szCs w:val="24"/>
               <w:rtl/>
             </w:rPr>
-            <w:t xml:space="preserve">6.2 קישור לכלים שנלמדו בקורס</w:t>
+            <w:t xml:space="preserve">6.2 קישור לחומר הנלמד בקורס</w:t>
           </w:r>
           <w:r>
             <w:rPr>
@@ -1342,7 +1388,7 @@
               <w:rtl/>
             </w:rPr>
             <w:tab/>
-            <w:t>16</w:t>
+            <w:t>17</w:t>
           </w:r>
         </w:p>
         <w:p>
@@ -1372,7 +1418,7 @@
               <w:rtl/>
             </w:rPr>
             <w:tab/>
-            <w:t>17</w:t>
+            <w:t>18</w:t>
           </w:r>
         </w:p>
         <w:p>
@@ -1402,7 +1448,7 @@
               <w:rtl/>
             </w:rPr>
             <w:tab/>
-            <w:t>17</w:t>
+            <w:t>19</w:t>
           </w:r>
         </w:p>
         <w:p>
@@ -1432,7 +1478,7 @@
               <w:rtl/>
             </w:rPr>
             <w:tab/>
-            <w:t>18</w:t>
+            <w:t>20</w:t>
           </w:r>
         </w:p>
         <w:p>
@@ -1462,7 +1508,7 @@
               <w:rtl/>
             </w:rPr>
             <w:tab/>
-            <w:t>19</w:t>
+            <w:t>21</w:t>
           </w:r>
         </w:p>
         <w:p>
@@ -1492,7 +1538,7 @@
               <w:rtl/>
             </w:rPr>
             <w:tab/>
-            <w:t>19</w:t>
+            <w:t>21</w:t>
           </w:r>
         </w:p>
         <w:p>
@@ -1522,7 +1568,7 @@
               <w:rtl/>
             </w:rPr>
             <w:tab/>
-            <w:t>20</w:t>
+            <w:t>22</w:t>
           </w:r>
         </w:p>
         <w:p>
@@ -1552,7 +1598,7 @@
               <w:rtl/>
             </w:rPr>
             <w:tab/>
-            <w:t>21</w:t>
+            <w:t>23</w:t>
           </w:r>
         </w:p>
         <w:p>
@@ -1667,7 +1713,24 @@
           <w:szCs w:val="24"/>
           <w:rtl/>
         </w:rPr>
-        <w:t xml:space="preserve">). ניהול קריירה, כפי שנלמד בקורס, הוא תהליך מתמשך של למידה, בניית זהות מקצועית וטיפוח רשת אנשים. תהליך כזה מניח מידה של יציבות. בעולם של אי-ודאות, השאלה היא אילו אסטרטגיות זמינות לעובד עצמו, ולא רק לארגון.</w:t>
+        <w:t xml:space="preserve">). ניהול קריירה, כפי שנלמד בקורס, הוא תהליך מתמשך של למידה, בניית זהות מקצועית וטיפוח רשת אנשים, והוא נשען על משאבים שהסביבה מספקת, כגון תמיכה במקום העבודה ובמשפחה (</w:t>
+      </w:r>
+      <w:r>
+        <w:rPr>
+          <w:rFonts w:ascii="Times New Roman" w:cs="Times New Roman" w:eastAsia="Times New Roman" w:hAnsi="Times New Roman"/>
+          <w:sz w:val="24"/>
+          <w:szCs w:val="24"/>
+        </w:rPr>
+        <w:t xml:space="preserve">‎Russo et al., 2016‎</w:t>
+      </w:r>
+      <w:r>
+        <w:rPr>
+          <w:rFonts w:ascii="David" w:cs="David" w:eastAsia="David" w:hAnsi="David"/>
+          <w:sz w:val="24"/>
+          <w:szCs w:val="24"/>
+          <w:rtl/>
+        </w:rPr>
+        <w:t xml:space="preserve">). תהליך כזה מניח מידה של יציבות. בעולם של אי-ודאות, השאלה היא אילו אסטרטגיות זמינות לעובד עצמו, ולא רק לארגון.</w:t>
       </w:r>
     </w:p>
     <w:p>
@@ -6539,7 +6602,7 @@
           <w:szCs w:val="28"/>
           <w:rtl/>
         </w:rPr>
-        <w:t xml:space="preserve">6.2 קישור לכלים שנלמדו בקורס</w:t>
+        <w:t xml:space="preserve">6.2 קישור לחומר הנלמד בקורס</w:t>
       </w:r>
     </w:p>
     <w:p>
@@ -6555,7 +6618,7 @@
           <w:szCs w:val="24"/>
           <w:rtl/>
         </w:rPr>
-        <w:t xml:space="preserve">שלושת "סלי הכלים" שנלמדו בקורס, רשת אנשים, זהות מקצועית והתפתחות, מקבילים כמעט אחד לאחד לצרכי ההתקרבות. סל רשת האנשים הוא צורך השייכות. סל ההתפתחות, ובמרכזו תוכנית למידה שנתית, הוא צורך המיומנות. סל הזהות המקצועית, שמגדיר את הערך שהעובד מביא ללא תלות בארגון, הוא צורך המשמעות. המאמר מוסיף לשלושה את האוטונומיה, ובעיקר מוסיף ראיה אמפירית: פעולה על הצרכים האלה משנה, בתוך חצי שנה, את האופן שבו העבודה נתפסת (</w:t>
+        <w:t xml:space="preserve">המאמר אינו זר לחומר הקורס אלא מעניק לו בסיס אמפירי. שלושת "סלי הכלים" לניהול קריירה שנלמדו בקורס, רשת אנשים, זהות מקצועית והתפתחות, מקבילים כמעט אחד לאחד לצרכי ההתקרבות שנמצאו כבונים תחושת קוהרנטיות. סל רשת האנשים הוא צורך השייכות, סל ההתפתחות, ובמרכזו תוכנית למידה שנתית, הוא צורך המיומנות, וסל הזהות המקצועית הוא צורך המשמעות. חמש השאלות של הזהות המקצועית שנלמדו בקורס, איזה ערך אני מביא, עם מי עליי לשתף פעולה, מי זקוק לערך הזה, איך הוא מכונה וכיצד מיידעים שאני קיים, הן למעשה תרגיל מובנה של עיצוב תפקיד לצורך המשמעות. המאמר מוסיף לשלושת הסלים את צורך האוטונומיה, ובעיקר מוסיף ראיה: פעולה על הצרכים האלה משנה, בתוך חצי שנה, את האופן שבו העבודה נתפסת (</w:t>
       </w:r>
       <w:r>
         <w:rPr>
@@ -6588,7 +6651,57 @@
           <w:szCs w:val="24"/>
           <w:rtl/>
         </w:rPr>
-        <w:t xml:space="preserve">גם תיאוריות הקריירה שנלמדו בקורס מתחברות לממצאים. לפי מודל שלבי הקריירה של סופר, כפי שנלמד בניתוח הסרט בקורס, רוב הסטודנטים בכיתה נמצאים בשלב החקירה או הביסוס, שבו עיצוב התפקיד הוא גם דרך לברר מה מתאים להם. לבסוף, העיקרון של בניית תמונת מצב סדורה ומיקוד במה שבשליטה, שנלמד בהקשר של משבר הקורונה, הוא יישום ישיר של חיזוק המובנות והניהוליות.</w:t>
+        <w:t xml:space="preserve">גם תפיסת מסע הקריירה שנלמדה בקורס מתחברת לממצאים. הרעיון של קריירה רבודה, שבה קריירות נבנות זו על זו ומרחיבות את הניסיון והיכולות, והדימוי של הקריירה כקיר טיפוס שבו יש להחליט היכן להניח את הצעד הבא, הם תיאור מדויק של ספירלת הרווח שהמחקר מתעד: כל צעד של עיצוב תפקיד מגדיל את המשאבים ומאפשר את הצעד הבא. תיאוריית שני הגורמים של הרצברג, שנלמדה בניתוח הסרט בקורס, מסבירה מדוע דווקא צרכי ההתקרבות בונים משמעותיות: הגורמים המניעים שלו, הישג, הכרה והעבודה עצמה, חופפים לצרכי המיומנות והמשמעות, ואילו הגורמים ההיגייניים, כמו תנאים ונוחות, דומים לצרכי ההימנעות שלא שינו את תפיסת העבודה (</w:t>
+      </w:r>
+      <w:r>
+        <w:rPr>
+          <w:rFonts w:ascii="Times New Roman" w:cs="Times New Roman" w:eastAsia="Times New Roman" w:hAnsi="Times New Roman"/>
+          <w:sz w:val="24"/>
+          <w:szCs w:val="24"/>
+        </w:rPr>
+        <w:t xml:space="preserve">‎Cetkovská et al., 2026‎</w:t>
+      </w:r>
+      <w:r>
+        <w:rPr>
+          <w:rFonts w:ascii="David" w:cs="David" w:eastAsia="David" w:hAnsi="David"/>
+          <w:sz w:val="24"/>
+          <w:szCs w:val="24"/>
+          <w:rtl/>
+        </w:rPr>
+        <w:t xml:space="preserve">).</w:t>
+      </w:r>
+    </w:p>
+    <w:p>
+      <w:pPr>
+        <w:bidi/>
+        <w:spacing w:after="120" w:before="0" w:line="480"/>
+        <w:jc w:val="both"/>
+      </w:pPr>
+      <w:r>
+        <w:rPr>
+          <w:rFonts w:ascii="David" w:cs="David" w:eastAsia="David" w:hAnsi="David"/>
+          <w:sz w:val="24"/>
+          <w:szCs w:val="24"/>
+          <w:rtl/>
+        </w:rPr>
+        <w:t xml:space="preserve">מודל עוגני הקריירה שנלמד בקורס מסביר מדוע עובדים שונים ירוויחו מצרכים שונים. מי שעוגן האוטונומיה דומיננטי אצלו ימצא בעיצוב תפקיד לצורך האוטונומיה סיפוק מיוחד, ואילו מי שעוגן הביטחון והיציבות דומיננטי אצלו יפיק תועלת בעיקר מחיזוק המובנות, כלומר מהפיכת העבודה לצפויה וברורה יותר. לפי מודל שלבי הקריירה של סופר, שנלמד אף הוא בניתוח הסרט, רוב הסטודנטים בכיתה נמצאים בשלב החקירה או הביסוס, שבו עיצוב התפקיד הוא גם דרך לברר מה מתאים להם. לבסוף, מאמר החובה בקורס מראה שתמיכה במקום העבודה ובמשפחה משפרת את הזמינות הפסיכולוגית ואת האנרגיה בעבודה (</w:t>
+      </w:r>
+      <w:r>
+        <w:rPr>
+          <w:rFonts w:ascii="Times New Roman" w:cs="Times New Roman" w:eastAsia="Times New Roman" w:hAnsi="Times New Roman"/>
+          <w:sz w:val="24"/>
+          <w:szCs w:val="24"/>
+        </w:rPr>
+        <w:t xml:space="preserve">‎Russo et al., 2016‎</w:t>
+      </w:r>
+      <w:r>
+        <w:rPr>
+          <w:rFonts w:ascii="David" w:cs="David" w:eastAsia="David" w:hAnsi="David"/>
+          <w:sz w:val="24"/>
+          <w:szCs w:val="24"/>
+          <w:rtl/>
+        </w:rPr>
+        <w:t xml:space="preserve">). זהו בדיוק הרכיב שהמאמר המרכזי מזהה כמנוע ליוזמה, תחושת הניהוליות, ומכאן שתמיכה מהסביבה ועיצוב תפקיד יזום מזינים זה את זה. העיקרון של בניית תמונת מצב סדורה ומיקוד במה שבשליטה, שנלמד בהקשר של משבר הקורונה, הוא יישום ישיר של חיזוק המובנות והניהוליות.</w:t>
       </w:r>
     </w:p>
     <w:p>
@@ -6762,7 +6875,7 @@
           <w:szCs w:val="24"/>
           <w:rtl/>
         </w:rPr>
-        <w:t xml:space="preserve">), טבלת תוכנית עיצוב התפקיד והפעלה אישית קצרה שבה כל סטודנט בוחר צורך אחד ופעולה אחת.</w:t>
+        <w:t xml:space="preserve">), טבלת החיבור לחומר הקורס, טבלת תוכנית עיצוב התפקיד והפעלה אישית קצרה שבה כל סטודנט בוחר צורך אחד ופעולה אחת.</w:t>
       </w:r>
     </w:p>
     <w:p>
@@ -7422,7 +7535,7 @@
                 <w:szCs w:val="22"/>
                 <w:rtl/>
               </w:rPr>
-              <w:t xml:space="preserve">5:00-6:00</w:t>
+              <w:t xml:space="preserve">5:00-6:30</w:t>
             </w:r>
           </w:p>
         </w:tc>
@@ -7456,7 +7569,7 @@
                 <w:szCs w:val="22"/>
                 <w:rtl/>
               </w:rPr>
-              <w:t xml:space="preserve">המאמר המשלים ותובנות: בינה מלאכותית, חוסן קריירה, "המשאבים קודמים ליוזמה", דעה אישית</w:t>
+              <w:t xml:space="preserve">המאמר המשלים, חיבור לחומר הקורס ותובנות: בינה מלאכותית, חוסן קריירה, סלי הכלים, הרצברג, עוגני קריירה, "המשאבים קודמים ליוזמה"</w:t>
             </w:r>
           </w:p>
         </w:tc>
@@ -7490,7 +7603,7 @@
                 <w:szCs w:val="22"/>
                 <w:rtl/>
               </w:rPr>
-              <w:t xml:space="preserve">שקופית מעגל המשאבים</w:t>
+              <w:t xml:space="preserve">שקופית מעגל המשאבים, טבלת חיבור לחומר הקורס</w:t>
             </w:r>
           </w:p>
         </w:tc>
@@ -7526,7 +7639,7 @@
                 <w:szCs w:val="22"/>
                 <w:rtl/>
               </w:rPr>
-              <w:t xml:space="preserve">6:00-7:30</w:t>
+              <w:t xml:space="preserve">6:30-7:45</w:t>
             </w:r>
           </w:p>
         </w:tc>
@@ -7560,7 +7673,7 @@
                 <w:szCs w:val="22"/>
                 <w:rtl/>
               </w:rPr>
-              <w:t xml:space="preserve">סרטון: קטע של 90 שניות מהרצאת </w:t>
+              <w:t xml:space="preserve">סרטון: קטע של 75 שניות מהרצאת </w:t>
             </w:r>
             <w:r>
               <w:rPr>
@@ -7664,7 +7777,7 @@
                 <w:szCs w:val="22"/>
                 <w:rtl/>
               </w:rPr>
-              <w:t xml:space="preserve">7:30-9:00</w:t>
+              <w:t xml:space="preserve">7:45-9:00</w:t>
             </w:r>
           </w:p>
         </w:tc>
@@ -9248,6 +9361,44 @@
           <w:szCs w:val="24"/>
         </w:rPr>
         <w:t xml:space="preserve"> [Video]. TED Conferences. https://www.ted.com/talks/lucy_hone_the_three_secrets_of_resilient_people</w:t>
+      </w:r>
+    </w:p>
+    <w:p>
+      <w:pPr>
+        <w:bidi w:val="false"/>
+        <w:spacing w:after="0" w:line="480"/>
+        <w:ind w:left="709" w:hanging="709"/>
+        <w:jc w:val="left"/>
+      </w:pPr>
+      <w:r>
+        <w:rPr>
+          <w:rFonts w:ascii="Times New Roman" w:cs="Times New Roman" w:eastAsia="Times New Roman" w:hAnsi="Times New Roman"/>
+          <w:i w:val="false"/>
+          <w:iCs w:val="false"/>
+          <w:sz w:val="24"/>
+          <w:szCs w:val="24"/>
+        </w:rPr>
+        <w:t xml:space="preserve">Russo, M., Shteigman, A., &amp; Carmeli, A. (2016). Workplace and family support and work-life balance: Implications for individual psychological availability and energy at work. </w:t>
+      </w:r>
+      <w:r>
+        <w:rPr>
+          <w:rFonts w:ascii="Times New Roman" w:cs="Times New Roman" w:eastAsia="Times New Roman" w:hAnsi="Times New Roman"/>
+          <w:i/>
+          <w:iCs/>
+          <w:sz w:val="24"/>
+          <w:szCs w:val="24"/>
+        </w:rPr>
+        <w:t xml:space="preserve">The Journal of Positive Psychology, 11</w:t>
+      </w:r>
+      <w:r>
+        <w:rPr>
+          <w:rFonts w:ascii="Times New Roman" w:cs="Times New Roman" w:eastAsia="Times New Roman" w:hAnsi="Times New Roman"/>
+          <w:i w:val="false"/>
+          <w:iCs w:val="false"/>
+          <w:sz w:val="24"/>
+          <w:szCs w:val="24"/>
+        </w:rPr>
+        <w:t xml:space="preserve">(2), 173-188. https://doi.org/10.1080/17439760.2015.1025424</w:t>
       </w:r>
     </w:p>
     <w:sectPr>

</xml_diff>

<commit_message>
Drop URLs from Hebrew reference entries per the college APA guide
Co-Authored-By: Claude Fable 5.1 <noreply@anthropic.com>
Claude-Session: https://claude.ai/code/session_01XaGvnsaHG3kPyCY3aGBByx
</commit_message>
<xml_diff>
--- a/career-management-final-project/ניהול קריירה - התמודדות עם חוסר ודאות תעסוקתי - עבודה מסכמת.docx
+++ b/career-management-final-project/ניהול קריירה - התמודדות עם חוסר ודאות תעסוקתי - עבודה מסכמת.docx
@@ -9179,15 +9179,7 @@
           <w:szCs w:val="24"/>
           <w:rtl/>
         </w:rPr>
-        <w:t xml:space="preserve">בנק ישראל. (2025, 11 במרץ). ההשפעה הצפויה של בינה מלאכותית יוצרת על העובדים: השלכות על המדיניות בשוק העבודה [תיבה מתוך דוח בנק ישראל לשנת 2024]. </w:t>
-      </w:r>
-      <w:r>
-        <w:rPr>
-          <w:rFonts w:ascii="Times New Roman" w:cs="Times New Roman" w:eastAsia="Times New Roman" w:hAnsi="Times New Roman"/>
-          <w:sz w:val="24"/>
-          <w:szCs w:val="24"/>
-        </w:rPr>
-        <w:t xml:space="preserve">‎https://www.boi.org.il/publications/pressreleases/11-3-25/‎</w:t>
+        <w:t xml:space="preserve">בנק ישראל. (2025, 11 במרץ). ההשפעה הצפויה של בינה מלאכותית יוצרת על העובדים: השלכות על המדיניות בשוק העבודה [תיבה מתוך דוח בנק ישראל לשנת 2024].</w:t>
       </w:r>
     </w:p>
     <w:p>
@@ -9238,15 +9230,7 @@
           <w:szCs w:val="24"/>
           <w:rtl/>
         </w:rPr>
-        <w:t xml:space="preserve">. </w:t>
-      </w:r>
-      <w:r>
-        <w:rPr>
-          <w:rFonts w:ascii="Times New Roman" w:cs="Times New Roman" w:eastAsia="Times New Roman" w:hAnsi="Times New Roman"/>
-          <w:sz w:val="24"/>
-          <w:szCs w:val="24"/>
-        </w:rPr>
-        <w:t xml:space="preserve">‎https://www.themarker.com/career/2026-06-21/ty-article/.premium/0000019e-e3b1-d2b1-a5bf-fbb76dff0000‎</w:t>
+        <w:t xml:space="preserve">.</w:t>
       </w:r>
     </w:p>
     <w:p>

</xml_diff>

<commit_message>
Add submitter details, rebuild deck without tables in a light design
Co-Authored-By: Claude Fable 5.1 <noreply@anthropic.com>
Claude-Session: https://claude.ai/code/session_01XaGvnsaHG3kPyCY3aGBByx
</commit_message>
<xml_diff>
--- a/career-management-final-project/ניהול קריירה - התמודדות עם חוסר ודאות תעסוקתי - עבודה מסכמת.docx
+++ b/career-management-final-project/ניהול קריירה - התמודדות עם חוסר ודאות תעסוקתי - עבודה מסכמת.docx
@@ -240,312 +240,40 @@
         <w:spacing w:after="400"/>
       </w:pPr>
     </w:p>
-    <w:tbl>
-      <w:tblPr>
-        <w:bidiVisual/>
-        <w:tblW w:type="dxa" w:w="7200"/>
+    <w:p>
+      <w:pPr>
+        <w:bidi/>
+        <w:spacing w:after="60" w:line="360"/>
         <w:jc w:val="center"/>
-        <w:tblBorders>
-          <w:top w:val="single" w:color="auto" w:sz="4"/>
-          <w:left w:val="single" w:color="auto" w:sz="4"/>
-          <w:bottom w:val="single" w:color="auto" w:sz="4"/>
-          <w:right w:val="single" w:color="auto" w:sz="4"/>
-          <w:insideH w:val="single" w:color="auto" w:sz="4"/>
-          <w:insideV w:val="single" w:color="auto" w:sz="4"/>
-        </w:tblBorders>
-      </w:tblPr>
-      <w:tblGrid>
-        <w:gridCol w:w="3600"/>
-        <w:gridCol w:w="3600"/>
-      </w:tblGrid>
-      <w:tr>
-        <w:trPr>
-          <w:tblHeader/>
-        </w:trPr>
-        <w:tc>
-          <w:tcPr>
-            <w:tcW w:type="dxa" w:w="3600"/>
-            <w:tcBorders>
-              <w:top w:val="single" w:color="A6A6A6" w:sz="6"/>
-              <w:left w:val="single" w:color="A6A6A6" w:sz="6"/>
-              <w:bottom w:val="single" w:color="A6A6A6" w:sz="6"/>
-              <w:right w:val="single" w:color="A6A6A6" w:sz="6"/>
-            </w:tcBorders>
-            <w:tcMar>
-              <w:top w:type="dxa" w:w="80"/>
-              <w:left w:type="dxa" w:w="100"/>
-              <w:bottom w:type="dxa" w:w="80"/>
-              <w:right w:type="dxa" w:w="100"/>
-            </w:tcMar>
-            <w:vAlign w:val="center"/>
-          </w:tcPr>
-          <w:p>
-            <w:pPr>
-              <w:bidi/>
-              <w:spacing w:after="40" w:line="276"/>
-              <w:jc w:val="center"/>
-            </w:pPr>
-            <w:r>
-              <w:rPr>
-                <w:rFonts w:ascii="David" w:cs="David" w:eastAsia="David" w:hAnsi="David"/>
-                <w:b/>
-                <w:bCs/>
-                <w:sz w:val="22"/>
-                <w:szCs w:val="22"/>
-                <w:rtl/>
-              </w:rPr>
-              <w:t xml:space="preserve">שם המגיש/ה</w:t>
-            </w:r>
-          </w:p>
-        </w:tc>
-        <w:tc>
-          <w:tcPr>
-            <w:tcW w:type="dxa" w:w="3600"/>
-            <w:tcBorders>
-              <w:top w:val="single" w:color="A6A6A6" w:sz="6"/>
-              <w:left w:val="single" w:color="A6A6A6" w:sz="6"/>
-              <w:bottom w:val="single" w:color="A6A6A6" w:sz="6"/>
-              <w:right w:val="single" w:color="A6A6A6" w:sz="6"/>
-            </w:tcBorders>
-            <w:tcMar>
-              <w:top w:type="dxa" w:w="80"/>
-              <w:left w:type="dxa" w:w="100"/>
-              <w:bottom w:type="dxa" w:w="80"/>
-              <w:right w:type="dxa" w:w="100"/>
-            </w:tcMar>
-            <w:vAlign w:val="center"/>
-          </w:tcPr>
-          <w:p>
-            <w:pPr>
-              <w:bidi/>
-              <w:spacing w:after="40" w:line="276"/>
-              <w:jc w:val="center"/>
-            </w:pPr>
-            <w:r>
-              <w:rPr>
-                <w:rFonts w:ascii="David" w:cs="David" w:eastAsia="David" w:hAnsi="David"/>
-                <w:b/>
-                <w:bCs/>
-                <w:sz w:val="22"/>
-                <w:szCs w:val="22"/>
-                <w:rtl/>
-              </w:rPr>
-              <w:t xml:space="preserve">מספר תעודת זהות</w:t>
-            </w:r>
-          </w:p>
-        </w:tc>
-      </w:tr>
-      <w:tr>
-        <w:tc>
-          <w:tcPr>
-            <w:tcW w:type="dxa" w:w="3600"/>
-            <w:tcBorders>
-              <w:top w:val="single" w:color="A6A6A6" w:sz="6"/>
-              <w:left w:val="single" w:color="A6A6A6" w:sz="6"/>
-              <w:bottom w:val="single" w:color="A6A6A6" w:sz="6"/>
-              <w:right w:val="single" w:color="A6A6A6" w:sz="6"/>
-            </w:tcBorders>
-            <w:tcMar>
-              <w:top w:type="dxa" w:w="80"/>
-              <w:left w:type="dxa" w:w="100"/>
-              <w:bottom w:type="dxa" w:w="80"/>
-              <w:right w:type="dxa" w:w="100"/>
-            </w:tcMar>
-            <w:vAlign w:val="center"/>
-          </w:tcPr>
-          <w:p>
-            <w:pPr>
-              <w:bidi/>
-              <w:spacing w:after="40" w:line="276"/>
-              <w:jc w:val="center"/>
-            </w:pPr>
-            <w:r>
-              <w:rPr>
-                <w:rFonts w:ascii="David" w:cs="David" w:eastAsia="David" w:hAnsi="David"/>
-                <w:sz w:val="22"/>
-                <w:szCs w:val="22"/>
-                <w:rtl/>
-              </w:rPr>
-              <w:t xml:space="preserve">[שם מלא]</w:t>
-            </w:r>
-          </w:p>
-        </w:tc>
-        <w:tc>
-          <w:tcPr>
-            <w:tcW w:type="dxa" w:w="3600"/>
-            <w:tcBorders>
-              <w:top w:val="single" w:color="A6A6A6" w:sz="6"/>
-              <w:left w:val="single" w:color="A6A6A6" w:sz="6"/>
-              <w:bottom w:val="single" w:color="A6A6A6" w:sz="6"/>
-              <w:right w:val="single" w:color="A6A6A6" w:sz="6"/>
-            </w:tcBorders>
-            <w:tcMar>
-              <w:top w:type="dxa" w:w="80"/>
-              <w:left w:type="dxa" w:w="100"/>
-              <w:bottom w:type="dxa" w:w="80"/>
-              <w:right w:type="dxa" w:w="100"/>
-            </w:tcMar>
-            <w:vAlign w:val="center"/>
-          </w:tcPr>
-          <w:p>
-            <w:pPr>
-              <w:bidi/>
-              <w:spacing w:after="40" w:line="276"/>
-              <w:jc w:val="center"/>
-            </w:pPr>
-            <w:r>
-              <w:rPr>
-                <w:rFonts w:ascii="David" w:cs="David" w:eastAsia="David" w:hAnsi="David"/>
-                <w:sz w:val="22"/>
-                <w:szCs w:val="22"/>
-                <w:rtl/>
-              </w:rPr>
-              <w:t xml:space="preserve">[ת.ז.]</w:t>
-            </w:r>
-          </w:p>
-        </w:tc>
-      </w:tr>
-      <w:tr>
-        <w:tc>
-          <w:tcPr>
-            <w:tcW w:type="dxa" w:w="3600"/>
-            <w:tcBorders>
-              <w:top w:val="single" w:color="A6A6A6" w:sz="6"/>
-              <w:left w:val="single" w:color="A6A6A6" w:sz="6"/>
-              <w:bottom w:val="single" w:color="A6A6A6" w:sz="6"/>
-              <w:right w:val="single" w:color="A6A6A6" w:sz="6"/>
-            </w:tcBorders>
-            <w:tcMar>
-              <w:top w:type="dxa" w:w="80"/>
-              <w:left w:type="dxa" w:w="100"/>
-              <w:bottom w:type="dxa" w:w="80"/>
-              <w:right w:type="dxa" w:w="100"/>
-            </w:tcMar>
-            <w:vAlign w:val="center"/>
-          </w:tcPr>
-          <w:p>
-            <w:pPr>
-              <w:bidi/>
-              <w:spacing w:after="40" w:line="276"/>
-              <w:jc w:val="center"/>
-            </w:pPr>
-            <w:r>
-              <w:rPr>
-                <w:rFonts w:ascii="David" w:cs="David" w:eastAsia="David" w:hAnsi="David"/>
-                <w:sz w:val="22"/>
-                <w:szCs w:val="22"/>
-                <w:rtl/>
-              </w:rPr>
-              <w:t xml:space="preserve">[שם מלא]</w:t>
-            </w:r>
-          </w:p>
-        </w:tc>
-        <w:tc>
-          <w:tcPr>
-            <w:tcW w:type="dxa" w:w="3600"/>
-            <w:tcBorders>
-              <w:top w:val="single" w:color="A6A6A6" w:sz="6"/>
-              <w:left w:val="single" w:color="A6A6A6" w:sz="6"/>
-              <w:bottom w:val="single" w:color="A6A6A6" w:sz="6"/>
-              <w:right w:val="single" w:color="A6A6A6" w:sz="6"/>
-            </w:tcBorders>
-            <w:tcMar>
-              <w:top w:type="dxa" w:w="80"/>
-              <w:left w:type="dxa" w:w="100"/>
-              <w:bottom w:type="dxa" w:w="80"/>
-              <w:right w:type="dxa" w:w="100"/>
-            </w:tcMar>
-            <w:vAlign w:val="center"/>
-          </w:tcPr>
-          <w:p>
-            <w:pPr>
-              <w:bidi/>
-              <w:spacing w:after="40" w:line="276"/>
-              <w:jc w:val="center"/>
-            </w:pPr>
-            <w:r>
-              <w:rPr>
-                <w:rFonts w:ascii="David" w:cs="David" w:eastAsia="David" w:hAnsi="David"/>
-                <w:sz w:val="22"/>
-                <w:szCs w:val="22"/>
-                <w:rtl/>
-              </w:rPr>
-              <w:t xml:space="preserve">[ת.ז.]</w:t>
-            </w:r>
-          </w:p>
-        </w:tc>
-      </w:tr>
-      <w:tr>
-        <w:tc>
-          <w:tcPr>
-            <w:tcW w:type="dxa" w:w="3600"/>
-            <w:tcBorders>
-              <w:top w:val="single" w:color="A6A6A6" w:sz="6"/>
-              <w:left w:val="single" w:color="A6A6A6" w:sz="6"/>
-              <w:bottom w:val="single" w:color="A6A6A6" w:sz="6"/>
-              <w:right w:val="single" w:color="A6A6A6" w:sz="6"/>
-            </w:tcBorders>
-            <w:tcMar>
-              <w:top w:type="dxa" w:w="80"/>
-              <w:left w:type="dxa" w:w="100"/>
-              <w:bottom w:type="dxa" w:w="80"/>
-              <w:right w:type="dxa" w:w="100"/>
-            </w:tcMar>
-            <w:vAlign w:val="center"/>
-          </w:tcPr>
-          <w:p>
-            <w:pPr>
-              <w:bidi/>
-              <w:spacing w:after="40" w:line="276"/>
-              <w:jc w:val="center"/>
-            </w:pPr>
-            <w:r>
-              <w:rPr>
-                <w:rFonts w:ascii="David" w:cs="David" w:eastAsia="David" w:hAnsi="David"/>
-                <w:sz w:val="22"/>
-                <w:szCs w:val="22"/>
-                <w:rtl/>
-              </w:rPr>
-              <w:t xml:space="preserve">[שם מלא, אם ההגשה בשלשה]</w:t>
-            </w:r>
-          </w:p>
-        </w:tc>
-        <w:tc>
-          <w:tcPr>
-            <w:tcW w:type="dxa" w:w="3600"/>
-            <w:tcBorders>
-              <w:top w:val="single" w:color="A6A6A6" w:sz="6"/>
-              <w:left w:val="single" w:color="A6A6A6" w:sz="6"/>
-              <w:bottom w:val="single" w:color="A6A6A6" w:sz="6"/>
-              <w:right w:val="single" w:color="A6A6A6" w:sz="6"/>
-            </w:tcBorders>
-            <w:tcMar>
-              <w:top w:type="dxa" w:w="80"/>
-              <w:left w:type="dxa" w:w="100"/>
-              <w:bottom w:type="dxa" w:w="80"/>
-              <w:right w:type="dxa" w:w="100"/>
-            </w:tcMar>
-            <w:vAlign w:val="center"/>
-          </w:tcPr>
-          <w:p>
-            <w:pPr>
-              <w:bidi/>
-              <w:spacing w:after="40" w:line="276"/>
-              <w:jc w:val="center"/>
-            </w:pPr>
-            <w:r>
-              <w:rPr>
-                <w:rFonts w:ascii="David" w:cs="David" w:eastAsia="David" w:hAnsi="David"/>
-                <w:sz w:val="22"/>
-                <w:szCs w:val="22"/>
-                <w:rtl/>
-              </w:rPr>
-              <w:t xml:space="preserve">[ת.ז.]</w:t>
-            </w:r>
-          </w:p>
-        </w:tc>
-      </w:tr>
-    </w:tbl>
+      </w:pPr>
+      <w:r>
+        <w:rPr>
+          <w:rFonts w:ascii="David" w:cs="David" w:eastAsia="David" w:hAnsi="David"/>
+          <w:b/>
+          <w:bCs/>
+          <w:sz w:val="26"/>
+          <w:szCs w:val="26"/>
+          <w:rtl/>
+        </w:rPr>
+        <w:t xml:space="preserve">מגיש/ה: דוחה עמאש</w:t>
+      </w:r>
+    </w:p>
+    <w:p>
+      <w:pPr>
+        <w:bidi/>
+        <w:spacing w:after="120" w:line="360"/>
+        <w:jc w:val="center"/>
+      </w:pPr>
+      <w:r>
+        <w:rPr>
+          <w:rFonts w:ascii="David" w:cs="David" w:eastAsia="David" w:hAnsi="David"/>
+          <w:sz w:val="24"/>
+          <w:szCs w:val="24"/>
+          <w:rtl/>
+        </w:rPr>
+        <w:t xml:space="preserve">מספר תעודת זהות: 208121137</w:t>
+      </w:r>
+    </w:p>
     <w:p>
       <w:pPr>
         <w:spacing w:after="400"/>
@@ -668,7 +396,7 @@
               <w:rtl/>
             </w:rPr>
             <w:tab/>
-            <w:t>4</w:t>
+            <w:t>3</w:t>
           </w:r>
         </w:p>
         <w:p>
@@ -698,7 +426,7 @@
               <w:rtl/>
             </w:rPr>
             <w:tab/>
-            <w:t>6</w:t>
+            <w:t>5</w:t>
           </w:r>
         </w:p>
         <w:p>
@@ -728,7 +456,7 @@
               <w:rtl/>
             </w:rPr>
             <w:tab/>
-            <w:t>6</w:t>
+            <w:t>5</w:t>
           </w:r>
         </w:p>
         <w:p>
@@ -758,7 +486,7 @@
               <w:rtl/>
             </w:rPr>
             <w:tab/>
-            <w:t>6</w:t>
+            <w:t>5</w:t>
           </w:r>
         </w:p>
         <w:p>
@@ -788,7 +516,7 @@
               <w:rtl/>
             </w:rPr>
             <w:tab/>
-            <w:t>8</w:t>
+            <w:t>7</w:t>
           </w:r>
         </w:p>
         <w:p>
@@ -818,7 +546,7 @@
               <w:rtl/>
             </w:rPr>
             <w:tab/>
-            <w:t>8</w:t>
+            <w:t>7</w:t>
           </w:r>
         </w:p>
         <w:p>
@@ -848,7 +576,7 @@
               <w:rtl/>
             </w:rPr>
             <w:tab/>
-            <w:t>8</w:t>
+            <w:t>7</w:t>
           </w:r>
         </w:p>
         <w:p>
@@ -878,7 +606,7 @@
               <w:rtl/>
             </w:rPr>
             <w:tab/>
-            <w:t>9</w:t>
+            <w:t>8</w:t>
           </w:r>
         </w:p>
         <w:p>
@@ -908,7 +636,7 @@
               <w:rtl/>
             </w:rPr>
             <w:tab/>
-            <w:t>9</w:t>
+            <w:t>8</w:t>
           </w:r>
         </w:p>
         <w:p>
@@ -938,7 +666,7 @@
               <w:rtl/>
             </w:rPr>
             <w:tab/>
-            <w:t>10</w:t>
+            <w:t>9</w:t>
           </w:r>
         </w:p>
         <w:p>
@@ -968,7 +696,7 @@
               <w:rtl/>
             </w:rPr>
             <w:tab/>
-            <w:t>10</w:t>
+            <w:t>9</w:t>
           </w:r>
         </w:p>
         <w:p>
@@ -998,7 +726,7 @@
               <w:rtl/>
             </w:rPr>
             <w:tab/>
-            <w:t>12</w:t>
+            <w:t>11</w:t>
           </w:r>
         </w:p>
         <w:p>
@@ -1028,7 +756,7 @@
               <w:rtl/>
             </w:rPr>
             <w:tab/>
-            <w:t>12</w:t>
+            <w:t>11</w:t>
           </w:r>
         </w:p>
         <w:p>
@@ -1058,7 +786,7 @@
               <w:rtl/>
             </w:rPr>
             <w:tab/>
-            <w:t>12</w:t>
+            <w:t>11</w:t>
           </w:r>
         </w:p>
         <w:p>
@@ -1088,7 +816,7 @@
               <w:rtl/>
             </w:rPr>
             <w:tab/>
-            <w:t>13</w:t>
+            <w:t>12</w:t>
           </w:r>
         </w:p>
         <w:p>
@@ -1118,7 +846,7 @@
               <w:rtl/>
             </w:rPr>
             <w:tab/>
-            <w:t>14</w:t>
+            <w:t>13</w:t>
           </w:r>
         </w:p>
         <w:p>
@@ -1148,7 +876,7 @@
               <w:rtl/>
             </w:rPr>
             <w:tab/>
-            <w:t>14</w:t>
+            <w:t>13</w:t>
           </w:r>
         </w:p>
         <w:p>
@@ -1178,7 +906,7 @@
               <w:rtl/>
             </w:rPr>
             <w:tab/>
-            <w:t>14</w:t>
+            <w:t>13</w:t>
           </w:r>
         </w:p>
         <w:p>
@@ -1208,7 +936,7 @@
               <w:rtl/>
             </w:rPr>
             <w:tab/>
-            <w:t>15</w:t>
+            <w:t>14</w:t>
           </w:r>
         </w:p>
         <w:p>
@@ -1238,7 +966,7 @@
               <w:rtl/>
             </w:rPr>
             <w:tab/>
-            <w:t>15</w:t>
+            <w:t>14</w:t>
           </w:r>
         </w:p>
         <w:p>
@@ -1268,7 +996,7 @@
               <w:rtl/>
             </w:rPr>
             <w:tab/>
-            <w:t>15</w:t>
+            <w:t>14</w:t>
           </w:r>
         </w:p>
         <w:p>
@@ -1298,7 +1026,7 @@
               <w:rtl/>
             </w:rPr>
             <w:tab/>
-            <w:t>16</w:t>
+            <w:t>15</w:t>
           </w:r>
         </w:p>
         <w:p>
@@ -1328,7 +1056,7 @@
               <w:rtl/>
             </w:rPr>
             <w:tab/>
-            <w:t>17</w:t>
+            <w:t>16</w:t>
           </w:r>
         </w:p>
         <w:p>
@@ -1358,7 +1086,7 @@
               <w:rtl/>
             </w:rPr>
             <w:tab/>
-            <w:t>17</w:t>
+            <w:t>16</w:t>
           </w:r>
         </w:p>
         <w:p>
@@ -1388,7 +1116,7 @@
               <w:rtl/>
             </w:rPr>
             <w:tab/>
-            <w:t>17</w:t>
+            <w:t>16</w:t>
           </w:r>
         </w:p>
         <w:p>
@@ -1418,7 +1146,7 @@
               <w:rtl/>
             </w:rPr>
             <w:tab/>
-            <w:t>18</w:t>
+            <w:t>17</w:t>
           </w:r>
         </w:p>
         <w:p>
@@ -1448,7 +1176,7 @@
               <w:rtl/>
             </w:rPr>
             <w:tab/>
-            <w:t>19</w:t>
+            <w:t>18</w:t>
           </w:r>
         </w:p>
         <w:p>
@@ -1478,7 +1206,7 @@
               <w:rtl/>
             </w:rPr>
             <w:tab/>
-            <w:t>20</w:t>
+            <w:t>19</w:t>
           </w:r>
         </w:p>
         <w:p>
@@ -1508,7 +1236,7 @@
               <w:rtl/>
             </w:rPr>
             <w:tab/>
-            <w:t>21</w:t>
+            <w:t>20</w:t>
           </w:r>
         </w:p>
         <w:p>
@@ -1538,7 +1266,7 @@
               <w:rtl/>
             </w:rPr>
             <w:tab/>
-            <w:t>21</w:t>
+            <w:t>20</w:t>
           </w:r>
         </w:p>
         <w:p>
@@ -1568,7 +1296,7 @@
               <w:rtl/>
             </w:rPr>
             <w:tab/>
-            <w:t>22</w:t>
+            <w:t>21</w:t>
           </w:r>
         </w:p>
         <w:p>
@@ -1598,7 +1326,7 @@
               <w:rtl/>
             </w:rPr>
             <w:tab/>
-            <w:t>23</w:t>
+            <w:t>22</w:t>
           </w:r>
         </w:p>
         <w:p>
@@ -5819,7 +5547,7 @@
           <w:szCs w:val="24"/>
           <w:rtl/>
         </w:rPr>
-        <w:t xml:space="preserve">מה שאהבנו במאמר הוא נקודת המבט. רוב מה שקראנו על חוסר ודאות תעסוקתי עסק בנזק, והמאמר הזה שואל מה עוזר. הרעיון של אנטונובסקי, שפעל כאן בישראל, שאפשר לחקור את מקורות הבריאות במקום את מקורות המחלה, נשמע לנו רלוונטי במיוחד לשנתיים האחרונות. אהבנו גם את הפרקטיות: שישה צרכים, שאלות פשוטות, ופעולות שכל אחד יכול לעשות בשבועיים הקרובים. והערכנו את הכנות של המחברים, שמקדישים כמעט עמוד שלם למגבלות, כולל הודאה שהמקדם השלילי של מובנות קשה להם להסביר (</w:t>
+        <w:t xml:space="preserve">מה שאהבתי במאמר הוא נקודת המבט. רוב מה שקראתי על חוסר ודאות תעסוקתי עסק בנזק, והמאמר הזה שואל מה עוזר. הרעיון של אנטונובסקי, שפעל כאן בישראל, שאפשר לחקור את מקורות הבריאות במקום את מקורות המחלה, נשמע לי רלוונטי במיוחד לשנתיים האחרונות. אהבתי גם את הפרקטיות: שישה צרכים, שאלות פשוטות, ופעולות שכל אחד יכול לעשות בשבועיים הקרובים. והערכתי את הכנות של המחברים, שמקדישים כמעט עמוד שלם למגבלות, כולל הודאה שהמקדם השלילי של מובנות קשה להם להסביר (</w:t>
       </w:r>
       <w:r>
         <w:rPr>
@@ -5852,7 +5580,7 @@
           <w:szCs w:val="24"/>
           <w:rtl/>
         </w:rPr>
-        <w:t xml:space="preserve">חסרו לנו שלושה דברים. ראשית, המאמר לא מודד חוסר ביטחון תעסוקתי במישרין. הוא נערך בתקופת הקורונה ומזכיר את אי-הוודאות רק כמגבלה, ולכן את הקשר לנושא שלנו בנינו בעצמנו, דרך המאמר המשלים והספרות על חוסר ביטחון. שנית, המדגם גרמני ושווייצרי, מבוגר יחסית, בגיל ממוצע של כמעט 49, ומגיע מתרבות עבודה עם ביטחון סוציאלי גבוה. אנחנו, סטודנטים ישראלים בתחילת הדרך, בסביבת עבודה פחות יציבה, לא בטוחים שהמרחב לעיצוב תפקיד שהיה למשתתפים קיים גם אצלנו. שלישית, המאמר מדבר על עובדים שכירים בתפקיד קיים, ולא על מי שעדיין מחפש עבודה או עובד כעצמאי (</w:t>
+        <w:t xml:space="preserve">חסרו לי שלושה דברים. ראשית, המאמר לא מודד חוסר ביטחון תעסוקתי במישרין. הוא נערך בתקופת הקורונה ומזכיר את אי-הוודאות רק כמגבלה, ולכן את הקשר לנושא העבודה בניתי בעצמי, דרך המאמר המשלים והספרות על חוסר ביטחון. שנית, המדגם גרמני ושווייצרי, מבוגר יחסית, בגיל ממוצע של כמעט 49, ומגיע מתרבות עבודה עם ביטחון סוציאלי גבוה. מנקודת המבט של סטודנטים ישראלים בתחילת הדרך, בסביבת עבודה פחות יציבה, לא ברור שהמרחב לעיצוב תפקיד שהיה למשתתפים קיים גם כאן. שלישית, המאמר מדבר על עובדים שכירים בתפקיד קיים, ולא על מי שעדיין מחפש עבודה או עובד כעצמאי (</w:t>
       </w:r>
       <w:r>
         <w:rPr>
@@ -5885,7 +5613,7 @@
           <w:szCs w:val="24"/>
           <w:rtl/>
         </w:rPr>
-        <w:t xml:space="preserve">עמדתנו היא שהמסר של המאמר משלים את "ממשבר להזדמנות" שלמדנו בקורס. משבר הופך להזדמנות לא מעצמו, אלא כשמישהו מעצב אותו כך. עם זאת, המאמר עצמו מראה שהיוזמה תלויה בתחושת ניהוליות, ומי שמרגיש מאוים ובלי משאבים יתקשה להתחיל (</w:t>
+        <w:t xml:space="preserve">עמדתי היא שהמסר של המאמר משלים את "ממשבר להזדמנות" שנלמד בקורס. משבר הופך להזדמנות לא מעצמו, אלא כשמישהו מעצב אותו כך. עם זאת, המאמר עצמו מראה שהיוזמה תלויה בתחושת ניהוליות, ומי שמרגיש מאוים ובלי משאבים יתקשה להתחיל (</w:t>
       </w:r>
       <w:r>
         <w:rPr>
@@ -5902,7 +5630,7 @@
           <w:szCs w:val="24"/>
           <w:rtl/>
         </w:rPr>
-        <w:t xml:space="preserve">). לכן אנחנו חושבים שהמסר לכיתה צריך להיות כפול: לעצב את התפקיד עכשיו, כשעוד יש משאבים, ולא לחכות; ולזכור שמי שמרגיש שאין לו משאבים צריך קודם תמיכה ולא עצות.</w:t>
+        <w:t xml:space="preserve">). לכן לדעתי המסר לכיתה צריך להיות כפול: לעצב את התפקיד עכשיו, כשעוד יש משאבים, ולא לחכות; ולזכור שמי שמרגיש שאין לו משאבים צריך קודם תמיכה ולא עצות.</w:t>
       </w:r>
     </w:p>
     <w:p>

</xml_diff>